<commit_message>
Some updates to Cleaning notebook, and also report
</commit_message>
<xml_diff>
--- a/assessment/writ1/dat5001-tomrowan-st20285213-writ1.docx
+++ b/assessment/writ1/dat5001-tomrowan-st20285213-writ1.docx
@@ -974,6 +974,18 @@
           <w:lang w:val="en-GB" w:eastAsia="en-US" w:bidi="ar-SA"/>
         </w:rPr>
         <w:t xml:space="preserve"> </w:t>
+      </w:r>
+      <w:r>
+        <w:rPr>
+          <w:rStyle w:val="Strong"/>
+          <w:rFonts w:eastAsia="Arial" w:cs="Arial" w:ascii="Nimbus Sans" w:hAnsi="Nimbus Sans"/>
+          <w:b w:val="false"/>
+          <w:bCs w:val="false"/>
+          <w:kern w:val="0"/>
+          <w:szCs w:val="24"/>
+          <w:lang w:val="en-GB" w:eastAsia="en-US" w:bidi="ar-SA"/>
+        </w:rPr>
+        <w:t xml:space="preserve">and the results section of this report, </w:t>
       </w:r>
       <w:r>
         <w:rPr>
@@ -2296,7 +2308,7 @@
           <w:szCs w:val="24"/>
           <w:lang w:val="en-GB" w:eastAsia="en-US" w:bidi="ar-SA"/>
         </w:rPr>
-        <w:t xml:space="preserve">This is the database that I am using for my project: </w:t>
+        <w:t xml:space="preserve">This is the database that I am using as the basis for my project: </w:t>
       </w:r>
       <w:hyperlink r:id="rId17">
         <w:r>
@@ -2310,17 +2322,104 @@
           <w:t>https://planet4589.org/space/gcat/index.html</w:t>
         </w:r>
       </w:hyperlink>
-      <w:hyperlink r:id="rId18">
-        <w:r>
-          <w:rPr>
-            <w:rFonts w:eastAsia="Arial" w:cs="Arial" w:ascii="Nimbus Sans" w:hAnsi="Nimbus Sans"/>
-            <w:kern w:val="0"/>
-            <w:szCs w:val="24"/>
-            <w:lang w:val="en-GB" w:eastAsia="en-US" w:bidi="ar-SA"/>
-          </w:rPr>
-          <w:t xml:space="preserve"> </w:t>
-        </w:r>
-      </w:hyperlink>
+      <w:r>
+        <w:rPr>
+          <w:rFonts w:eastAsia="Arial" w:cs="Arial" w:ascii="Nimbus Sans" w:hAnsi="Nimbus Sans"/>
+          <w:kern w:val="0"/>
+          <w:szCs w:val="24"/>
+          <w:lang w:val="en-GB" w:eastAsia="en-US" w:bidi="ar-SA"/>
+        </w:rPr>
+        <w:t xml:space="preserve"> </w:t>
+      </w:r>
+    </w:p>
+    <w:p>
+      <w:pPr>
+        <w:pStyle w:val="Normal"/>
+        <w:widowControl/>
+        <w:bidi w:val="0"/>
+        <w:spacing w:before="0" w:after="0"/>
+        <w:jc w:val="start"/>
+        <w:rPr>
+          <w:rFonts w:ascii="Arial" w:hAnsi="Arial" w:cs="Arial"/>
+          <w:szCs w:val="24"/>
+        </w:rPr>
+      </w:pPr>
+      <w:r>
+        <w:rPr>
+          <w:rFonts w:eastAsia="Arial" w:ascii="Nimbus Sans" w:hAnsi="Nimbus Sans"/>
+          <w:kern w:val="0"/>
+          <w:lang w:val="en-GB" w:eastAsia="en-US" w:bidi="ar-SA"/>
+        </w:rPr>
+      </w:r>
+    </w:p>
+    <w:p>
+      <w:pPr>
+        <w:pStyle w:val="Normal"/>
+        <w:widowControl/>
+        <w:bidi w:val="0"/>
+        <w:spacing w:before="0" w:after="0"/>
+        <w:jc w:val="start"/>
+        <w:rPr>
+          <w:rFonts w:ascii="Arial" w:hAnsi="Arial" w:cs="Arial"/>
+          <w:szCs w:val="24"/>
+        </w:rPr>
+      </w:pPr>
+      <w:r>
+        <w:rPr>
+          <w:rFonts w:eastAsia="Arial" w:ascii="Nimbus Sans" w:hAnsi="Nimbus Sans"/>
+          <w:kern w:val="0"/>
+          <w:lang w:val="en-GB" w:eastAsia="en-US" w:bidi="ar-SA"/>
+        </w:rPr>
+        <w:t>“</w:t>
+      </w:r>
+      <w:r>
+        <w:rPr>
+          <w:rFonts w:eastAsia="Arial" w:ascii="Nimbus Sans" w:hAnsi="Nimbus Sans"/>
+          <w:kern w:val="0"/>
+          <w:lang w:val="en-GB" w:eastAsia="en-US" w:bidi="ar-SA"/>
+        </w:rPr>
+        <w:t>GCAT is released under the Creative Commons CC-BY licence.”</w:t>
+      </w:r>
+    </w:p>
+    <w:p>
+      <w:pPr>
+        <w:pStyle w:val="Normal"/>
+        <w:widowControl/>
+        <w:bidi w:val="0"/>
+        <w:spacing w:before="0" w:after="0"/>
+        <w:jc w:val="start"/>
+        <w:rPr>
+          <w:rFonts w:ascii="Arial" w:hAnsi="Arial" w:cs="Arial"/>
+          <w:szCs w:val="24"/>
+        </w:rPr>
+      </w:pPr>
+      <w:r>
+        <w:rPr>
+          <w:rFonts w:eastAsia="Arial" w:ascii="Nimbus Sans" w:hAnsi="Nimbus Sans"/>
+          <w:kern w:val="0"/>
+          <w:lang w:val="en-GB" w:eastAsia="en-US" w:bidi="ar-SA"/>
+        </w:rPr>
+      </w:r>
+    </w:p>
+    <w:p>
+      <w:pPr>
+        <w:pStyle w:val="Normal"/>
+        <w:widowControl/>
+        <w:bidi w:val="0"/>
+        <w:spacing w:before="0" w:after="0"/>
+        <w:jc w:val="start"/>
+        <w:rPr>
+          <w:rFonts w:ascii="Arial" w:hAnsi="Arial" w:cs="Arial"/>
+          <w:szCs w:val="24"/>
+        </w:rPr>
+      </w:pPr>
+      <w:r>
+        <w:rPr>
+          <w:rFonts w:eastAsia="Arial" w:ascii="Nimbus Sans" w:hAnsi="Nimbus Sans"/>
+          <w:kern w:val="0"/>
+          <w:lang w:val="en-GB" w:eastAsia="en-US" w:bidi="ar-SA"/>
+        </w:rPr>
+      </w:r>
     </w:p>
     <w:p>
       <w:pPr>
@@ -2629,6 +2728,3743 @@
       <w:r>
         <w:rPr>
           <w:rFonts w:eastAsia="Arial" w:ascii="Nimbus Sans" w:hAnsi="Nimbus Sans"/>
+          <w:kern w:val="0"/>
+          <w:lang w:val="en-GB" w:eastAsia="en-US" w:bidi="ar-SA"/>
+        </w:rPr>
+      </w:r>
+    </w:p>
+    <w:p>
+      <w:pPr>
+        <w:pStyle w:val="Normal"/>
+        <w:widowControl/>
+        <w:bidi w:val="0"/>
+        <w:spacing w:before="0" w:after="0"/>
+        <w:jc w:val="start"/>
+        <w:rPr>
+          <w:rFonts w:ascii="Arial" w:hAnsi="Arial" w:cs="Arial"/>
+          <w:szCs w:val="24"/>
+        </w:rPr>
+      </w:pPr>
+      <w:r>
+        <w:rPr>
+          <w:rFonts w:eastAsia="Arial" w:ascii="Nimbus Sans" w:hAnsi="Nimbus Sans"/>
+          <w:kern w:val="0"/>
+          <w:lang w:val="en-GB" w:eastAsia="en-US" w:bidi="ar-SA"/>
+        </w:rPr>
+      </w:r>
+    </w:p>
+    <w:p>
+      <w:pPr>
+        <w:pStyle w:val="Normal"/>
+        <w:widowControl/>
+        <w:bidi w:val="0"/>
+        <w:spacing w:before="0" w:after="0"/>
+        <w:jc w:val="start"/>
+        <w:rPr>
+          <w:rFonts w:ascii="Arial" w:hAnsi="Arial" w:cs="Arial"/>
+          <w:szCs w:val="24"/>
+        </w:rPr>
+      </w:pPr>
+      <w:r>
+        <w:rPr>
+          <w:rFonts w:eastAsia="Arial" w:ascii="Nimbus Sans" w:hAnsi="Nimbus Sans"/>
+          <w:kern w:val="0"/>
+          <w:lang w:val="en-GB" w:eastAsia="en-US" w:bidi="ar-SA"/>
+        </w:rPr>
+      </w:r>
+      <w:r>
+        <w:br w:type="page"/>
+      </w:r>
+    </w:p>
+    <w:p>
+      <w:pPr>
+        <w:pStyle w:val="Normal"/>
+        <w:widowControl/>
+        <w:bidi w:val="0"/>
+        <w:spacing w:before="0" w:after="0"/>
+        <w:jc w:val="start"/>
+        <w:rPr>
+          <w:rFonts w:ascii="Arial" w:hAnsi="Arial" w:cs="Arial"/>
+          <w:szCs w:val="24"/>
+        </w:rPr>
+      </w:pPr>
+      <w:r>
+        <w:rPr>
+          <w:rFonts w:eastAsia="Arial" w:cs="Arial" w:ascii="Arial" w:hAnsi="Arial"/>
+          <w:b/>
+          <w:bCs/>
+          <w:kern w:val="0"/>
+          <w:szCs w:val="24"/>
+          <w:lang w:val="en-GB" w:eastAsia="en-US" w:bidi="ar-SA"/>
+        </w:rPr>
+        <w:t xml:space="preserve">cleaning and transformation procedures along with description about the data context/metadata. </w:t>
+      </w:r>
+    </w:p>
+    <w:p>
+      <w:pPr>
+        <w:pStyle w:val="Normal"/>
+        <w:widowControl/>
+        <w:bidi w:val="0"/>
+        <w:spacing w:before="0" w:after="0"/>
+        <w:jc w:val="start"/>
+        <w:rPr>
+          <w:rFonts w:ascii="Arial" w:hAnsi="Arial" w:cs="Arial"/>
+          <w:szCs w:val="24"/>
+        </w:rPr>
+      </w:pPr>
+      <w:r>
+        <w:rPr>
+          <w:rFonts w:eastAsia="Arial" w:ascii="Arial" w:hAnsi="Arial"/>
+          <w:b/>
+          <w:bCs/>
+          <w:kern w:val="0"/>
+          <w:lang w:val="en-GB" w:eastAsia="en-US" w:bidi="ar-SA"/>
+        </w:rPr>
+      </w:r>
+    </w:p>
+    <w:p>
+      <w:pPr>
+        <w:pStyle w:val="Normal"/>
+        <w:widowControl/>
+        <w:bidi w:val="0"/>
+        <w:spacing w:before="0" w:after="0"/>
+        <w:jc w:val="start"/>
+        <w:rPr>
+          <w:rFonts w:ascii="Arial" w:hAnsi="Arial" w:cs="Arial"/>
+          <w:szCs w:val="24"/>
+        </w:rPr>
+      </w:pPr>
+      <w:r>
+        <w:rPr>
+          <w:rFonts w:eastAsia="Arial" w:cs="Arial" w:ascii="Arial" w:hAnsi="Arial"/>
+          <w:kern w:val="0"/>
+          <w:szCs w:val="24"/>
+          <w:lang w:val="en-GB" w:eastAsia="en-US" w:bidi="ar-SA"/>
+        </w:rPr>
+        <w:t>The GCAT database is split into a number of databases. I chose to download the following files.</w:t>
+      </w:r>
+    </w:p>
+    <w:p>
+      <w:pPr>
+        <w:pStyle w:val="Normal"/>
+        <w:widowControl/>
+        <w:bidi w:val="0"/>
+        <w:spacing w:before="0" w:after="0"/>
+        <w:jc w:val="start"/>
+        <w:rPr>
+          <w:rFonts w:ascii="Arial" w:hAnsi="Arial" w:cs="Arial"/>
+          <w:szCs w:val="24"/>
+        </w:rPr>
+      </w:pPr>
+      <w:r>
+        <w:rPr>
+          <w:rFonts w:eastAsia="Arial" w:ascii="Arial" w:hAnsi="Arial"/>
+          <w:kern w:val="0"/>
+          <w:lang w:val="en-GB" w:eastAsia="en-US" w:bidi="ar-SA"/>
+        </w:rPr>
+      </w:r>
+    </w:p>
+    <w:p>
+      <w:pPr>
+        <w:pStyle w:val="Normal"/>
+        <w:widowControl/>
+        <w:numPr>
+          <w:ilvl w:val="0"/>
+          <w:numId w:val="2"/>
+        </w:numPr>
+        <w:bidi w:val="0"/>
+        <w:spacing w:before="0" w:after="0"/>
+        <w:jc w:val="start"/>
+        <w:rPr>
+          <w:rFonts w:ascii="Arial" w:hAnsi="Arial" w:cs="Arial"/>
+          <w:szCs w:val="24"/>
+        </w:rPr>
+      </w:pPr>
+      <w:r>
+        <w:rPr>
+          <w:rFonts w:eastAsia="Arial" w:cs="Arial" w:ascii="Arial" w:hAnsi="Arial"/>
+          <w:kern w:val="0"/>
+          <w:szCs w:val="24"/>
+          <w:lang w:val="en-GB" w:eastAsia="en-US" w:bidi="ar-SA"/>
+        </w:rPr>
+        <w:t>The main SatCat database – detail on the initial state of objects.</w:t>
+      </w:r>
+    </w:p>
+    <w:p>
+      <w:pPr>
+        <w:pStyle w:val="Normal"/>
+        <w:widowControl/>
+        <w:numPr>
+          <w:ilvl w:val="0"/>
+          <w:numId w:val="2"/>
+        </w:numPr>
+        <w:bidi w:val="0"/>
+        <w:spacing w:before="0" w:after="0"/>
+        <w:jc w:val="start"/>
+        <w:rPr>
+          <w:rFonts w:ascii="Arial" w:hAnsi="Arial" w:cs="Arial"/>
+          <w:szCs w:val="24"/>
+        </w:rPr>
+      </w:pPr>
+      <w:r>
+        <w:rPr>
+          <w:rFonts w:eastAsia="Arial" w:cs="Arial" w:ascii="Arial" w:hAnsi="Arial"/>
+          <w:kern w:val="0"/>
+          <w:szCs w:val="24"/>
+          <w:lang w:val="en-GB" w:eastAsia="en-US" w:bidi="ar-SA"/>
+        </w:rPr>
+        <w:t>The events database – subsequent changes to object status.</w:t>
+      </w:r>
+    </w:p>
+    <w:p>
+      <w:pPr>
+        <w:pStyle w:val="Normal"/>
+        <w:widowControl/>
+        <w:numPr>
+          <w:ilvl w:val="0"/>
+          <w:numId w:val="2"/>
+        </w:numPr>
+        <w:bidi w:val="0"/>
+        <w:spacing w:before="0" w:after="0"/>
+        <w:jc w:val="start"/>
+        <w:rPr>
+          <w:rFonts w:ascii="Arial" w:hAnsi="Arial" w:cs="Arial"/>
+          <w:szCs w:val="24"/>
+        </w:rPr>
+      </w:pPr>
+      <w:r>
+        <w:rPr>
+          <w:rFonts w:eastAsia="Arial" w:cs="Arial" w:ascii="Arial" w:hAnsi="Arial"/>
+          <w:kern w:val="0"/>
+          <w:szCs w:val="24"/>
+          <w:lang w:val="en-GB" w:eastAsia="en-US" w:bidi="ar-SA"/>
+        </w:rPr>
+        <w:t>The payloads database – additional information on satellite payloads.</w:t>
+      </w:r>
+    </w:p>
+    <w:p>
+      <w:pPr>
+        <w:pStyle w:val="Normal"/>
+        <w:widowControl/>
+        <w:numPr>
+          <w:ilvl w:val="0"/>
+          <w:numId w:val="2"/>
+        </w:numPr>
+        <w:bidi w:val="0"/>
+        <w:spacing w:before="0" w:after="0"/>
+        <w:jc w:val="start"/>
+        <w:rPr>
+          <w:rFonts w:ascii="Arial" w:hAnsi="Arial" w:cs="Arial"/>
+          <w:szCs w:val="24"/>
+        </w:rPr>
+      </w:pPr>
+      <w:r>
+        <w:rPr>
+          <w:rFonts w:eastAsia="Arial" w:cs="Arial" w:ascii="Arial" w:hAnsi="Arial"/>
+          <w:kern w:val="0"/>
+          <w:szCs w:val="24"/>
+          <w:lang w:val="en-GB" w:eastAsia="en-US" w:bidi="ar-SA"/>
+        </w:rPr>
+        <w:t xml:space="preserve">The </w:t>
+      </w:r>
+      <w:r>
+        <w:rPr>
+          <w:rFonts w:eastAsia="Arial" w:cs="Arial" w:ascii="Arial" w:hAnsi="Arial"/>
+          <w:kern w:val="0"/>
+          <w:szCs w:val="24"/>
+          <w:lang w:val="en-GB" w:eastAsia="en-US" w:bidi="ar-SA"/>
+        </w:rPr>
+        <w:t>launch site database – details on launch sites.</w:t>
+      </w:r>
+    </w:p>
+    <w:p>
+      <w:pPr>
+        <w:pStyle w:val="Normal"/>
+        <w:widowControl/>
+        <w:numPr>
+          <w:ilvl w:val="0"/>
+          <w:numId w:val="2"/>
+        </w:numPr>
+        <w:bidi w:val="0"/>
+        <w:spacing w:before="0" w:after="0"/>
+        <w:jc w:val="start"/>
+        <w:rPr>
+          <w:rFonts w:ascii="Arial" w:hAnsi="Arial" w:cs="Arial"/>
+          <w:szCs w:val="24"/>
+        </w:rPr>
+      </w:pPr>
+      <w:r>
+        <w:rPr>
+          <w:rFonts w:eastAsia="Arial" w:cs="Arial" w:ascii="Arial" w:hAnsi="Arial"/>
+          <w:kern w:val="0"/>
+          <w:szCs w:val="24"/>
+          <w:lang w:val="en-GB" w:eastAsia="en-US" w:bidi="ar-SA"/>
+        </w:rPr>
+        <w:t>T</w:t>
+      </w:r>
+      <w:r>
+        <w:rPr>
+          <w:rFonts w:eastAsia="Arial" w:cs="Arial" w:ascii="Arial" w:hAnsi="Arial"/>
+          <w:kern w:val="0"/>
+          <w:szCs w:val="24"/>
+          <w:lang w:val="en-GB" w:eastAsia="en-US" w:bidi="ar-SA"/>
+        </w:rPr>
+        <w:t>he organisation database – data on all related organisations, such as manufacturers and users of satellites.</w:t>
+      </w:r>
+    </w:p>
+    <w:p>
+      <w:pPr>
+        <w:pStyle w:val="Normal"/>
+        <w:widowControl/>
+        <w:bidi w:val="0"/>
+        <w:spacing w:before="0" w:after="0"/>
+        <w:jc w:val="start"/>
+        <w:rPr>
+          <w:rFonts w:ascii="Arial" w:hAnsi="Arial" w:cs="Arial"/>
+          <w:szCs w:val="24"/>
+        </w:rPr>
+      </w:pPr>
+      <w:r>
+        <w:rPr>
+          <w:rFonts w:eastAsia="Arial" w:ascii="Arial" w:hAnsi="Arial"/>
+          <w:kern w:val="0"/>
+          <w:lang w:val="en-GB" w:eastAsia="en-US" w:bidi="ar-SA"/>
+        </w:rPr>
+      </w:r>
+    </w:p>
+    <w:p>
+      <w:pPr>
+        <w:pStyle w:val="Normal"/>
+        <w:widowControl/>
+        <w:bidi w:val="0"/>
+        <w:spacing w:before="0" w:after="0"/>
+        <w:jc w:val="start"/>
+        <w:rPr>
+          <w:rFonts w:ascii="Arial" w:hAnsi="Arial" w:cs="Arial"/>
+          <w:szCs w:val="24"/>
+        </w:rPr>
+      </w:pPr>
+      <w:r>
+        <w:rPr>
+          <w:rFonts w:eastAsia="Arial" w:cs="Arial" w:ascii="Arial" w:hAnsi="Arial"/>
+          <w:kern w:val="0"/>
+          <w:szCs w:val="24"/>
+          <w:lang w:val="en-GB" w:eastAsia="en-US" w:bidi="ar-SA"/>
+        </w:rPr>
+        <w:t xml:space="preserve">Initially, these databases were downloaded from the website as tab separated value files and loaded in to pandas data frames. This allows for simple and effective manipulation using python. </w:t>
+      </w:r>
+    </w:p>
+    <w:p>
+      <w:pPr>
+        <w:pStyle w:val="Normal"/>
+        <w:widowControl/>
+        <w:bidi w:val="0"/>
+        <w:spacing w:before="0" w:after="0"/>
+        <w:jc w:val="start"/>
+        <w:rPr>
+          <w:rFonts w:ascii="Arial" w:hAnsi="Arial" w:cs="Arial"/>
+          <w:szCs w:val="24"/>
+        </w:rPr>
+      </w:pPr>
+      <w:r>
+        <w:rPr>
+          <w:rFonts w:eastAsia="Arial" w:ascii="Arial" w:hAnsi="Arial"/>
+          <w:kern w:val="0"/>
+          <w:lang w:val="en-GB" w:eastAsia="en-US" w:bidi="ar-SA"/>
+        </w:rPr>
+      </w:r>
+    </w:p>
+    <w:p>
+      <w:pPr>
+        <w:pStyle w:val="Normal"/>
+        <w:widowControl/>
+        <w:bidi w:val="0"/>
+        <w:spacing w:before="0" w:after="0"/>
+        <w:jc w:val="start"/>
+        <w:rPr>
+          <w:rFonts w:ascii="Arial" w:hAnsi="Arial" w:cs="Arial"/>
+          <w:szCs w:val="24"/>
+        </w:rPr>
+      </w:pPr>
+      <w:r>
+        <w:rPr>
+          <w:rFonts w:eastAsia="Arial" w:cs="Arial" w:ascii="Arial" w:hAnsi="Arial"/>
+          <w:kern w:val="0"/>
+          <w:szCs w:val="24"/>
+          <w:lang w:val="en-GB" w:eastAsia="en-US" w:bidi="ar-SA"/>
+        </w:rPr>
+        <w:t>I carried out some exploration of the data. These figures are from 26</w:t>
+      </w:r>
+      <w:r>
+        <w:rPr>
+          <w:rFonts w:eastAsia="Arial" w:cs="Arial" w:ascii="Arial" w:hAnsi="Arial"/>
+          <w:kern w:val="0"/>
+          <w:szCs w:val="24"/>
+          <w:vertAlign w:val="superscript"/>
+          <w:lang w:val="en-GB" w:eastAsia="en-US" w:bidi="ar-SA"/>
+        </w:rPr>
+        <w:t>th</w:t>
+      </w:r>
+      <w:r>
+        <w:rPr>
+          <w:rFonts w:eastAsia="Arial" w:cs="Arial" w:ascii="Arial" w:hAnsi="Arial"/>
+          <w:kern w:val="0"/>
+          <w:szCs w:val="24"/>
+          <w:lang w:val="en-GB" w:eastAsia="en-US" w:bidi="ar-SA"/>
+        </w:rPr>
+        <w:t xml:space="preserve"> November 2025, although the databases grow daily, in particular the SatCat database.</w:t>
+      </w:r>
+    </w:p>
+    <w:p>
+      <w:pPr>
+        <w:pStyle w:val="Normal"/>
+        <w:widowControl/>
+        <w:bidi w:val="0"/>
+        <w:spacing w:before="0" w:after="0"/>
+        <w:jc w:val="start"/>
+        <w:rPr>
+          <w:rFonts w:ascii="Arial" w:hAnsi="Arial" w:cs="Arial"/>
+          <w:szCs w:val="24"/>
+        </w:rPr>
+      </w:pPr>
+      <w:r>
+        <w:rPr>
+          <w:rFonts w:eastAsia="Arial" w:ascii="Arial" w:hAnsi="Arial"/>
+          <w:kern w:val="0"/>
+          <w:lang w:val="en-GB" w:eastAsia="en-US" w:bidi="ar-SA"/>
+        </w:rPr>
+      </w:r>
+    </w:p>
+    <w:tbl>
+      <w:tblPr>
+        <w:tblW w:w="5576" w:type="dxa"/>
+        <w:jc w:val="start"/>
+        <w:tblInd w:w="-5" w:type="dxa"/>
+        <w:tblLayout w:type="fixed"/>
+        <w:tblCellMar>
+          <w:top w:w="55" w:type="dxa"/>
+          <w:start w:w="55" w:type="dxa"/>
+          <w:bottom w:w="55" w:type="dxa"/>
+          <w:end w:w="55" w:type="dxa"/>
+        </w:tblCellMar>
+      </w:tblPr>
+      <w:tblGrid>
+        <w:gridCol w:w="1984"/>
+        <w:gridCol w:w="1796"/>
+        <w:gridCol w:w="1796"/>
+      </w:tblGrid>
+      <w:tr>
+        <w:trPr/>
+        <w:tc>
+          <w:tcPr>
+            <w:tcW w:w="1984" w:type="dxa"/>
+            <w:tcBorders>
+              <w:top w:val="single" w:sz="4" w:space="0" w:color="000000"/>
+              <w:start w:val="single" w:sz="4" w:space="0" w:color="000000"/>
+              <w:bottom w:val="single" w:sz="4" w:space="0" w:color="000000"/>
+            </w:tcBorders>
+          </w:tcPr>
+          <w:p>
+            <w:pPr>
+              <w:pStyle w:val="TableContents"/>
+              <w:bidi w:val="0"/>
+              <w:jc w:val="start"/>
+              <w:rPr>
+                <w:rFonts w:ascii="Arial" w:hAnsi="Arial" w:eastAsia="Arial"/>
+              </w:rPr>
+            </w:pPr>
+            <w:r>
+              <w:rPr>
+                <w:rFonts w:eastAsia="Arial" w:ascii="Arial" w:hAnsi="Arial"/>
+              </w:rPr>
+              <w:t>Database</w:t>
+            </w:r>
+          </w:p>
+        </w:tc>
+        <w:tc>
+          <w:tcPr>
+            <w:tcW w:w="1796" w:type="dxa"/>
+            <w:tcBorders>
+              <w:top w:val="single" w:sz="4" w:space="0" w:color="000000"/>
+              <w:start w:val="single" w:sz="4" w:space="0" w:color="000000"/>
+              <w:bottom w:val="single" w:sz="4" w:space="0" w:color="000000"/>
+            </w:tcBorders>
+          </w:tcPr>
+          <w:p>
+            <w:pPr>
+              <w:pStyle w:val="TableContents"/>
+              <w:bidi w:val="0"/>
+              <w:jc w:val="center"/>
+              <w:rPr>
+                <w:rFonts w:ascii="Arial" w:hAnsi="Arial" w:eastAsia="Arial"/>
+              </w:rPr>
+            </w:pPr>
+            <w:r>
+              <w:rPr>
+                <w:rFonts w:eastAsia="Arial" w:ascii="Arial" w:hAnsi="Arial"/>
+              </w:rPr>
+              <w:t>Columns</w:t>
+            </w:r>
+          </w:p>
+        </w:tc>
+        <w:tc>
+          <w:tcPr>
+            <w:tcW w:w="1796" w:type="dxa"/>
+            <w:tcBorders>
+              <w:top w:val="single" w:sz="4" w:space="0" w:color="000000"/>
+              <w:start w:val="single" w:sz="4" w:space="0" w:color="000000"/>
+              <w:bottom w:val="single" w:sz="4" w:space="0" w:color="000000"/>
+              <w:end w:val="single" w:sz="4" w:space="0" w:color="000000"/>
+            </w:tcBorders>
+          </w:tcPr>
+          <w:p>
+            <w:pPr>
+              <w:pStyle w:val="TableContents"/>
+              <w:bidi w:val="0"/>
+              <w:jc w:val="center"/>
+              <w:rPr>
+                <w:rFonts w:ascii="Arial" w:hAnsi="Arial" w:eastAsia="Arial"/>
+              </w:rPr>
+            </w:pPr>
+            <w:r>
+              <w:rPr>
+                <w:rFonts w:eastAsia="Arial" w:ascii="Arial" w:hAnsi="Arial"/>
+              </w:rPr>
+              <w:t>Rows</w:t>
+            </w:r>
+          </w:p>
+        </w:tc>
+      </w:tr>
+      <w:tr>
+        <w:trPr/>
+        <w:tc>
+          <w:tcPr>
+            <w:tcW w:w="1984" w:type="dxa"/>
+            <w:tcBorders>
+              <w:start w:val="single" w:sz="4" w:space="0" w:color="000000"/>
+              <w:bottom w:val="single" w:sz="4" w:space="0" w:color="000000"/>
+            </w:tcBorders>
+          </w:tcPr>
+          <w:p>
+            <w:pPr>
+              <w:pStyle w:val="TableContents"/>
+              <w:bidi w:val="0"/>
+              <w:jc w:val="start"/>
+              <w:rPr>
+                <w:rFonts w:ascii="Arial" w:hAnsi="Arial" w:eastAsia="Arial"/>
+              </w:rPr>
+            </w:pPr>
+            <w:r>
+              <w:rPr>
+                <w:rFonts w:eastAsia="Arial" w:ascii="Arial" w:hAnsi="Arial"/>
+              </w:rPr>
+              <w:t>Satcat</w:t>
+            </w:r>
+          </w:p>
+        </w:tc>
+        <w:tc>
+          <w:tcPr>
+            <w:tcW w:w="1796" w:type="dxa"/>
+            <w:tcBorders>
+              <w:start w:val="single" w:sz="4" w:space="0" w:color="000000"/>
+              <w:bottom w:val="single" w:sz="4" w:space="0" w:color="000000"/>
+            </w:tcBorders>
+          </w:tcPr>
+          <w:p>
+            <w:pPr>
+              <w:pStyle w:val="TableContents"/>
+              <w:bidi w:val="0"/>
+              <w:jc w:val="center"/>
+              <w:rPr>
+                <w:rFonts w:ascii="Arial" w:hAnsi="Arial" w:eastAsia="Arial"/>
+              </w:rPr>
+            </w:pPr>
+            <w:r>
+              <w:rPr>
+                <w:rFonts w:eastAsia="Arial" w:ascii="Arial" w:hAnsi="Arial"/>
+              </w:rPr>
+              <w:t>42</w:t>
+            </w:r>
+          </w:p>
+        </w:tc>
+        <w:tc>
+          <w:tcPr>
+            <w:tcW w:w="1796" w:type="dxa"/>
+            <w:tcBorders>
+              <w:start w:val="single" w:sz="4" w:space="0" w:color="000000"/>
+              <w:bottom w:val="single" w:sz="4" w:space="0" w:color="000000"/>
+              <w:end w:val="single" w:sz="4" w:space="0" w:color="000000"/>
+            </w:tcBorders>
+          </w:tcPr>
+          <w:p>
+            <w:pPr>
+              <w:pStyle w:val="TableContents"/>
+              <w:bidi w:val="0"/>
+              <w:jc w:val="center"/>
+              <w:rPr>
+                <w:rFonts w:ascii="Arial" w:hAnsi="Arial" w:eastAsia="Arial"/>
+              </w:rPr>
+            </w:pPr>
+            <w:r>
+              <w:rPr>
+                <w:rFonts w:eastAsia="Arial" w:ascii="Arial" w:hAnsi="Arial"/>
+              </w:rPr>
+              <w:t>66650</w:t>
+            </w:r>
+          </w:p>
+        </w:tc>
+      </w:tr>
+      <w:tr>
+        <w:trPr/>
+        <w:tc>
+          <w:tcPr>
+            <w:tcW w:w="1984" w:type="dxa"/>
+            <w:tcBorders>
+              <w:start w:val="single" w:sz="4" w:space="0" w:color="000000"/>
+              <w:bottom w:val="single" w:sz="4" w:space="0" w:color="000000"/>
+            </w:tcBorders>
+          </w:tcPr>
+          <w:p>
+            <w:pPr>
+              <w:pStyle w:val="TableContents"/>
+              <w:bidi w:val="0"/>
+              <w:jc w:val="start"/>
+              <w:rPr>
+                <w:rFonts w:ascii="Arial" w:hAnsi="Arial" w:eastAsia="Arial"/>
+              </w:rPr>
+            </w:pPr>
+            <w:r>
+              <w:rPr>
+                <w:rFonts w:eastAsia="Arial" w:ascii="Arial" w:hAnsi="Arial"/>
+              </w:rPr>
+              <w:t>Events</w:t>
+            </w:r>
+          </w:p>
+        </w:tc>
+        <w:tc>
+          <w:tcPr>
+            <w:tcW w:w="1796" w:type="dxa"/>
+            <w:tcBorders>
+              <w:start w:val="single" w:sz="4" w:space="0" w:color="000000"/>
+              <w:bottom w:val="single" w:sz="4" w:space="0" w:color="000000"/>
+            </w:tcBorders>
+          </w:tcPr>
+          <w:p>
+            <w:pPr>
+              <w:pStyle w:val="TableContents"/>
+              <w:bidi w:val="0"/>
+              <w:jc w:val="center"/>
+              <w:rPr>
+                <w:rFonts w:ascii="Arial" w:hAnsi="Arial" w:eastAsia="Arial"/>
+              </w:rPr>
+            </w:pPr>
+            <w:r>
+              <w:rPr>
+                <w:rFonts w:eastAsia="Arial" w:ascii="Arial" w:hAnsi="Arial"/>
+              </w:rPr>
+              <w:t>42</w:t>
+            </w:r>
+          </w:p>
+        </w:tc>
+        <w:tc>
+          <w:tcPr>
+            <w:tcW w:w="1796" w:type="dxa"/>
+            <w:tcBorders>
+              <w:start w:val="single" w:sz="4" w:space="0" w:color="000000"/>
+              <w:bottom w:val="single" w:sz="4" w:space="0" w:color="000000"/>
+              <w:end w:val="single" w:sz="4" w:space="0" w:color="000000"/>
+            </w:tcBorders>
+          </w:tcPr>
+          <w:p>
+            <w:pPr>
+              <w:pStyle w:val="TableContents"/>
+              <w:bidi w:val="0"/>
+              <w:jc w:val="center"/>
+              <w:rPr>
+                <w:rFonts w:ascii="Arial" w:hAnsi="Arial" w:eastAsia="Arial"/>
+              </w:rPr>
+            </w:pPr>
+            <w:r>
+              <w:rPr>
+                <w:rFonts w:eastAsia="Arial" w:ascii="Arial" w:hAnsi="Arial"/>
+              </w:rPr>
+              <w:t>7345</w:t>
+            </w:r>
+          </w:p>
+        </w:tc>
+      </w:tr>
+      <w:tr>
+        <w:trPr/>
+        <w:tc>
+          <w:tcPr>
+            <w:tcW w:w="1984" w:type="dxa"/>
+            <w:tcBorders>
+              <w:start w:val="single" w:sz="4" w:space="0" w:color="000000"/>
+              <w:bottom w:val="single" w:sz="4" w:space="0" w:color="000000"/>
+            </w:tcBorders>
+          </w:tcPr>
+          <w:p>
+            <w:pPr>
+              <w:pStyle w:val="TableContents"/>
+              <w:bidi w:val="0"/>
+              <w:jc w:val="start"/>
+              <w:rPr>
+                <w:rFonts w:ascii="Arial" w:hAnsi="Arial" w:eastAsia="Arial"/>
+              </w:rPr>
+            </w:pPr>
+            <w:r>
+              <w:rPr>
+                <w:rFonts w:eastAsia="Arial" w:ascii="Arial" w:hAnsi="Arial"/>
+              </w:rPr>
+              <w:t>Payloads</w:t>
+            </w:r>
+          </w:p>
+        </w:tc>
+        <w:tc>
+          <w:tcPr>
+            <w:tcW w:w="1796" w:type="dxa"/>
+            <w:tcBorders>
+              <w:start w:val="single" w:sz="4" w:space="0" w:color="000000"/>
+              <w:bottom w:val="single" w:sz="4" w:space="0" w:color="000000"/>
+            </w:tcBorders>
+          </w:tcPr>
+          <w:p>
+            <w:pPr>
+              <w:pStyle w:val="TableContents"/>
+              <w:bidi w:val="0"/>
+              <w:jc w:val="center"/>
+              <w:rPr>
+                <w:rFonts w:ascii="Arial" w:hAnsi="Arial" w:eastAsia="Arial"/>
+              </w:rPr>
+            </w:pPr>
+            <w:r>
+              <w:rPr>
+                <w:rFonts w:eastAsia="Arial" w:ascii="Arial" w:hAnsi="Arial"/>
+              </w:rPr>
+              <w:t>28</w:t>
+            </w:r>
+          </w:p>
+        </w:tc>
+        <w:tc>
+          <w:tcPr>
+            <w:tcW w:w="1796" w:type="dxa"/>
+            <w:tcBorders>
+              <w:start w:val="single" w:sz="4" w:space="0" w:color="000000"/>
+              <w:bottom w:val="single" w:sz="4" w:space="0" w:color="000000"/>
+              <w:end w:val="single" w:sz="4" w:space="0" w:color="000000"/>
+            </w:tcBorders>
+          </w:tcPr>
+          <w:p>
+            <w:pPr>
+              <w:pStyle w:val="TableContents"/>
+              <w:bidi w:val="0"/>
+              <w:jc w:val="center"/>
+              <w:rPr>
+                <w:rFonts w:ascii="Arial" w:hAnsi="Arial" w:eastAsia="Arial"/>
+              </w:rPr>
+            </w:pPr>
+            <w:r>
+              <w:rPr>
+                <w:rFonts w:eastAsia="Arial" w:ascii="Arial" w:hAnsi="Arial"/>
+              </w:rPr>
+              <w:t>24724</w:t>
+            </w:r>
+          </w:p>
+        </w:tc>
+      </w:tr>
+      <w:tr>
+        <w:trPr/>
+        <w:tc>
+          <w:tcPr>
+            <w:tcW w:w="1984" w:type="dxa"/>
+            <w:tcBorders>
+              <w:start w:val="single" w:sz="4" w:space="0" w:color="000000"/>
+              <w:bottom w:val="single" w:sz="4" w:space="0" w:color="000000"/>
+            </w:tcBorders>
+          </w:tcPr>
+          <w:p>
+            <w:pPr>
+              <w:pStyle w:val="TableContents"/>
+              <w:bidi w:val="0"/>
+              <w:jc w:val="start"/>
+              <w:rPr>
+                <w:rFonts w:ascii="Arial" w:hAnsi="Arial" w:eastAsia="Arial"/>
+              </w:rPr>
+            </w:pPr>
+            <w:r>
+              <w:rPr>
+                <w:rFonts w:eastAsia="Arial" w:ascii="Arial" w:hAnsi="Arial"/>
+              </w:rPr>
+              <w:t>Launch Site</w:t>
+            </w:r>
+          </w:p>
+        </w:tc>
+        <w:tc>
+          <w:tcPr>
+            <w:tcW w:w="1796" w:type="dxa"/>
+            <w:tcBorders>
+              <w:start w:val="single" w:sz="4" w:space="0" w:color="000000"/>
+              <w:bottom w:val="single" w:sz="4" w:space="0" w:color="000000"/>
+            </w:tcBorders>
+          </w:tcPr>
+          <w:p>
+            <w:pPr>
+              <w:pStyle w:val="TableContents"/>
+              <w:bidi w:val="0"/>
+              <w:jc w:val="center"/>
+              <w:rPr>
+                <w:rFonts w:ascii="Arial" w:hAnsi="Arial" w:eastAsia="Arial"/>
+              </w:rPr>
+            </w:pPr>
+            <w:r>
+              <w:rPr>
+                <w:rFonts w:eastAsia="Arial" w:ascii="Arial" w:hAnsi="Arial"/>
+              </w:rPr>
+              <w:t>17</w:t>
+            </w:r>
+          </w:p>
+        </w:tc>
+        <w:tc>
+          <w:tcPr>
+            <w:tcW w:w="1796" w:type="dxa"/>
+            <w:tcBorders>
+              <w:start w:val="single" w:sz="4" w:space="0" w:color="000000"/>
+              <w:bottom w:val="single" w:sz="4" w:space="0" w:color="000000"/>
+              <w:end w:val="single" w:sz="4" w:space="0" w:color="000000"/>
+            </w:tcBorders>
+          </w:tcPr>
+          <w:p>
+            <w:pPr>
+              <w:pStyle w:val="TableContents"/>
+              <w:bidi w:val="0"/>
+              <w:jc w:val="center"/>
+              <w:rPr>
+                <w:rFonts w:ascii="Arial" w:hAnsi="Arial" w:eastAsia="Arial"/>
+              </w:rPr>
+            </w:pPr>
+            <w:r>
+              <w:rPr>
+                <w:rFonts w:eastAsia="Arial" w:ascii="Arial" w:hAnsi="Arial"/>
+              </w:rPr>
+              <w:t>3968</w:t>
+            </w:r>
+          </w:p>
+        </w:tc>
+      </w:tr>
+      <w:tr>
+        <w:trPr/>
+        <w:tc>
+          <w:tcPr>
+            <w:tcW w:w="1984" w:type="dxa"/>
+            <w:tcBorders>
+              <w:start w:val="single" w:sz="4" w:space="0" w:color="000000"/>
+              <w:bottom w:val="single" w:sz="4" w:space="0" w:color="000000"/>
+            </w:tcBorders>
+          </w:tcPr>
+          <w:p>
+            <w:pPr>
+              <w:pStyle w:val="TableContents"/>
+              <w:bidi w:val="0"/>
+              <w:jc w:val="start"/>
+              <w:rPr>
+                <w:rFonts w:ascii="Arial" w:hAnsi="Arial" w:eastAsia="Arial"/>
+              </w:rPr>
+            </w:pPr>
+            <w:r>
+              <w:rPr>
+                <w:rFonts w:eastAsia="Arial" w:ascii="Arial" w:hAnsi="Arial"/>
+              </w:rPr>
+              <w:t>Organisations</w:t>
+            </w:r>
+          </w:p>
+        </w:tc>
+        <w:tc>
+          <w:tcPr>
+            <w:tcW w:w="1796" w:type="dxa"/>
+            <w:tcBorders>
+              <w:start w:val="single" w:sz="4" w:space="0" w:color="000000"/>
+              <w:bottom w:val="single" w:sz="4" w:space="0" w:color="000000"/>
+            </w:tcBorders>
+          </w:tcPr>
+          <w:p>
+            <w:pPr>
+              <w:pStyle w:val="TableContents"/>
+              <w:bidi w:val="0"/>
+              <w:jc w:val="center"/>
+              <w:rPr>
+                <w:rFonts w:ascii="Arial" w:hAnsi="Arial" w:eastAsia="Arial"/>
+              </w:rPr>
+            </w:pPr>
+            <w:r>
+              <w:rPr>
+                <w:rFonts w:eastAsia="Arial" w:ascii="Arial" w:hAnsi="Arial"/>
+              </w:rPr>
+              <w:t>18</w:t>
+            </w:r>
+          </w:p>
+        </w:tc>
+        <w:tc>
+          <w:tcPr>
+            <w:tcW w:w="1796" w:type="dxa"/>
+            <w:tcBorders>
+              <w:start w:val="single" w:sz="4" w:space="0" w:color="000000"/>
+              <w:bottom w:val="single" w:sz="4" w:space="0" w:color="000000"/>
+              <w:end w:val="single" w:sz="4" w:space="0" w:color="000000"/>
+            </w:tcBorders>
+          </w:tcPr>
+          <w:p>
+            <w:pPr>
+              <w:pStyle w:val="TableContents"/>
+              <w:bidi w:val="0"/>
+              <w:jc w:val="center"/>
+              <w:rPr>
+                <w:rFonts w:ascii="Arial" w:hAnsi="Arial" w:eastAsia="Arial"/>
+              </w:rPr>
+            </w:pPr>
+            <w:r>
+              <w:rPr>
+                <w:rFonts w:eastAsia="Arial" w:ascii="Arial" w:hAnsi="Arial"/>
+              </w:rPr>
+              <w:t>707</w:t>
+            </w:r>
+          </w:p>
+        </w:tc>
+      </w:tr>
+    </w:tbl>
+    <w:p>
+      <w:pPr>
+        <w:pStyle w:val="Normal"/>
+        <w:widowControl/>
+        <w:bidi w:val="0"/>
+        <w:spacing w:before="0" w:after="0"/>
+        <w:jc w:val="start"/>
+        <w:rPr>
+          <w:rFonts w:ascii="Arial" w:hAnsi="Arial" w:cs="Arial"/>
+          <w:szCs w:val="24"/>
+        </w:rPr>
+      </w:pPr>
+      <w:r>
+        <w:rPr>
+          <w:rFonts w:eastAsia="Arial" w:ascii="Arial" w:hAnsi="Arial"/>
+          <w:kern w:val="0"/>
+          <w:lang w:val="en-GB" w:eastAsia="en-US" w:bidi="ar-SA"/>
+        </w:rPr>
+      </w:r>
+    </w:p>
+    <w:p>
+      <w:pPr>
+        <w:pStyle w:val="Normal"/>
+        <w:widowControl/>
+        <w:bidi w:val="0"/>
+        <w:spacing w:before="0" w:after="0"/>
+        <w:jc w:val="start"/>
+        <w:rPr>
+          <w:rFonts w:ascii="Arial" w:hAnsi="Arial" w:cs="Arial"/>
+          <w:szCs w:val="24"/>
+        </w:rPr>
+      </w:pPr>
+      <w:r>
+        <w:rPr>
+          <w:rFonts w:eastAsia="Arial" w:cs="Arial" w:ascii="Arial" w:hAnsi="Arial"/>
+          <w:kern w:val="0"/>
+          <w:szCs w:val="24"/>
+          <w:lang w:val="en-GB" w:eastAsia="en-US" w:bidi="ar-SA"/>
+        </w:rPr>
+        <w:t xml:space="preserve">The </w:t>
+      </w:r>
+      <w:r>
+        <w:rPr>
+          <w:rFonts w:eastAsia="Arial" w:cs="Arial" w:ascii="Arial" w:hAnsi="Arial"/>
+          <w:kern w:val="0"/>
+          <w:szCs w:val="24"/>
+          <w:lang w:val="en-GB" w:eastAsia="en-US" w:bidi="ar-SA"/>
+        </w:rPr>
+        <w:t xml:space="preserve">ultimate </w:t>
+      </w:r>
+      <w:r>
+        <w:rPr>
+          <w:rFonts w:eastAsia="Arial" w:cs="Arial" w:ascii="Arial" w:hAnsi="Arial"/>
+          <w:kern w:val="0"/>
+          <w:szCs w:val="24"/>
+          <w:lang w:val="en-GB" w:eastAsia="en-US" w:bidi="ar-SA"/>
+        </w:rPr>
+        <w:t xml:space="preserve">aim was to create a combined dataset that </w:t>
+      </w:r>
+      <w:r>
+        <w:rPr>
+          <w:rFonts w:eastAsia="Arial" w:cs="Arial" w:ascii="Arial" w:hAnsi="Arial"/>
+          <w:kern w:val="0"/>
+          <w:szCs w:val="24"/>
+          <w:lang w:val="en-GB" w:eastAsia="en-US" w:bidi="ar-SA"/>
+        </w:rPr>
+        <w:t>includes columns that are useful to tell the story of the Kessler Syndrome. The graphs and figures used in this report and the presentation were derived from this single dataset.</w:t>
+      </w:r>
+    </w:p>
+    <w:p>
+      <w:pPr>
+        <w:pStyle w:val="Normal"/>
+        <w:widowControl/>
+        <w:bidi w:val="0"/>
+        <w:spacing w:before="0" w:after="0"/>
+        <w:jc w:val="start"/>
+        <w:rPr>
+          <w:rFonts w:ascii="Arial" w:hAnsi="Arial" w:cs="Arial"/>
+          <w:szCs w:val="24"/>
+        </w:rPr>
+      </w:pPr>
+      <w:r>
+        <w:rPr>
+          <w:rFonts w:eastAsia="Arial" w:ascii="Arial" w:hAnsi="Arial"/>
+          <w:kern w:val="0"/>
+          <w:lang w:val="en-GB" w:eastAsia="en-US" w:bidi="ar-SA"/>
+        </w:rPr>
+      </w:r>
+    </w:p>
+    <w:p>
+      <w:pPr>
+        <w:pStyle w:val="Normal"/>
+        <w:widowControl/>
+        <w:bidi w:val="0"/>
+        <w:spacing w:before="0" w:after="0"/>
+        <w:jc w:val="start"/>
+        <w:rPr>
+          <w:rFonts w:ascii="Arial" w:hAnsi="Arial" w:cs="Arial"/>
+          <w:szCs w:val="24"/>
+        </w:rPr>
+      </w:pPr>
+      <w:r>
+        <w:rPr>
+          <w:rFonts w:eastAsia="Arial" w:cs="Arial" w:ascii="Arial" w:hAnsi="Arial"/>
+          <w:kern w:val="0"/>
+          <w:szCs w:val="24"/>
+          <w:lang w:val="en-GB" w:eastAsia="en-US" w:bidi="ar-SA"/>
+        </w:rPr>
+        <w:t>T</w:t>
+      </w:r>
+      <w:r>
+        <w:rPr>
+          <w:rFonts w:eastAsia="Arial" w:cs="Arial" w:ascii="Arial" w:hAnsi="Arial"/>
+          <w:kern w:val="0"/>
+          <w:szCs w:val="24"/>
+          <w:lang w:val="en-GB" w:eastAsia="en-US" w:bidi="ar-SA"/>
+        </w:rPr>
+        <w:t>his cleaned dataset is available at: https://datascience.daemonchild.com/year2/dat5001/pres1/datasets/cleaned_engineered_sdf.csv</w:t>
+      </w:r>
+    </w:p>
+    <w:p>
+      <w:pPr>
+        <w:pStyle w:val="Normal"/>
+        <w:widowControl/>
+        <w:bidi w:val="0"/>
+        <w:spacing w:before="0" w:after="0"/>
+        <w:jc w:val="start"/>
+        <w:rPr>
+          <w:rFonts w:ascii="Arial" w:hAnsi="Arial" w:cs="Arial"/>
+          <w:szCs w:val="24"/>
+        </w:rPr>
+      </w:pPr>
+      <w:r>
+        <w:rPr>
+          <w:rFonts w:eastAsia="Arial" w:ascii="Arial" w:hAnsi="Arial"/>
+          <w:kern w:val="0"/>
+          <w:lang w:val="en-GB" w:eastAsia="en-US" w:bidi="ar-SA"/>
+        </w:rPr>
+      </w:r>
+    </w:p>
+    <w:p>
+      <w:pPr>
+        <w:pStyle w:val="Normal"/>
+        <w:widowControl/>
+        <w:bidi w:val="0"/>
+        <w:spacing w:before="0" w:after="0"/>
+        <w:jc w:val="start"/>
+        <w:rPr>
+          <w:rFonts w:ascii="Arial" w:hAnsi="Arial" w:cs="Arial"/>
+          <w:szCs w:val="24"/>
+        </w:rPr>
+      </w:pPr>
+      <w:r>
+        <w:rPr>
+          <w:rFonts w:eastAsia="Arial" w:cs="Arial" w:ascii="Arial" w:hAnsi="Arial"/>
+          <w:kern w:val="0"/>
+          <w:szCs w:val="24"/>
+          <w:lang w:val="en-GB" w:eastAsia="en-US" w:bidi="ar-SA"/>
+        </w:rPr>
+        <w:t>T</w:t>
+      </w:r>
+      <w:r>
+        <w:rPr>
+          <w:rFonts w:eastAsia="Arial" w:cs="Arial" w:ascii="Arial" w:hAnsi="Arial"/>
+          <w:kern w:val="0"/>
+          <w:szCs w:val="24"/>
+          <w:lang w:val="en-GB" w:eastAsia="en-US" w:bidi="ar-SA"/>
+        </w:rPr>
+        <w:t xml:space="preserve">he steps that were carried out to generate this dataset were as follows. The satcat database was used as the initial focus point, and </w:t>
+      </w:r>
+    </w:p>
+    <w:p>
+      <w:pPr>
+        <w:pStyle w:val="Normal"/>
+        <w:widowControl/>
+        <w:bidi w:val="0"/>
+        <w:spacing w:before="0" w:after="0"/>
+        <w:jc w:val="start"/>
+        <w:rPr>
+          <w:rFonts w:ascii="Arial" w:hAnsi="Arial" w:cs="Arial"/>
+          <w:szCs w:val="24"/>
+        </w:rPr>
+      </w:pPr>
+      <w:r>
+        <w:rPr>
+          <w:rFonts w:eastAsia="Arial" w:ascii="Arial" w:hAnsi="Arial"/>
+          <w:kern w:val="0"/>
+          <w:lang w:val="en-GB" w:eastAsia="en-US" w:bidi="ar-SA"/>
+        </w:rPr>
+      </w:r>
+    </w:p>
+    <w:p>
+      <w:pPr>
+        <w:pStyle w:val="Normal"/>
+        <w:widowControl/>
+        <w:bidi w:val="0"/>
+        <w:spacing w:before="0" w:after="0"/>
+        <w:jc w:val="start"/>
+        <w:rPr>
+          <w:rFonts w:ascii="Arial" w:hAnsi="Arial" w:cs="Arial"/>
+          <w:szCs w:val="24"/>
+        </w:rPr>
+      </w:pPr>
+      <w:r>
+        <w:rPr>
+          <w:rFonts w:eastAsia="Arial" w:cs="Arial" w:ascii="Arial" w:hAnsi="Arial"/>
+          <w:b/>
+          <w:bCs/>
+          <w:kern w:val="0"/>
+          <w:szCs w:val="24"/>
+          <w:lang w:val="en-GB" w:eastAsia="en-US" w:bidi="ar-SA"/>
+        </w:rPr>
+        <w:t>Data Cleaning</w:t>
+      </w:r>
+    </w:p>
+    <w:p>
+      <w:pPr>
+        <w:pStyle w:val="Normal"/>
+        <w:widowControl/>
+        <w:bidi w:val="0"/>
+        <w:spacing w:before="0" w:after="0"/>
+        <w:jc w:val="start"/>
+        <w:rPr>
+          <w:rFonts w:ascii="Arial" w:hAnsi="Arial" w:cs="Arial"/>
+          <w:szCs w:val="24"/>
+        </w:rPr>
+      </w:pPr>
+      <w:r>
+        <w:rPr>
+          <w:rFonts w:eastAsia="Arial" w:ascii="Arial" w:hAnsi="Arial"/>
+          <w:kern w:val="0"/>
+          <w:lang w:val="en-GB" w:eastAsia="en-US" w:bidi="ar-SA"/>
+        </w:rPr>
+      </w:r>
+    </w:p>
+    <w:p>
+      <w:pPr>
+        <w:pStyle w:val="Normal"/>
+        <w:widowControl/>
+        <w:bidi w:val="0"/>
+        <w:spacing w:before="0" w:after="0"/>
+        <w:jc w:val="start"/>
+        <w:rPr>
+          <w:rFonts w:ascii="Arial" w:hAnsi="Arial" w:cs="Arial"/>
+          <w:szCs w:val="24"/>
+        </w:rPr>
+      </w:pPr>
+      <w:r>
+        <w:rPr>
+          <w:rFonts w:eastAsia="Arial" w:cs="Arial" w:ascii="Arial" w:hAnsi="Arial"/>
+          <w:kern w:val="0"/>
+          <w:szCs w:val="24"/>
+          <w:lang w:val="en-GB" w:eastAsia="en-US" w:bidi="ar-SA"/>
+        </w:rPr>
+        <w:t>Satcat Database</w:t>
+      </w:r>
+    </w:p>
+    <w:p>
+      <w:pPr>
+        <w:pStyle w:val="Normal"/>
+        <w:widowControl/>
+        <w:numPr>
+          <w:ilvl w:val="0"/>
+          <w:numId w:val="4"/>
+        </w:numPr>
+        <w:bidi w:val="0"/>
+        <w:spacing w:before="0" w:after="0"/>
+        <w:jc w:val="start"/>
+        <w:rPr>
+          <w:rFonts w:ascii="Arial" w:hAnsi="Arial" w:cs="Arial"/>
+          <w:szCs w:val="24"/>
+        </w:rPr>
+      </w:pPr>
+      <w:r>
+        <w:rPr>
+          <w:rFonts w:eastAsia="Arial" w:cs="Arial" w:ascii="Arial" w:hAnsi="Arial"/>
+          <w:kern w:val="0"/>
+          <w:szCs w:val="24"/>
+          <w:lang w:val="en-GB" w:eastAsia="en-US" w:bidi="ar-SA"/>
+        </w:rPr>
+        <w:t xml:space="preserve">Removed columns that are not useful to this report. </w:t>
+      </w:r>
+    </w:p>
+    <w:p>
+      <w:pPr>
+        <w:pStyle w:val="Normal"/>
+        <w:widowControl/>
+        <w:numPr>
+          <w:ilvl w:val="0"/>
+          <w:numId w:val="4"/>
+        </w:numPr>
+        <w:bidi w:val="0"/>
+        <w:spacing w:before="0" w:after="0"/>
+        <w:jc w:val="start"/>
+        <w:rPr>
+          <w:rFonts w:ascii="Arial" w:hAnsi="Arial" w:cs="Arial"/>
+          <w:szCs w:val="24"/>
+        </w:rPr>
+      </w:pPr>
+      <w:r>
+        <w:rPr>
+          <w:rFonts w:eastAsia="Arial" w:cs="Arial" w:ascii="Arial" w:hAnsi="Arial"/>
+          <w:kern w:val="0"/>
+          <w:szCs w:val="24"/>
+          <w:lang w:val="en-GB" w:eastAsia="en-US" w:bidi="ar-SA"/>
+        </w:rPr>
+        <w:t>Remaining columns were renamed to make them more readable and self-explanatory to future users of the dataset.</w:t>
+      </w:r>
+    </w:p>
+    <w:p>
+      <w:pPr>
+        <w:pStyle w:val="Normal"/>
+        <w:widowControl/>
+        <w:numPr>
+          <w:ilvl w:val="0"/>
+          <w:numId w:val="0"/>
+        </w:numPr>
+        <w:bidi w:val="0"/>
+        <w:spacing w:before="0" w:after="0"/>
+        <w:ind w:hanging="0" w:start="720"/>
+        <w:jc w:val="start"/>
+        <w:rPr>
+          <w:rFonts w:ascii="Arial" w:hAnsi="Arial" w:cs="Arial"/>
+          <w:szCs w:val="24"/>
+        </w:rPr>
+      </w:pPr>
+      <w:r>
+        <w:rPr>
+          <w:rFonts w:eastAsia="Arial" w:ascii="Arial" w:hAnsi="Arial"/>
+          <w:kern w:val="0"/>
+          <w:lang w:val="en-GB" w:eastAsia="en-US" w:bidi="ar-SA"/>
+        </w:rPr>
+      </w:r>
+    </w:p>
+    <w:p>
+      <w:pPr>
+        <w:pStyle w:val="Normal"/>
+        <w:widowControl/>
+        <w:bidi w:val="0"/>
+        <w:spacing w:before="0" w:after="0"/>
+        <w:jc w:val="start"/>
+        <w:rPr>
+          <w:rFonts w:ascii="Arial" w:hAnsi="Arial" w:cs="Arial"/>
+          <w:szCs w:val="24"/>
+        </w:rPr>
+      </w:pPr>
+      <w:r>
+        <w:rPr>
+          <w:rFonts w:eastAsia="Arial" w:cs="Arial" w:ascii="Arial" w:hAnsi="Arial"/>
+          <w:kern w:val="0"/>
+          <w:szCs w:val="24"/>
+          <w:lang w:val="en-GB" w:eastAsia="en-US" w:bidi="ar-SA"/>
+        </w:rPr>
+        <w:t>Organisations Database</w:t>
+      </w:r>
+    </w:p>
+    <w:p>
+      <w:pPr>
+        <w:pStyle w:val="Normal"/>
+        <w:widowControl/>
+        <w:bidi w:val="0"/>
+        <w:spacing w:before="0" w:after="0"/>
+        <w:jc w:val="start"/>
+        <w:rPr>
+          <w:rFonts w:ascii="Arial" w:hAnsi="Arial" w:cs="Arial"/>
+          <w:szCs w:val="24"/>
+        </w:rPr>
+      </w:pPr>
+      <w:r>
+        <w:rPr>
+          <w:rFonts w:eastAsia="Arial" w:cs="Arial" w:ascii="Arial" w:hAnsi="Arial"/>
+          <w:kern w:val="0"/>
+          <w:szCs w:val="24"/>
+          <w:lang w:val="en-GB" w:eastAsia="en-US" w:bidi="ar-SA"/>
+        </w:rPr>
+        <w:t>This database has a number of inconsistencies that make it more challenging to work with. For example, space exploration is an internation exercise. While many of the organisations have an English Name, many do not, and a large number have a record for each.</w:t>
+      </w:r>
+    </w:p>
+    <w:p>
+      <w:pPr>
+        <w:pStyle w:val="Normal"/>
+        <w:widowControl/>
+        <w:bidi w:val="0"/>
+        <w:spacing w:before="0" w:after="0"/>
+        <w:jc w:val="start"/>
+        <w:rPr>
+          <w:rFonts w:ascii="Arial" w:hAnsi="Arial" w:cs="Arial"/>
+          <w:szCs w:val="24"/>
+        </w:rPr>
+      </w:pPr>
+      <w:r>
+        <w:rPr>
+          <w:rFonts w:eastAsia="Arial" w:ascii="Arial" w:hAnsi="Arial"/>
+          <w:kern w:val="0"/>
+          <w:lang w:val="en-GB" w:eastAsia="en-US" w:bidi="ar-SA"/>
+        </w:rPr>
+      </w:r>
+    </w:p>
+    <w:p>
+      <w:pPr>
+        <w:pStyle w:val="Normal"/>
+        <w:widowControl/>
+        <w:numPr>
+          <w:ilvl w:val="0"/>
+          <w:numId w:val="4"/>
+        </w:numPr>
+        <w:bidi w:val="0"/>
+        <w:spacing w:before="0" w:after="0"/>
+        <w:jc w:val="start"/>
+        <w:rPr>
+          <w:rFonts w:ascii="Arial" w:hAnsi="Arial" w:cs="Arial"/>
+          <w:szCs w:val="24"/>
+        </w:rPr>
+      </w:pPr>
+      <w:r>
+        <w:rPr>
+          <w:rFonts w:eastAsia="Arial" w:cs="Arial" w:ascii="Arial" w:hAnsi="Arial"/>
+          <w:kern w:val="0"/>
+          <w:szCs w:val="24"/>
+          <w:lang w:val="en-GB" w:eastAsia="en-US" w:bidi="ar-SA"/>
+        </w:rPr>
+        <w:t>Consolidated the English Name and Name columns, preferring the English Name where available.</w:t>
+      </w:r>
+    </w:p>
+    <w:p>
+      <w:pPr>
+        <w:pStyle w:val="Normal"/>
+        <w:widowControl/>
+        <w:numPr>
+          <w:ilvl w:val="0"/>
+          <w:numId w:val="4"/>
+        </w:numPr>
+        <w:bidi w:val="0"/>
+        <w:spacing w:before="0" w:after="0"/>
+        <w:jc w:val="start"/>
+        <w:rPr>
+          <w:rFonts w:ascii="Arial" w:hAnsi="Arial" w:cs="Arial"/>
+          <w:szCs w:val="24"/>
+        </w:rPr>
+      </w:pPr>
+      <w:r>
+        <w:rPr>
+          <w:rFonts w:eastAsia="Arial" w:cs="Arial" w:ascii="Arial" w:hAnsi="Arial"/>
+          <w:kern w:val="0"/>
+          <w:szCs w:val="24"/>
+          <w:lang w:val="en-GB" w:eastAsia="en-US" w:bidi="ar-SA"/>
+        </w:rPr>
+        <w:t>Removed the majority of columns from the dataset, keeping name and location (latitude/longitude) values, as well as the reference to the parent organisation.</w:t>
+      </w:r>
+    </w:p>
+    <w:p>
+      <w:pPr>
+        <w:pStyle w:val="Normal"/>
+        <w:widowControl/>
+        <w:numPr>
+          <w:ilvl w:val="0"/>
+          <w:numId w:val="4"/>
+        </w:numPr>
+        <w:bidi w:val="0"/>
+        <w:spacing w:before="0" w:after="0"/>
+        <w:jc w:val="start"/>
+        <w:rPr>
+          <w:rFonts w:ascii="Arial" w:hAnsi="Arial" w:cs="Arial"/>
+          <w:szCs w:val="24"/>
+        </w:rPr>
+      </w:pPr>
+      <w:r>
+        <w:rPr>
+          <w:rFonts w:eastAsia="Arial" w:cs="Arial" w:ascii="Arial" w:hAnsi="Arial"/>
+          <w:kern w:val="0"/>
+          <w:szCs w:val="24"/>
+          <w:lang w:val="en-GB" w:eastAsia="en-US" w:bidi="ar-SA"/>
+        </w:rPr>
+        <w:t>Renamed remaining columns to be self-explanatory.</w:t>
+      </w:r>
+    </w:p>
+    <w:p>
+      <w:pPr>
+        <w:pStyle w:val="Normal"/>
+        <w:widowControl/>
+        <w:numPr>
+          <w:ilvl w:val="0"/>
+          <w:numId w:val="4"/>
+        </w:numPr>
+        <w:bidi w:val="0"/>
+        <w:spacing w:before="0" w:after="0"/>
+        <w:jc w:val="start"/>
+        <w:rPr>
+          <w:rFonts w:ascii="Arial" w:hAnsi="Arial" w:cs="Arial"/>
+          <w:szCs w:val="24"/>
+        </w:rPr>
+      </w:pPr>
+      <w:r>
+        <w:rPr>
+          <w:rFonts w:eastAsia="Arial" w:cs="Arial" w:ascii="Arial" w:hAnsi="Arial"/>
+          <w:kern w:val="0"/>
+          <w:szCs w:val="24"/>
+          <w:lang w:val="en-GB" w:eastAsia="en-US" w:bidi="ar-SA"/>
+        </w:rPr>
+        <w:t>WORK OUT CITY STATE FROM LAT/LONG (NOT YET!)</w:t>
+      </w:r>
+    </w:p>
+    <w:p>
+      <w:pPr>
+        <w:pStyle w:val="Normal"/>
+        <w:widowControl/>
+        <w:bidi w:val="0"/>
+        <w:spacing w:before="0" w:after="0"/>
+        <w:jc w:val="start"/>
+        <w:rPr>
+          <w:rFonts w:ascii="Arial" w:hAnsi="Arial" w:cs="Arial"/>
+          <w:szCs w:val="24"/>
+        </w:rPr>
+      </w:pPr>
+      <w:r>
+        <w:rPr>
+          <w:rFonts w:eastAsia="Arial" w:ascii="Arial" w:hAnsi="Arial"/>
+          <w:kern w:val="0"/>
+          <w:lang w:val="en-GB" w:eastAsia="en-US" w:bidi="ar-SA"/>
+        </w:rPr>
+      </w:r>
+    </w:p>
+    <w:p>
+      <w:pPr>
+        <w:pStyle w:val="Normal"/>
+        <w:widowControl/>
+        <w:bidi w:val="0"/>
+        <w:spacing w:before="0" w:after="0"/>
+        <w:jc w:val="start"/>
+        <w:rPr>
+          <w:rFonts w:ascii="Arial" w:hAnsi="Arial" w:cs="Arial"/>
+          <w:szCs w:val="24"/>
+        </w:rPr>
+      </w:pPr>
+      <w:r>
+        <w:rPr>
+          <w:rFonts w:eastAsia="Arial" w:cs="Arial" w:ascii="Arial" w:hAnsi="Arial"/>
+          <w:kern w:val="0"/>
+          <w:szCs w:val="24"/>
+          <w:lang w:val="en-GB" w:eastAsia="en-US" w:bidi="ar-SA"/>
+        </w:rPr>
+        <w:t>E</w:t>
+      </w:r>
+      <w:r>
+        <w:rPr>
+          <w:rFonts w:eastAsia="Arial" w:cs="Arial" w:ascii="Arial" w:hAnsi="Arial"/>
+          <w:kern w:val="0"/>
+          <w:szCs w:val="24"/>
+          <w:lang w:val="en-GB" w:eastAsia="en-US" w:bidi="ar-SA"/>
+        </w:rPr>
+        <w:t>vents Database</w:t>
+      </w:r>
+    </w:p>
+    <w:p>
+      <w:pPr>
+        <w:pStyle w:val="Normal"/>
+        <w:widowControl/>
+        <w:bidi w:val="0"/>
+        <w:spacing w:before="0" w:after="0"/>
+        <w:jc w:val="start"/>
+        <w:rPr>
+          <w:rFonts w:ascii="Arial" w:hAnsi="Arial" w:cs="Arial"/>
+          <w:szCs w:val="24"/>
+        </w:rPr>
+      </w:pPr>
+      <w:r>
+        <w:rPr>
+          <w:rFonts w:eastAsia="Arial" w:ascii="Arial" w:hAnsi="Arial"/>
+          <w:kern w:val="0"/>
+          <w:lang w:val="en-GB" w:eastAsia="en-US" w:bidi="ar-SA"/>
+        </w:rPr>
+      </w:r>
+    </w:p>
+    <w:p>
+      <w:pPr>
+        <w:pStyle w:val="Normal"/>
+        <w:widowControl/>
+        <w:bidi w:val="0"/>
+        <w:spacing w:before="0" w:after="0"/>
+        <w:jc w:val="start"/>
+        <w:rPr>
+          <w:rFonts w:ascii="Arial" w:hAnsi="Arial" w:cs="Arial"/>
+          <w:szCs w:val="24"/>
+        </w:rPr>
+      </w:pPr>
+      <w:r>
+        <w:rPr>
+          <w:rFonts w:eastAsia="Arial" w:ascii="Arial" w:hAnsi="Arial"/>
+          <w:kern w:val="0"/>
+          <w:lang w:val="en-GB" w:eastAsia="en-US" w:bidi="ar-SA"/>
+        </w:rPr>
+      </w:r>
+    </w:p>
+    <w:p>
+      <w:pPr>
+        <w:pStyle w:val="Normal"/>
+        <w:widowControl/>
+        <w:bidi w:val="0"/>
+        <w:spacing w:before="0" w:after="0"/>
+        <w:jc w:val="start"/>
+        <w:rPr>
+          <w:rFonts w:ascii="Arial" w:hAnsi="Arial" w:cs="Arial"/>
+          <w:szCs w:val="24"/>
+        </w:rPr>
+      </w:pPr>
+      <w:r>
+        <w:rPr>
+          <w:rFonts w:eastAsia="Arial" w:cs="Arial" w:ascii="Arial" w:hAnsi="Arial"/>
+          <w:kern w:val="0"/>
+          <w:szCs w:val="24"/>
+          <w:lang w:val="en-GB" w:eastAsia="en-US" w:bidi="ar-SA"/>
+        </w:rPr>
+        <w:t>Payloads Database</w:t>
+      </w:r>
+    </w:p>
+    <w:p>
+      <w:pPr>
+        <w:pStyle w:val="Normal"/>
+        <w:widowControl/>
+        <w:numPr>
+          <w:ilvl w:val="0"/>
+          <w:numId w:val="4"/>
+        </w:numPr>
+        <w:bidi w:val="0"/>
+        <w:spacing w:before="0" w:after="0"/>
+        <w:jc w:val="start"/>
+        <w:rPr>
+          <w:rFonts w:ascii="Arial" w:hAnsi="Arial" w:cs="Arial"/>
+          <w:szCs w:val="24"/>
+        </w:rPr>
+      </w:pPr>
+      <w:r>
+        <w:rPr>
+          <w:rFonts w:eastAsia="Arial" w:cs="Arial" w:ascii="Arial" w:hAnsi="Arial"/>
+          <w:kern w:val="0"/>
+          <w:szCs w:val="24"/>
+          <w:lang w:val="en-GB" w:eastAsia="en-US" w:bidi="ar-SA"/>
+        </w:rPr>
+        <w:t xml:space="preserve">Removed columns that are not useful to this report. </w:t>
+      </w:r>
+    </w:p>
+    <w:p>
+      <w:pPr>
+        <w:pStyle w:val="Normal"/>
+        <w:widowControl/>
+        <w:numPr>
+          <w:ilvl w:val="0"/>
+          <w:numId w:val="4"/>
+        </w:numPr>
+        <w:bidi w:val="0"/>
+        <w:spacing w:before="0" w:after="0"/>
+        <w:jc w:val="start"/>
+        <w:rPr>
+          <w:rFonts w:ascii="Arial" w:hAnsi="Arial" w:cs="Arial"/>
+          <w:szCs w:val="24"/>
+        </w:rPr>
+      </w:pPr>
+      <w:r>
+        <w:rPr>
+          <w:rFonts w:eastAsia="Arial" w:cs="Arial" w:ascii="Arial" w:hAnsi="Arial"/>
+          <w:kern w:val="0"/>
+          <w:szCs w:val="24"/>
+          <w:lang w:val="en-GB" w:eastAsia="en-US" w:bidi="ar-SA"/>
+        </w:rPr>
+        <w:t>Remaining columns were renamed to make them more readable and self-explanatory to future users of the dataset.</w:t>
+      </w:r>
+    </w:p>
+    <w:p>
+      <w:pPr>
+        <w:pStyle w:val="Normal"/>
+        <w:widowControl/>
+        <w:bidi w:val="0"/>
+        <w:spacing w:before="0" w:after="0"/>
+        <w:jc w:val="start"/>
+        <w:rPr>
+          <w:rFonts w:ascii="Arial" w:hAnsi="Arial" w:cs="Arial"/>
+          <w:szCs w:val="24"/>
+        </w:rPr>
+      </w:pPr>
+      <w:r>
+        <w:rPr>
+          <w:rFonts w:eastAsia="Arial" w:ascii="Arial" w:hAnsi="Arial"/>
+          <w:kern w:val="0"/>
+          <w:lang w:val="en-GB" w:eastAsia="en-US" w:bidi="ar-SA"/>
+        </w:rPr>
+      </w:r>
+    </w:p>
+    <w:p>
+      <w:pPr>
+        <w:pStyle w:val="Normal"/>
+        <w:widowControl/>
+        <w:bidi w:val="0"/>
+        <w:spacing w:before="0" w:after="0"/>
+        <w:jc w:val="start"/>
+        <w:rPr>
+          <w:rFonts w:ascii="Arial" w:hAnsi="Arial" w:cs="Arial"/>
+          <w:szCs w:val="24"/>
+        </w:rPr>
+      </w:pPr>
+      <w:r>
+        <w:rPr>
+          <w:rFonts w:eastAsia="Arial" w:ascii="Arial" w:hAnsi="Arial"/>
+          <w:kern w:val="0"/>
+          <w:lang w:val="en-GB" w:eastAsia="en-US" w:bidi="ar-SA"/>
+        </w:rPr>
+      </w:r>
+    </w:p>
+    <w:p>
+      <w:pPr>
+        <w:pStyle w:val="Normal"/>
+        <w:widowControl/>
+        <w:bidi w:val="0"/>
+        <w:spacing w:before="0" w:after="0"/>
+        <w:jc w:val="start"/>
+        <w:rPr>
+          <w:rFonts w:ascii="Arial" w:hAnsi="Arial" w:cs="Arial"/>
+          <w:szCs w:val="24"/>
+        </w:rPr>
+      </w:pPr>
+      <w:r>
+        <w:rPr>
+          <w:rFonts w:eastAsia="Arial" w:ascii="Arial" w:hAnsi="Arial"/>
+          <w:kern w:val="0"/>
+          <w:lang w:val="en-GB" w:eastAsia="en-US" w:bidi="ar-SA"/>
+        </w:rPr>
+      </w:r>
+    </w:p>
+    <w:p>
+      <w:pPr>
+        <w:pStyle w:val="Normal"/>
+        <w:widowControl/>
+        <w:bidi w:val="0"/>
+        <w:spacing w:before="0" w:after="0"/>
+        <w:jc w:val="start"/>
+        <w:rPr>
+          <w:rFonts w:ascii="Arial" w:hAnsi="Arial" w:cs="Arial"/>
+          <w:szCs w:val="24"/>
+        </w:rPr>
+      </w:pPr>
+      <w:r>
+        <w:rPr>
+          <w:rFonts w:eastAsia="Arial" w:ascii="Arial" w:hAnsi="Arial"/>
+          <w:kern w:val="0"/>
+          <w:lang w:val="en-GB" w:eastAsia="en-US" w:bidi="ar-SA"/>
+        </w:rPr>
+      </w:r>
+    </w:p>
+    <w:p>
+      <w:pPr>
+        <w:pStyle w:val="Normal"/>
+        <w:widowControl/>
+        <w:bidi w:val="0"/>
+        <w:spacing w:before="0" w:after="0"/>
+        <w:jc w:val="start"/>
+        <w:rPr>
+          <w:rFonts w:ascii="Arial" w:hAnsi="Arial" w:cs="Arial"/>
+          <w:szCs w:val="24"/>
+        </w:rPr>
+      </w:pPr>
+      <w:r>
+        <w:rPr>
+          <w:rFonts w:eastAsia="Arial" w:ascii="Arial" w:hAnsi="Arial"/>
+          <w:kern w:val="0"/>
+          <w:lang w:val="en-GB" w:eastAsia="en-US" w:bidi="ar-SA"/>
+        </w:rPr>
+      </w:r>
+    </w:p>
+    <w:p>
+      <w:pPr>
+        <w:pStyle w:val="Normal"/>
+        <w:widowControl/>
+        <w:bidi w:val="0"/>
+        <w:spacing w:before="0" w:after="0"/>
+        <w:jc w:val="start"/>
+        <w:rPr>
+          <w:rFonts w:ascii="Arial" w:hAnsi="Arial" w:cs="Arial"/>
+          <w:szCs w:val="24"/>
+        </w:rPr>
+      </w:pPr>
+      <w:r>
+        <w:rPr>
+          <w:rFonts w:eastAsia="Arial" w:cs="Arial" w:ascii="Arial" w:hAnsi="Arial"/>
+          <w:kern w:val="0"/>
+          <w:szCs w:val="24"/>
+          <w:lang w:val="en-GB" w:eastAsia="en-US" w:bidi="ar-SA"/>
+        </w:rPr>
+        <w:t>C</w:t>
+      </w:r>
+      <w:r>
+        <w:rPr>
+          <w:rFonts w:eastAsia="Arial" w:cs="Arial" w:ascii="Arial" w:hAnsi="Arial"/>
+          <w:kern w:val="0"/>
+          <w:szCs w:val="24"/>
+          <w:lang w:val="en-GB" w:eastAsia="en-US" w:bidi="ar-SA"/>
+        </w:rPr>
+        <w:t>ombining databases...</w:t>
+      </w:r>
+    </w:p>
+    <w:p>
+      <w:pPr>
+        <w:pStyle w:val="Normal"/>
+        <w:widowControl/>
+        <w:bidi w:val="0"/>
+        <w:spacing w:before="0" w:after="0"/>
+        <w:jc w:val="start"/>
+        <w:rPr>
+          <w:rFonts w:ascii="Arial" w:hAnsi="Arial" w:cs="Arial"/>
+          <w:szCs w:val="24"/>
+        </w:rPr>
+      </w:pPr>
+      <w:r>
+        <w:rPr>
+          <w:rFonts w:eastAsia="Arial" w:ascii="Arial" w:hAnsi="Arial"/>
+          <w:kern w:val="0"/>
+          <w:lang w:val="en-GB" w:eastAsia="en-US" w:bidi="ar-SA"/>
+        </w:rPr>
+      </w:r>
+    </w:p>
+    <w:p>
+      <w:pPr>
+        <w:pStyle w:val="Normal"/>
+        <w:widowControl/>
+        <w:bidi w:val="0"/>
+        <w:spacing w:before="0" w:after="0"/>
+        <w:jc w:val="start"/>
+        <w:rPr>
+          <w:rFonts w:ascii="Arial" w:hAnsi="Arial" w:cs="Arial"/>
+          <w:szCs w:val="24"/>
+        </w:rPr>
+      </w:pPr>
+      <w:r>
+        <w:rPr>
+          <w:rFonts w:eastAsia="Arial" w:cs="Arial" w:ascii="Arial" w:hAnsi="Arial"/>
+          <w:b/>
+          <w:bCs/>
+          <w:kern w:val="0"/>
+          <w:szCs w:val="24"/>
+          <w:lang w:val="en-GB" w:eastAsia="en-US" w:bidi="ar-SA"/>
+        </w:rPr>
+        <w:t>F</w:t>
+      </w:r>
+      <w:r>
+        <w:rPr>
+          <w:rFonts w:eastAsia="Arial" w:cs="Arial" w:ascii="Arial" w:hAnsi="Arial"/>
+          <w:b/>
+          <w:bCs/>
+          <w:kern w:val="0"/>
+          <w:szCs w:val="24"/>
+          <w:lang w:val="en-GB" w:eastAsia="en-US" w:bidi="ar-SA"/>
+        </w:rPr>
+        <w:t>eature Engineering</w:t>
+      </w:r>
+    </w:p>
+    <w:p>
+      <w:pPr>
+        <w:pStyle w:val="Normal"/>
+        <w:widowControl/>
+        <w:bidi w:val="0"/>
+        <w:spacing w:before="0" w:after="0"/>
+        <w:jc w:val="start"/>
+        <w:rPr>
+          <w:rFonts w:ascii="Arial" w:hAnsi="Arial" w:cs="Arial"/>
+          <w:szCs w:val="24"/>
+        </w:rPr>
+      </w:pPr>
+      <w:r>
+        <w:rPr>
+          <w:rFonts w:eastAsia="Arial" w:ascii="Arial" w:hAnsi="Arial"/>
+          <w:kern w:val="0"/>
+          <w:lang w:val="en-GB" w:eastAsia="en-US" w:bidi="ar-SA"/>
+        </w:rPr>
+      </w:r>
+    </w:p>
+    <w:p>
+      <w:pPr>
+        <w:pStyle w:val="Normal"/>
+        <w:widowControl/>
+        <w:bidi w:val="0"/>
+        <w:spacing w:before="0" w:after="0"/>
+        <w:jc w:val="start"/>
+        <w:rPr>
+          <w:rFonts w:ascii="Arial" w:hAnsi="Arial" w:cs="Arial"/>
+          <w:szCs w:val="24"/>
+        </w:rPr>
+      </w:pPr>
+      <w:r>
+        <w:rPr>
+          <w:rFonts w:eastAsia="Arial" w:cs="Arial" w:ascii="Arial" w:hAnsi="Arial"/>
+          <w:b/>
+          <w:bCs/>
+          <w:kern w:val="0"/>
+          <w:szCs w:val="24"/>
+          <w:lang w:val="en-GB" w:eastAsia="en-US" w:bidi="ar-SA"/>
+        </w:rPr>
+        <w:t>Is the object still in Orbit?</w:t>
+      </w:r>
+    </w:p>
+    <w:p>
+      <w:pPr>
+        <w:pStyle w:val="Normal"/>
+        <w:widowControl/>
+        <w:bidi w:val="0"/>
+        <w:spacing w:before="0" w:after="0"/>
+        <w:jc w:val="start"/>
+        <w:rPr>
+          <w:rFonts w:ascii="Arial" w:hAnsi="Arial" w:cs="Arial"/>
+          <w:szCs w:val="24"/>
+        </w:rPr>
+      </w:pPr>
+      <w:r>
+        <w:rPr>
+          <w:rFonts w:eastAsia="Arial" w:cs="Arial" w:ascii="Arial" w:hAnsi="Arial"/>
+          <w:b w:val="false"/>
+          <w:bCs w:val="false"/>
+          <w:kern w:val="0"/>
+          <w:szCs w:val="24"/>
+          <w:lang w:val="en-GB" w:eastAsia="en-US" w:bidi="ar-SA"/>
+        </w:rPr>
+        <w:t>Some of the objects in the Satcat database are marked with a “Decay Date”. This can be taken to reference that the object is not longer in orbit. However, there are a significant number where th</w:t>
+      </w:r>
+      <w:r>
+        <w:rPr>
+          <w:rFonts w:eastAsia="Arial" w:cs="Arial" w:ascii="Arial" w:hAnsi="Arial"/>
+          <w:b w:val="false"/>
+          <w:bCs w:val="false"/>
+          <w:kern w:val="0"/>
+          <w:szCs w:val="24"/>
+          <w:lang w:val="en-GB" w:eastAsia="en-US" w:bidi="ar-SA"/>
+        </w:rPr>
+        <w:t xml:space="preserve">ere is no value recorded. </w:t>
+      </w:r>
+    </w:p>
+    <w:p>
+      <w:pPr>
+        <w:pStyle w:val="Normal"/>
+        <w:widowControl/>
+        <w:bidi w:val="0"/>
+        <w:spacing w:before="0" w:after="0"/>
+        <w:jc w:val="start"/>
+        <w:rPr>
+          <w:rFonts w:ascii="Arial" w:hAnsi="Arial" w:cs="Arial"/>
+          <w:szCs w:val="24"/>
+        </w:rPr>
+      </w:pPr>
+      <w:r>
+        <w:rPr>
+          <w:rFonts w:eastAsia="Arial" w:ascii="Arial" w:hAnsi="Arial"/>
+          <w:b w:val="false"/>
+          <w:bCs w:val="false"/>
+          <w:kern w:val="0"/>
+          <w:lang w:val="en-GB" w:eastAsia="en-US" w:bidi="ar-SA"/>
+        </w:rPr>
+      </w:r>
+    </w:p>
+    <w:p>
+      <w:pPr>
+        <w:pStyle w:val="Normal"/>
+        <w:widowControl/>
+        <w:bidi w:val="0"/>
+        <w:spacing w:before="0" w:after="0"/>
+        <w:jc w:val="start"/>
+        <w:rPr>
+          <w:rFonts w:ascii="Arial" w:hAnsi="Arial" w:cs="Arial"/>
+          <w:szCs w:val="24"/>
+        </w:rPr>
+      </w:pPr>
+      <w:r>
+        <w:rPr>
+          <w:rFonts w:eastAsia="Arial" w:cs="Arial" w:ascii="Arial" w:hAnsi="Arial"/>
+          <w:b w:val="false"/>
+          <w:bCs w:val="false"/>
+          <w:kern w:val="0"/>
+          <w:szCs w:val="24"/>
+          <w:lang w:val="en-GB" w:eastAsia="en-US" w:bidi="ar-SA"/>
+        </w:rPr>
+        <w:t>The Status column provides more useful data, but</w:t>
+      </w:r>
+      <w:r>
+        <w:rPr>
+          <w:rFonts w:eastAsia="Arial" w:cs="Arial" w:ascii="Arial" w:hAnsi="Arial"/>
+          <w:b w:val="false"/>
+          <w:bCs w:val="false"/>
+          <w:kern w:val="0"/>
+          <w:szCs w:val="24"/>
+          <w:lang w:val="en-GB" w:eastAsia="en-US" w:bidi="ar-SA"/>
+        </w:rPr>
+        <w:t xml:space="preserve"> </w:t>
+      </w:r>
+      <w:r>
+        <w:rPr>
+          <w:rFonts w:eastAsia="Arial" w:cs="Arial" w:ascii="Arial" w:hAnsi="Arial"/>
+          <w:b w:val="false"/>
+          <w:bCs w:val="false"/>
+          <w:kern w:val="0"/>
+          <w:szCs w:val="24"/>
+          <w:lang w:val="en-GB" w:eastAsia="en-US" w:bidi="ar-SA"/>
+        </w:rPr>
+        <w:t>these values have to be treated carefully. A</w:t>
+      </w:r>
+      <w:r>
+        <w:rPr>
+          <w:rFonts w:eastAsia="Arial" w:cs="Arial" w:ascii="Arial" w:hAnsi="Arial"/>
+          <w:kern w:val="0"/>
+          <w:szCs w:val="24"/>
+          <w:lang w:val="en-GB" w:eastAsia="en-US" w:bidi="ar-SA"/>
+        </w:rPr>
+        <w:t>ccording to the creator of the original datasets:</w:t>
+      </w:r>
+    </w:p>
+    <w:p>
+      <w:pPr>
+        <w:pStyle w:val="Normal"/>
+        <w:widowControl/>
+        <w:bidi w:val="0"/>
+        <w:spacing w:before="0" w:after="0"/>
+        <w:jc w:val="start"/>
+        <w:rPr>
+          <w:rFonts w:ascii="Arial" w:hAnsi="Arial" w:cs="Arial"/>
+          <w:szCs w:val="24"/>
+        </w:rPr>
+      </w:pPr>
+      <w:r>
+        <w:rPr>
+          <w:rFonts w:eastAsia="Arial" w:ascii="Arial" w:hAnsi="Arial"/>
+          <w:kern w:val="0"/>
+          <w:lang w:val="en-GB" w:eastAsia="en-US" w:bidi="ar-SA"/>
+        </w:rPr>
+      </w:r>
+    </w:p>
+    <w:p>
+      <w:pPr>
+        <w:pStyle w:val="Normal"/>
+        <w:widowControl/>
+        <w:bidi w:val="0"/>
+        <w:spacing w:before="0" w:after="0"/>
+        <w:jc w:val="start"/>
+        <w:rPr>
+          <w:rFonts w:ascii="Arial" w:hAnsi="Arial" w:cs="Arial"/>
+          <w:szCs w:val="24"/>
+        </w:rPr>
+      </w:pPr>
+      <w:r>
+        <w:rPr>
+          <w:rFonts w:eastAsia="Arial" w:cs="Arial" w:ascii="Arial" w:hAnsi="Arial"/>
+          <w:kern w:val="0"/>
+          <w:szCs w:val="24"/>
+          <w:lang w:val="en-GB" w:eastAsia="en-US" w:bidi="ar-SA"/>
+        </w:rPr>
+        <w:t>“</w:t>
+      </w:r>
+      <w:r>
+        <w:rPr>
+          <w:rFonts w:eastAsia="Arial" w:cs="Arial" w:ascii="Arial" w:hAnsi="Arial"/>
+          <w:kern w:val="0"/>
+          <w:szCs w:val="24"/>
+          <w:lang w:val="en-GB" w:eastAsia="en-US" w:bidi="ar-SA"/>
+        </w:rPr>
+        <w:t>An artificial space object … can be in one of the following object states:</w:t>
+      </w:r>
+    </w:p>
+    <w:p>
+      <w:pPr>
+        <w:pStyle w:val="Normal"/>
+        <w:widowControl/>
+        <w:bidi w:val="0"/>
+        <w:spacing w:before="0" w:after="0"/>
+        <w:jc w:val="start"/>
+        <w:rPr>
+          <w:rFonts w:ascii="Arial" w:hAnsi="Arial" w:cs="Arial"/>
+          <w:szCs w:val="24"/>
+        </w:rPr>
+      </w:pPr>
+      <w:r>
+        <w:rPr>
+          <w:rFonts w:eastAsia="Arial" w:ascii="Arial" w:hAnsi="Arial"/>
+          <w:kern w:val="0"/>
+          <w:lang w:val="en-GB" w:eastAsia="en-US" w:bidi="ar-SA"/>
+        </w:rPr>
+      </w:r>
+    </w:p>
+    <w:p>
+      <w:pPr>
+        <w:pStyle w:val="Normal"/>
+        <w:widowControl/>
+        <w:numPr>
+          <w:ilvl w:val="0"/>
+          <w:numId w:val="3"/>
+        </w:numPr>
+        <w:bidi w:val="0"/>
+        <w:spacing w:before="0" w:after="0"/>
+        <w:jc w:val="start"/>
+        <w:rPr>
+          <w:rFonts w:ascii="Arial" w:hAnsi="Arial" w:cs="Arial"/>
+          <w:szCs w:val="24"/>
+        </w:rPr>
+      </w:pPr>
+      <w:r>
+        <w:rPr>
+          <w:rFonts w:eastAsia="Arial" w:cs="Arial" w:ascii="Arial" w:hAnsi="Arial"/>
+          <w:kern w:val="0"/>
+          <w:szCs w:val="24"/>
+          <w:lang w:val="en-GB" w:eastAsia="en-US" w:bidi="ar-SA"/>
+        </w:rPr>
+        <w:t>Attached to another object</w:t>
+      </w:r>
+    </w:p>
+    <w:p>
+      <w:pPr>
+        <w:pStyle w:val="Normal"/>
+        <w:widowControl/>
+        <w:numPr>
+          <w:ilvl w:val="0"/>
+          <w:numId w:val="3"/>
+        </w:numPr>
+        <w:bidi w:val="0"/>
+        <w:spacing w:before="0" w:after="0"/>
+        <w:jc w:val="start"/>
+        <w:rPr>
+          <w:rFonts w:ascii="Arial" w:hAnsi="Arial" w:cs="Arial"/>
+          <w:szCs w:val="24"/>
+        </w:rPr>
+      </w:pPr>
+      <w:r>
+        <w:rPr>
+          <w:rFonts w:eastAsia="Arial" w:cs="Arial" w:ascii="Arial" w:hAnsi="Arial"/>
+          <w:kern w:val="0"/>
+          <w:szCs w:val="24"/>
+          <w:lang w:val="en-GB" w:eastAsia="en-US" w:bidi="ar-SA"/>
+        </w:rPr>
+        <w:t>In free flight in the gravitational field of a world or astronomical body</w:t>
+      </w:r>
+    </w:p>
+    <w:p>
+      <w:pPr>
+        <w:pStyle w:val="Normal"/>
+        <w:widowControl/>
+        <w:numPr>
+          <w:ilvl w:val="0"/>
+          <w:numId w:val="3"/>
+        </w:numPr>
+        <w:bidi w:val="0"/>
+        <w:spacing w:before="0" w:after="0"/>
+        <w:jc w:val="start"/>
+        <w:rPr>
+          <w:rFonts w:ascii="Arial" w:hAnsi="Arial" w:cs="Arial"/>
+          <w:szCs w:val="24"/>
+        </w:rPr>
+      </w:pPr>
+      <w:r>
+        <w:rPr>
+          <w:rFonts w:eastAsia="Arial" w:cs="Arial" w:ascii="Arial" w:hAnsi="Arial"/>
+          <w:kern w:val="0"/>
+          <w:szCs w:val="24"/>
+          <w:lang w:val="en-GB" w:eastAsia="en-US" w:bidi="ar-SA"/>
+        </w:rPr>
+        <w:t>On the surface of an astronomical body</w:t>
+      </w:r>
+    </w:p>
+    <w:p>
+      <w:pPr>
+        <w:pStyle w:val="Normal"/>
+        <w:widowControl/>
+        <w:numPr>
+          <w:ilvl w:val="0"/>
+          <w:numId w:val="3"/>
+        </w:numPr>
+        <w:bidi w:val="0"/>
+        <w:spacing w:before="0" w:after="0"/>
+        <w:jc w:val="start"/>
+        <w:rPr>
+          <w:rFonts w:ascii="Arial" w:hAnsi="Arial" w:cs="Arial"/>
+          <w:szCs w:val="24"/>
+        </w:rPr>
+      </w:pPr>
+      <w:r>
+        <w:rPr>
+          <w:rFonts w:eastAsia="Arial" w:cs="Arial" w:ascii="Arial" w:hAnsi="Arial"/>
+          <w:kern w:val="0"/>
+          <w:szCs w:val="24"/>
+          <w:lang w:val="en-GB" w:eastAsia="en-US" w:bidi="ar-SA"/>
+        </w:rPr>
+        <w:t>Destroyed (in a collision, explosion or by burnup in atmospheric entry).</w:t>
+      </w:r>
+    </w:p>
+    <w:p>
+      <w:pPr>
+        <w:pStyle w:val="Normal"/>
+        <w:widowControl/>
+        <w:bidi w:val="0"/>
+        <w:spacing w:before="0" w:after="0"/>
+        <w:jc w:val="start"/>
+        <w:rPr>
+          <w:rFonts w:ascii="Arial" w:hAnsi="Arial" w:cs="Arial"/>
+          <w:szCs w:val="24"/>
+        </w:rPr>
+      </w:pPr>
+      <w:r>
+        <w:rPr>
+          <w:rFonts w:eastAsia="Arial" w:ascii="Arial" w:hAnsi="Arial"/>
+          <w:kern w:val="0"/>
+          <w:lang w:val="en-GB" w:eastAsia="en-US" w:bidi="ar-SA"/>
+        </w:rPr>
+      </w:r>
+    </w:p>
+    <w:p>
+      <w:pPr>
+        <w:pStyle w:val="Normal"/>
+        <w:widowControl/>
+        <w:bidi w:val="0"/>
+        <w:spacing w:before="0" w:after="0"/>
+        <w:jc w:val="start"/>
+        <w:rPr>
+          <w:rFonts w:ascii="Arial" w:hAnsi="Arial" w:cs="Arial"/>
+          <w:szCs w:val="24"/>
+        </w:rPr>
+      </w:pPr>
+      <w:r>
+        <w:rPr>
+          <w:rFonts w:eastAsia="Arial" w:ascii="Arial" w:hAnsi="Arial"/>
+          <w:kern w:val="0"/>
+          <w:lang w:val="en-GB" w:eastAsia="en-US" w:bidi="ar-SA"/>
+        </w:rPr>
+        <w:t>Each time the object transitions to another state (undocks, is attached to something, reenters, changes which body it is orbiting, etc.) marks the beginning or end of a phase. Most objects in GCAT have only a single phase - they separate from an object (launch vehicle) and then are either still in free flight or have reentered. However, some objects go through many phases.</w:t>
+      </w:r>
+    </w:p>
+    <w:p>
+      <w:pPr>
+        <w:pStyle w:val="Normal"/>
+        <w:widowControl/>
+        <w:bidi w:val="0"/>
+        <w:spacing w:before="0" w:after="0"/>
+        <w:jc w:val="start"/>
+        <w:rPr>
+          <w:rFonts w:ascii="Arial" w:hAnsi="Arial" w:cs="Arial"/>
+          <w:szCs w:val="24"/>
+        </w:rPr>
+      </w:pPr>
+      <w:r>
+        <w:rPr>
+          <w:rFonts w:eastAsia="Arial" w:ascii="Arial" w:hAnsi="Arial"/>
+          <w:kern w:val="0"/>
+          <w:lang w:val="en-GB" w:eastAsia="en-US" w:bidi="ar-SA"/>
+        </w:rPr>
+      </w:r>
+    </w:p>
+    <w:p>
+      <w:pPr>
+        <w:pStyle w:val="Normal"/>
+        <w:widowControl/>
+        <w:bidi w:val="0"/>
+        <w:spacing w:before="0" w:after="0"/>
+        <w:jc w:val="start"/>
+        <w:rPr>
+          <w:rFonts w:ascii="Arial" w:hAnsi="Arial" w:cs="Arial"/>
+          <w:szCs w:val="24"/>
+        </w:rPr>
+      </w:pPr>
+      <w:r>
+        <w:rPr>
+          <w:rFonts w:eastAsia="Arial" w:ascii="Arial" w:hAnsi="Arial"/>
+          <w:kern w:val="0"/>
+          <w:lang w:val="en-GB" w:eastAsia="en-US" w:bidi="ar-SA"/>
+        </w:rPr>
+        <w:t xml:space="preserve">The main object catalogs define and list the first phase of each object. Objects with more than one phase have their subsequent phases listed as entries in the event object catalogs.” </w:t>
+      </w:r>
+      <w:r>
+        <w:rPr>
+          <w:rFonts w:eastAsia="Arial" w:ascii="Arial" w:hAnsi="Arial"/>
+          <w:kern w:val="0"/>
+          <w:lang w:val="en-GB" w:eastAsia="en-US" w:bidi="ar-SA"/>
+        </w:rPr>
+        <w:t>(cite** McDowell 2019)</w:t>
+      </w:r>
+    </w:p>
+    <w:p>
+      <w:pPr>
+        <w:pStyle w:val="Normal"/>
+        <w:widowControl/>
+        <w:bidi w:val="0"/>
+        <w:spacing w:before="0" w:after="0"/>
+        <w:jc w:val="start"/>
+        <w:rPr>
+          <w:rFonts w:ascii="Arial" w:hAnsi="Arial" w:cs="Arial"/>
+          <w:szCs w:val="24"/>
+        </w:rPr>
+      </w:pPr>
+      <w:r>
+        <w:rPr>
+          <w:rFonts w:eastAsia="Arial" w:ascii="Arial" w:hAnsi="Arial"/>
+          <w:kern w:val="0"/>
+          <w:lang w:val="en-GB" w:eastAsia="en-US" w:bidi="ar-SA"/>
+        </w:rPr>
+      </w:r>
+    </w:p>
+    <w:p>
+      <w:pPr>
+        <w:pStyle w:val="Normal"/>
+        <w:widowControl/>
+        <w:bidi w:val="0"/>
+        <w:spacing w:before="0" w:after="0"/>
+        <w:jc w:val="start"/>
+        <w:rPr>
+          <w:rFonts w:ascii="Arial" w:hAnsi="Arial" w:cs="Arial"/>
+          <w:szCs w:val="24"/>
+        </w:rPr>
+      </w:pPr>
+      <w:r>
+        <w:rPr>
+          <w:rFonts w:eastAsia="Arial" w:cs="Arial" w:ascii="Arial" w:hAnsi="Arial"/>
+          <w:kern w:val="0"/>
+          <w:szCs w:val="24"/>
+          <w:lang w:val="en-GB" w:eastAsia="en-US" w:bidi="ar-SA"/>
+        </w:rPr>
+        <w:t xml:space="preserve">In other words, the Satcat dataset includes the initial phase of the objects life only. </w:t>
+      </w:r>
+      <w:r>
+        <w:rPr>
+          <w:rFonts w:eastAsia="Arial" w:cs="Arial" w:ascii="Arial" w:hAnsi="Arial"/>
+          <w:kern w:val="0"/>
+          <w:szCs w:val="24"/>
+          <w:lang w:val="en-GB" w:eastAsia="en-US" w:bidi="ar-SA"/>
+        </w:rPr>
+        <w:t xml:space="preserve">Applying the data in the Events database </w:t>
+      </w:r>
+      <w:r>
+        <w:rPr>
+          <w:rFonts w:eastAsia="Arial" w:cs="Arial" w:ascii="Arial" w:hAnsi="Arial"/>
+          <w:kern w:val="0"/>
+          <w:szCs w:val="24"/>
+          <w:lang w:val="en-GB" w:eastAsia="en-US" w:bidi="ar-SA"/>
+        </w:rPr>
+        <w:t xml:space="preserve">allows for this to be updated to show the most recently known state of the object. Once this state is known, it </w:t>
+      </w:r>
+      <w:r>
+        <w:rPr>
+          <w:rFonts w:eastAsia="Arial" w:cs="Arial" w:ascii="Arial" w:hAnsi="Arial"/>
+          <w:kern w:val="0"/>
+          <w:szCs w:val="24"/>
+          <w:lang w:val="en-GB" w:eastAsia="en-US" w:bidi="ar-SA"/>
+        </w:rPr>
+        <w:t>is then possible to determine whether an object is still in orbit.</w:t>
+      </w:r>
+    </w:p>
+    <w:p>
+      <w:pPr>
+        <w:pStyle w:val="Normal"/>
+        <w:widowControl/>
+        <w:bidi w:val="0"/>
+        <w:spacing w:before="0" w:after="0"/>
+        <w:jc w:val="start"/>
+        <w:rPr>
+          <w:rFonts w:ascii="Arial" w:hAnsi="Arial" w:cs="Arial"/>
+          <w:szCs w:val="24"/>
+        </w:rPr>
+      </w:pPr>
+      <w:r>
+        <w:rPr>
+          <w:rFonts w:eastAsia="Arial" w:ascii="Arial" w:hAnsi="Arial"/>
+          <w:kern w:val="0"/>
+          <w:lang w:val="en-GB" w:eastAsia="en-US" w:bidi="ar-SA"/>
+        </w:rPr>
+      </w:r>
+    </w:p>
+    <w:p>
+      <w:pPr>
+        <w:pStyle w:val="Normal"/>
+        <w:widowControl/>
+        <w:bidi w:val="0"/>
+        <w:spacing w:before="0" w:after="0"/>
+        <w:jc w:val="start"/>
+        <w:rPr>
+          <w:rFonts w:ascii="Arial" w:hAnsi="Arial" w:cs="Arial"/>
+          <w:szCs w:val="24"/>
+        </w:rPr>
+      </w:pPr>
+      <w:r>
+        <w:rPr>
+          <w:rFonts w:eastAsia="Arial" w:cs="Arial" w:ascii="Arial" w:hAnsi="Arial"/>
+          <w:kern w:val="0"/>
+          <w:szCs w:val="24"/>
+          <w:lang w:val="en-GB" w:eastAsia="en-US" w:bidi="ar-SA"/>
+        </w:rPr>
+        <w:t>F</w:t>
+      </w:r>
+      <w:r>
+        <w:rPr>
+          <w:rFonts w:eastAsia="Arial" w:cs="Arial" w:ascii="Arial" w:hAnsi="Arial"/>
+          <w:kern w:val="0"/>
+          <w:szCs w:val="24"/>
+          <w:lang w:val="en-GB" w:eastAsia="en-US" w:bidi="ar-SA"/>
+        </w:rPr>
+        <w:t>or example, taking a random object (‘Progress-36’, a payload), the Satcat database shows it as Docked.</w:t>
+      </w:r>
+    </w:p>
+    <w:p>
+      <w:pPr>
+        <w:pStyle w:val="Normal"/>
+        <w:widowControl/>
+        <w:bidi w:val="0"/>
+        <w:spacing w:before="0" w:after="0"/>
+        <w:jc w:val="start"/>
+        <w:rPr>
+          <w:rFonts w:ascii="Arial" w:hAnsi="Arial" w:cs="Arial"/>
+          <w:szCs w:val="24"/>
+        </w:rPr>
+      </w:pPr>
+      <w:r>
+        <w:rPr>
+          <w:rFonts w:eastAsia="Arial" w:ascii="Arial" w:hAnsi="Arial"/>
+          <w:kern w:val="0"/>
+          <w:lang w:val="en-GB" w:eastAsia="en-US" w:bidi="ar-SA"/>
+        </w:rPr>
+        <w:drawing>
+          <wp:anchor behindDoc="0" distT="0" distB="0" distL="0" distR="0" simplePos="0" locked="0" layoutInCell="0" allowOverlap="1" relativeHeight="2">
+            <wp:simplePos x="0" y="0"/>
+            <wp:positionH relativeFrom="column">
+              <wp:posOffset>63500</wp:posOffset>
+            </wp:positionH>
+            <wp:positionV relativeFrom="paragraph">
+              <wp:posOffset>137795</wp:posOffset>
+            </wp:positionV>
+            <wp:extent cx="2893060" cy="812800"/>
+            <wp:effectExtent l="0" t="0" r="0" b="0"/>
+            <wp:wrapTopAndBottom/>
+            <wp:docPr id="1" name="Image1" descr="" title=""/>
+            <wp:cNvGraphicFramePr>
+              <a:graphicFrameLocks xmlns:a="http://schemas.openxmlformats.org/drawingml/2006/main" noChangeAspect="1"/>
+            </wp:cNvGraphicFramePr>
+            <a:graphic xmlns:a="http://schemas.openxmlformats.org/drawingml/2006/main">
+              <a:graphicData uri="http://schemas.openxmlformats.org/drawingml/2006/picture">
+                <pic:pic xmlns:pic="http://schemas.openxmlformats.org/drawingml/2006/picture">
+                  <pic:nvPicPr>
+                    <pic:cNvPr id="1" name="Image1" descr="" title=""/>
+                    <pic:cNvPicPr>
+                      <a:picLocks noChangeAspect="1" noChangeArrowheads="1"/>
+                    </pic:cNvPicPr>
+                  </pic:nvPicPr>
+                  <pic:blipFill>
+                    <a:blip r:embed="rId18"/>
+                    <a:stretch>
+                      <a:fillRect/>
+                    </a:stretch>
+                  </pic:blipFill>
+                  <pic:spPr bwMode="auto">
+                    <a:xfrm>
+                      <a:off x="0" y="0"/>
+                      <a:ext cx="2893060" cy="812800"/>
+                    </a:xfrm>
+                    <a:prstGeom prst="rect">
+                      <a:avLst/>
+                    </a:prstGeom>
+                  </pic:spPr>
+                </pic:pic>
+              </a:graphicData>
+            </a:graphic>
+          </wp:anchor>
+        </w:drawing>
+      </w:r>
+    </w:p>
+    <w:p>
+      <w:pPr>
+        <w:pStyle w:val="Normal"/>
+        <w:widowControl/>
+        <w:bidi w:val="0"/>
+        <w:spacing w:before="0" w:after="0"/>
+        <w:jc w:val="start"/>
+        <w:rPr>
+          <w:rFonts w:ascii="Arial" w:hAnsi="Arial" w:cs="Arial"/>
+          <w:szCs w:val="24"/>
+        </w:rPr>
+      </w:pPr>
+      <w:r>
+        <w:rPr>
+          <w:rFonts w:eastAsia="Arial" w:cs="Arial" w:ascii="Arial" w:hAnsi="Arial"/>
+          <w:kern w:val="0"/>
+          <w:szCs w:val="24"/>
+          <w:lang w:val="en-GB" w:eastAsia="en-US" w:bidi="ar-SA"/>
+        </w:rPr>
+        <w:t>However, the Events database shows two subsequent phase transitions: undocked and finally deorbited.</w:t>
+      </w:r>
+    </w:p>
+    <w:p>
+      <w:pPr>
+        <w:pStyle w:val="Normal"/>
+        <w:widowControl/>
+        <w:bidi w:val="0"/>
+        <w:spacing w:before="0" w:after="0"/>
+        <w:jc w:val="start"/>
+        <w:rPr>
+          <w:rFonts w:ascii="Arial" w:hAnsi="Arial" w:cs="Arial"/>
+          <w:szCs w:val="24"/>
+        </w:rPr>
+      </w:pPr>
+      <w:r>
+        <w:rPr>
+          <w:rFonts w:eastAsia="Arial" w:ascii="Arial" w:hAnsi="Arial"/>
+          <w:kern w:val="0"/>
+          <w:lang w:val="en-GB" w:eastAsia="en-US" w:bidi="ar-SA"/>
+        </w:rPr>
+        <w:drawing>
+          <wp:anchor behindDoc="0" distT="0" distB="0" distL="0" distR="0" simplePos="0" locked="0" layoutInCell="0" allowOverlap="1" relativeHeight="3">
+            <wp:simplePos x="0" y="0"/>
+            <wp:positionH relativeFrom="column">
+              <wp:posOffset>64135</wp:posOffset>
+            </wp:positionH>
+            <wp:positionV relativeFrom="paragraph">
+              <wp:posOffset>112395</wp:posOffset>
+            </wp:positionV>
+            <wp:extent cx="2849245" cy="939165"/>
+            <wp:effectExtent l="0" t="0" r="0" b="0"/>
+            <wp:wrapTopAndBottom/>
+            <wp:docPr id="2" name="Image2" descr="" title=""/>
+            <wp:cNvGraphicFramePr>
+              <a:graphicFrameLocks xmlns:a="http://schemas.openxmlformats.org/drawingml/2006/main" noChangeAspect="1"/>
+            </wp:cNvGraphicFramePr>
+            <a:graphic xmlns:a="http://schemas.openxmlformats.org/drawingml/2006/main">
+              <a:graphicData uri="http://schemas.openxmlformats.org/drawingml/2006/picture">
+                <pic:pic xmlns:pic="http://schemas.openxmlformats.org/drawingml/2006/picture">
+                  <pic:nvPicPr>
+                    <pic:cNvPr id="2" name="Image2" descr="" title=""/>
+                    <pic:cNvPicPr>
+                      <a:picLocks noChangeAspect="1" noChangeArrowheads="1"/>
+                    </pic:cNvPicPr>
+                  </pic:nvPicPr>
+                  <pic:blipFill>
+                    <a:blip r:embed="rId19"/>
+                    <a:stretch>
+                      <a:fillRect/>
+                    </a:stretch>
+                  </pic:blipFill>
+                  <pic:spPr bwMode="auto">
+                    <a:xfrm>
+                      <a:off x="0" y="0"/>
+                      <a:ext cx="2849245" cy="939165"/>
+                    </a:xfrm>
+                    <a:prstGeom prst="rect">
+                      <a:avLst/>
+                    </a:prstGeom>
+                  </pic:spPr>
+                </pic:pic>
+              </a:graphicData>
+            </a:graphic>
+          </wp:anchor>
+        </w:drawing>
+      </w:r>
+    </w:p>
+    <w:p>
+      <w:pPr>
+        <w:pStyle w:val="Normal"/>
+        <w:widowControl/>
+        <w:bidi w:val="0"/>
+        <w:spacing w:before="0" w:after="0"/>
+        <w:jc w:val="start"/>
+        <w:rPr>
+          <w:rFonts w:ascii="Arial" w:hAnsi="Arial" w:cs="Arial"/>
+          <w:szCs w:val="24"/>
+        </w:rPr>
+      </w:pPr>
+      <w:r>
+        <w:rPr>
+          <w:rFonts w:eastAsia="Arial" w:cs="Arial" w:ascii="Arial" w:hAnsi="Arial"/>
+          <w:kern w:val="0"/>
+          <w:szCs w:val="24"/>
+          <w:lang w:val="en-GB" w:eastAsia="en-US" w:bidi="ar-SA"/>
+        </w:rPr>
+        <w:t xml:space="preserve">The most recent update can be found at the highest index value, </w:t>
+      </w:r>
+      <w:r>
+        <w:rPr>
+          <w:rFonts w:eastAsia="Arial" w:cs="Arial" w:ascii="Arial" w:hAnsi="Arial"/>
+          <w:kern w:val="0"/>
+          <w:szCs w:val="24"/>
+          <w:lang w:val="en-GB" w:eastAsia="en-US" w:bidi="ar-SA"/>
+        </w:rPr>
+        <w:t>so a deduplicated version of the events database was created containing only these rows. This was merged with the Satcat data, overwriting the original values with those found in Events.</w:t>
+      </w:r>
+    </w:p>
+    <w:p>
+      <w:pPr>
+        <w:pStyle w:val="Normal"/>
+        <w:widowControl/>
+        <w:bidi w:val="0"/>
+        <w:spacing w:before="0" w:after="0"/>
+        <w:jc w:val="start"/>
+        <w:rPr>
+          <w:rFonts w:ascii="Arial" w:hAnsi="Arial" w:cs="Arial"/>
+          <w:szCs w:val="24"/>
+        </w:rPr>
+      </w:pPr>
+      <w:r>
+        <w:rPr>
+          <w:rFonts w:eastAsia="Arial" w:ascii="Arial" w:hAnsi="Arial"/>
+          <w:kern w:val="0"/>
+          <w:lang w:val="en-GB" w:eastAsia="en-US" w:bidi="ar-SA"/>
+        </w:rPr>
+      </w:r>
+    </w:p>
+    <w:p>
+      <w:pPr>
+        <w:pStyle w:val="Normal"/>
+        <w:widowControl/>
+        <w:bidi w:val="0"/>
+        <w:spacing w:before="0" w:after="0"/>
+        <w:jc w:val="start"/>
+        <w:rPr>
+          <w:rFonts w:ascii="Arial" w:hAnsi="Arial" w:cs="Arial"/>
+          <w:szCs w:val="24"/>
+        </w:rPr>
+      </w:pPr>
+      <w:r>
+        <w:rPr>
+          <w:rFonts w:eastAsia="Arial" w:cs="Arial" w:ascii="Arial" w:hAnsi="Arial"/>
+          <w:kern w:val="0"/>
+          <w:szCs w:val="24"/>
+          <w:lang w:val="en-GB" w:eastAsia="en-US" w:bidi="ar-SA"/>
+        </w:rPr>
+        <w:t>Finally, it can be seen that the process worked and the original record was updated:</w:t>
+      </w:r>
+    </w:p>
+    <w:p>
+      <w:pPr>
+        <w:pStyle w:val="Normal"/>
+        <w:widowControl/>
+        <w:bidi w:val="0"/>
+        <w:spacing w:before="0" w:after="0"/>
+        <w:jc w:val="start"/>
+        <w:rPr>
+          <w:rFonts w:ascii="Arial" w:hAnsi="Arial" w:cs="Arial"/>
+          <w:szCs w:val="24"/>
+        </w:rPr>
+      </w:pPr>
+      <w:r>
+        <w:rPr>
+          <w:rFonts w:eastAsia="Arial" w:ascii="Arial" w:hAnsi="Arial"/>
+          <w:kern w:val="0"/>
+          <w:lang w:val="en-GB" w:eastAsia="en-US" w:bidi="ar-SA"/>
+        </w:rPr>
+        <w:drawing>
+          <wp:anchor behindDoc="0" distT="0" distB="0" distL="0" distR="0" simplePos="0" locked="0" layoutInCell="0" allowOverlap="1" relativeHeight="4">
+            <wp:simplePos x="0" y="0"/>
+            <wp:positionH relativeFrom="column">
+              <wp:posOffset>28575</wp:posOffset>
+            </wp:positionH>
+            <wp:positionV relativeFrom="paragraph">
+              <wp:posOffset>100330</wp:posOffset>
+            </wp:positionV>
+            <wp:extent cx="2870200" cy="946150"/>
+            <wp:effectExtent l="0" t="0" r="0" b="0"/>
+            <wp:wrapTopAndBottom/>
+            <wp:docPr id="3" name="Image3" descr="" title=""/>
+            <wp:cNvGraphicFramePr>
+              <a:graphicFrameLocks xmlns:a="http://schemas.openxmlformats.org/drawingml/2006/main" noChangeAspect="1"/>
+            </wp:cNvGraphicFramePr>
+            <a:graphic xmlns:a="http://schemas.openxmlformats.org/drawingml/2006/main">
+              <a:graphicData uri="http://schemas.openxmlformats.org/drawingml/2006/picture">
+                <pic:pic xmlns:pic="http://schemas.openxmlformats.org/drawingml/2006/picture">
+                  <pic:nvPicPr>
+                    <pic:cNvPr id="3" name="Image3" descr="" title=""/>
+                    <pic:cNvPicPr>
+                      <a:picLocks noChangeAspect="1" noChangeArrowheads="1"/>
+                    </pic:cNvPicPr>
+                  </pic:nvPicPr>
+                  <pic:blipFill>
+                    <a:blip r:embed="rId20"/>
+                    <a:stretch>
+                      <a:fillRect/>
+                    </a:stretch>
+                  </pic:blipFill>
+                  <pic:spPr bwMode="auto">
+                    <a:xfrm>
+                      <a:off x="0" y="0"/>
+                      <a:ext cx="2870200" cy="946150"/>
+                    </a:xfrm>
+                    <a:prstGeom prst="rect">
+                      <a:avLst/>
+                    </a:prstGeom>
+                  </pic:spPr>
+                </pic:pic>
+              </a:graphicData>
+            </a:graphic>
+          </wp:anchor>
+        </w:drawing>
+      </w:r>
+    </w:p>
+    <w:p>
+      <w:pPr>
+        <w:pStyle w:val="Normal"/>
+        <w:widowControl/>
+        <w:bidi w:val="0"/>
+        <w:spacing w:before="0" w:after="0"/>
+        <w:jc w:val="start"/>
+        <w:rPr>
+          <w:rFonts w:ascii="Arial" w:hAnsi="Arial" w:cs="Arial"/>
+          <w:szCs w:val="24"/>
+        </w:rPr>
+      </w:pPr>
+      <w:r>
+        <w:rPr>
+          <w:rFonts w:eastAsia="Arial" w:cs="Arial" w:ascii="Arial" w:hAnsi="Arial"/>
+          <w:kern w:val="0"/>
+          <w:szCs w:val="24"/>
+          <w:lang w:val="en-GB" w:eastAsia="en-US" w:bidi="ar-SA"/>
+        </w:rPr>
+        <w:t xml:space="preserve">Once the Status column had been updated </w:t>
+      </w:r>
+      <w:r>
+        <w:rPr>
+          <w:rFonts w:eastAsia="Arial" w:cs="Arial" w:ascii="Arial" w:hAnsi="Arial"/>
+          <w:kern w:val="0"/>
+          <w:szCs w:val="24"/>
+          <w:lang w:val="en-GB" w:eastAsia="en-US" w:bidi="ar-SA"/>
+        </w:rPr>
+        <w:t>with the latest known values</w:t>
+      </w:r>
+      <w:r>
+        <w:rPr>
+          <w:rFonts w:eastAsia="Arial" w:cs="Arial" w:ascii="Arial" w:hAnsi="Arial"/>
+          <w:kern w:val="0"/>
+          <w:szCs w:val="24"/>
+          <w:lang w:val="en-GB" w:eastAsia="en-US" w:bidi="ar-SA"/>
+        </w:rPr>
+        <w:t>, working out whether an object is orbiting still is a case of comparing against a list of statuses:</w:t>
+      </w:r>
+    </w:p>
+    <w:p>
+      <w:pPr>
+        <w:pStyle w:val="Normal"/>
+        <w:widowControl/>
+        <w:bidi w:val="0"/>
+        <w:spacing w:before="0" w:after="0"/>
+        <w:jc w:val="start"/>
+        <w:rPr>
+          <w:rFonts w:ascii="Arial" w:hAnsi="Arial" w:cs="Arial"/>
+          <w:szCs w:val="24"/>
+        </w:rPr>
+      </w:pPr>
+      <w:r>
+        <w:rPr>
+          <w:rFonts w:eastAsia="Arial" w:ascii="Arial" w:hAnsi="Arial"/>
+          <w:kern w:val="0"/>
+          <w:lang w:val="en-GB" w:eastAsia="en-US" w:bidi="ar-SA"/>
+        </w:rPr>
+      </w:r>
+    </w:p>
+    <w:tbl>
+      <w:tblPr>
+        <w:tblW w:w="7648" w:type="dxa"/>
+        <w:jc w:val="start"/>
+        <w:tblInd w:w="-5" w:type="dxa"/>
+        <w:tblLayout w:type="fixed"/>
+        <w:tblCellMar>
+          <w:top w:w="55" w:type="dxa"/>
+          <w:start w:w="55" w:type="dxa"/>
+          <w:bottom w:w="55" w:type="dxa"/>
+          <w:end w:w="55" w:type="dxa"/>
+        </w:tblCellMar>
+      </w:tblPr>
+      <w:tblGrid>
+        <w:gridCol w:w="1678"/>
+        <w:gridCol w:w="5970"/>
+      </w:tblGrid>
+      <w:tr>
+        <w:trPr/>
+        <w:tc>
+          <w:tcPr>
+            <w:tcW w:w="1678" w:type="dxa"/>
+            <w:tcBorders>
+              <w:top w:val="single" w:sz="4" w:space="0" w:color="000000"/>
+              <w:start w:val="single" w:sz="4" w:space="0" w:color="000000"/>
+              <w:bottom w:val="single" w:sz="4" w:space="0" w:color="000000"/>
+            </w:tcBorders>
+          </w:tcPr>
+          <w:p>
+            <w:pPr>
+              <w:pStyle w:val="TableContents"/>
+              <w:bidi w:val="0"/>
+              <w:jc w:val="start"/>
+              <w:rPr>
+                <w:rFonts w:ascii="Arial" w:hAnsi="Arial" w:eastAsia="Arial"/>
+              </w:rPr>
+            </w:pPr>
+            <w:r>
+              <w:rPr>
+                <w:rFonts w:eastAsia="Arial" w:ascii="Arial" w:hAnsi="Arial"/>
+              </w:rPr>
+              <w:t>In orbit</w:t>
+            </w:r>
+          </w:p>
+        </w:tc>
+        <w:tc>
+          <w:tcPr>
+            <w:tcW w:w="5970" w:type="dxa"/>
+            <w:tcBorders>
+              <w:top w:val="single" w:sz="4" w:space="0" w:color="000000"/>
+              <w:start w:val="single" w:sz="4" w:space="0" w:color="000000"/>
+              <w:bottom w:val="single" w:sz="4" w:space="0" w:color="000000"/>
+              <w:end w:val="single" w:sz="4" w:space="0" w:color="000000"/>
+            </w:tcBorders>
+          </w:tcPr>
+          <w:p>
+            <w:pPr>
+              <w:pStyle w:val="TableContents"/>
+              <w:bidi w:val="0"/>
+              <w:jc w:val="start"/>
+              <w:rPr>
+                <w:rFonts w:ascii="Arial" w:hAnsi="Arial" w:eastAsia="Arial"/>
+              </w:rPr>
+            </w:pPr>
+            <w:r>
+              <w:rPr>
+                <w:rFonts w:eastAsia="Arial" w:ascii="Arial" w:hAnsi="Arial"/>
+              </w:rPr>
+              <w:t>In Orbit, Attached in orbit, Docked</w:t>
+            </w:r>
+          </w:p>
+        </w:tc>
+      </w:tr>
+      <w:tr>
+        <w:trPr/>
+        <w:tc>
+          <w:tcPr>
+            <w:tcW w:w="1678" w:type="dxa"/>
+            <w:tcBorders>
+              <w:start w:val="single" w:sz="4" w:space="0" w:color="000000"/>
+              <w:bottom w:val="single" w:sz="4" w:space="0" w:color="000000"/>
+            </w:tcBorders>
+          </w:tcPr>
+          <w:p>
+            <w:pPr>
+              <w:pStyle w:val="TableContents"/>
+              <w:bidi w:val="0"/>
+              <w:jc w:val="start"/>
+              <w:rPr>
+                <w:rFonts w:ascii="Arial" w:hAnsi="Arial" w:eastAsia="Arial"/>
+              </w:rPr>
+            </w:pPr>
+            <w:r>
+              <w:rPr>
+                <w:rFonts w:eastAsia="Arial" w:ascii="Arial" w:hAnsi="Arial"/>
+              </w:rPr>
+              <w:t>Not in orbit</w:t>
+            </w:r>
+          </w:p>
+        </w:tc>
+        <w:tc>
+          <w:tcPr>
+            <w:tcW w:w="5970" w:type="dxa"/>
+            <w:tcBorders>
+              <w:start w:val="single" w:sz="4" w:space="0" w:color="000000"/>
+              <w:bottom w:val="single" w:sz="4" w:space="0" w:color="000000"/>
+              <w:end w:val="single" w:sz="4" w:space="0" w:color="000000"/>
+            </w:tcBorders>
+          </w:tcPr>
+          <w:p>
+            <w:pPr>
+              <w:pStyle w:val="TableContents"/>
+              <w:bidi w:val="0"/>
+              <w:jc w:val="start"/>
+              <w:rPr>
+                <w:rFonts w:ascii="Arial" w:hAnsi="Arial" w:eastAsia="Arial"/>
+              </w:rPr>
+            </w:pPr>
+            <w:r>
+              <w:rPr>
+                <w:rFonts w:eastAsia="Arial" w:ascii="Arial" w:hAnsi="Arial"/>
+              </w:rPr>
+              <w:t>Reentered, Landed, Deorbited, Reentered attached, Reentered inside, Landed attached, Landed inside</w:t>
+            </w:r>
+          </w:p>
+        </w:tc>
+      </w:tr>
+    </w:tbl>
+    <w:p>
+      <w:pPr>
+        <w:pStyle w:val="Normal"/>
+        <w:widowControl/>
+        <w:bidi w:val="0"/>
+        <w:spacing w:before="0" w:after="0"/>
+        <w:jc w:val="start"/>
+        <w:rPr>
+          <w:rFonts w:ascii="Arial" w:hAnsi="Arial" w:cs="Arial"/>
+          <w:szCs w:val="24"/>
+        </w:rPr>
+      </w:pPr>
+      <w:r>
+        <w:rPr>
+          <w:rFonts w:eastAsia="Arial" w:ascii="Arial" w:hAnsi="Arial"/>
+          <w:kern w:val="0"/>
+          <w:lang w:val="en-GB" w:eastAsia="en-US" w:bidi="ar-SA"/>
+        </w:rPr>
+      </w:r>
+    </w:p>
+    <w:p>
+      <w:pPr>
+        <w:pStyle w:val="Normal"/>
+        <w:widowControl/>
+        <w:bidi w:val="0"/>
+        <w:spacing w:before="0" w:after="0"/>
+        <w:jc w:val="start"/>
+        <w:rPr>
+          <w:rFonts w:ascii="Arial" w:hAnsi="Arial" w:cs="Arial"/>
+          <w:szCs w:val="24"/>
+        </w:rPr>
+      </w:pPr>
+      <w:r>
+        <w:rPr>
+          <w:rFonts w:eastAsia="Arial" w:cs="Arial" w:ascii="Arial" w:hAnsi="Arial"/>
+          <w:kern w:val="0"/>
+          <w:szCs w:val="24"/>
+          <w:lang w:val="en-GB" w:eastAsia="en-US" w:bidi="ar-SA"/>
+        </w:rPr>
+        <w:t xml:space="preserve">If present, a Decay Date can be use to indicate “not in orbit” where the status is not in either of these definitive lists. </w:t>
+      </w:r>
+      <w:r>
+        <w:rPr>
+          <w:rFonts w:eastAsia="Arial" w:cs="Arial" w:ascii="Arial" w:hAnsi="Arial"/>
+          <w:kern w:val="0"/>
+          <w:szCs w:val="24"/>
+          <w:lang w:val="en-GB" w:eastAsia="en-US" w:bidi="ar-SA"/>
+        </w:rPr>
+        <w:t>As expected, the previous example object is shown as no longer in orbit:</w:t>
+      </w:r>
+    </w:p>
+    <w:p>
+      <w:pPr>
+        <w:pStyle w:val="Normal"/>
+        <w:widowControl/>
+        <w:bidi w:val="0"/>
+        <w:spacing w:before="0" w:after="0"/>
+        <w:jc w:val="start"/>
+        <w:rPr>
+          <w:rFonts w:ascii="Arial" w:hAnsi="Arial" w:cs="Arial"/>
+          <w:szCs w:val="24"/>
+        </w:rPr>
+      </w:pPr>
+      <w:r>
+        <w:rPr>
+          <w:rFonts w:eastAsia="Arial" w:ascii="Arial" w:hAnsi="Arial"/>
+          <w:kern w:val="0"/>
+          <w:lang w:val="en-GB" w:eastAsia="en-US" w:bidi="ar-SA"/>
+        </w:rPr>
+        <w:drawing>
+          <wp:anchor behindDoc="0" distT="0" distB="0" distL="0" distR="0" simplePos="0" locked="0" layoutInCell="0" allowOverlap="1" relativeHeight="5">
+            <wp:simplePos x="0" y="0"/>
+            <wp:positionH relativeFrom="column">
+              <wp:posOffset>36830</wp:posOffset>
+            </wp:positionH>
+            <wp:positionV relativeFrom="paragraph">
+              <wp:posOffset>144145</wp:posOffset>
+            </wp:positionV>
+            <wp:extent cx="2839085" cy="912495"/>
+            <wp:effectExtent l="0" t="0" r="0" b="0"/>
+            <wp:wrapTopAndBottom/>
+            <wp:docPr id="4" name="Image4" descr="" title=""/>
+            <wp:cNvGraphicFramePr>
+              <a:graphicFrameLocks xmlns:a="http://schemas.openxmlformats.org/drawingml/2006/main" noChangeAspect="1"/>
+            </wp:cNvGraphicFramePr>
+            <a:graphic xmlns:a="http://schemas.openxmlformats.org/drawingml/2006/main">
+              <a:graphicData uri="http://schemas.openxmlformats.org/drawingml/2006/picture">
+                <pic:pic xmlns:pic="http://schemas.openxmlformats.org/drawingml/2006/picture">
+                  <pic:nvPicPr>
+                    <pic:cNvPr id="4" name="Image4" descr="" title=""/>
+                    <pic:cNvPicPr>
+                      <a:picLocks noChangeAspect="1" noChangeArrowheads="1"/>
+                    </pic:cNvPicPr>
+                  </pic:nvPicPr>
+                  <pic:blipFill>
+                    <a:blip r:embed="rId21"/>
+                    <a:stretch>
+                      <a:fillRect/>
+                    </a:stretch>
+                  </pic:blipFill>
+                  <pic:spPr bwMode="auto">
+                    <a:xfrm>
+                      <a:off x="0" y="0"/>
+                      <a:ext cx="2839085" cy="912495"/>
+                    </a:xfrm>
+                    <a:prstGeom prst="rect">
+                      <a:avLst/>
+                    </a:prstGeom>
+                  </pic:spPr>
+                </pic:pic>
+              </a:graphicData>
+            </a:graphic>
+          </wp:anchor>
+        </w:drawing>
+      </w:r>
+    </w:p>
+    <w:p>
+      <w:pPr>
+        <w:pStyle w:val="Normal"/>
+        <w:widowControl/>
+        <w:bidi w:val="0"/>
+        <w:spacing w:before="0" w:after="0"/>
+        <w:jc w:val="start"/>
+        <w:rPr>
+          <w:rFonts w:ascii="Arial" w:hAnsi="Arial" w:cs="Arial"/>
+          <w:szCs w:val="24"/>
+        </w:rPr>
+      </w:pPr>
+      <w:r>
+        <w:rPr>
+          <w:rFonts w:eastAsia="Arial" w:ascii="Arial" w:hAnsi="Arial"/>
+          <w:kern w:val="0"/>
+          <w:lang w:val="en-GB" w:eastAsia="en-US" w:bidi="ar-SA"/>
+        </w:rPr>
+      </w:r>
+    </w:p>
+    <w:p>
+      <w:pPr>
+        <w:pStyle w:val="Normal"/>
+        <w:widowControl/>
+        <w:bidi w:val="0"/>
+        <w:spacing w:before="0" w:after="0"/>
+        <w:jc w:val="start"/>
+        <w:rPr>
+          <w:rFonts w:ascii="Arial" w:hAnsi="Arial" w:cs="Arial"/>
+          <w:szCs w:val="24"/>
+        </w:rPr>
+      </w:pPr>
+      <w:r>
+        <w:rPr>
+          <w:rFonts w:eastAsia="Arial" w:ascii="Arial" w:hAnsi="Arial"/>
+          <w:kern w:val="0"/>
+          <w:lang w:val="en-GB" w:eastAsia="en-US" w:bidi="ar-SA"/>
+        </w:rPr>
+      </w:r>
+    </w:p>
+    <w:p>
+      <w:pPr>
+        <w:pStyle w:val="Normal"/>
+        <w:widowControl/>
+        <w:bidi w:val="0"/>
+        <w:spacing w:before="0" w:after="0"/>
+        <w:jc w:val="start"/>
+        <w:rPr>
+          <w:rFonts w:ascii="Arial" w:hAnsi="Arial" w:cs="Arial"/>
+          <w:szCs w:val="24"/>
+        </w:rPr>
+      </w:pPr>
+      <w:r>
+        <w:rPr>
+          <w:rFonts w:eastAsia="Arial" w:cs="Arial" w:ascii="Arial" w:hAnsi="Arial"/>
+          <w:b/>
+          <w:bCs/>
+          <w:kern w:val="0"/>
+          <w:szCs w:val="24"/>
+          <w:lang w:val="en-GB" w:eastAsia="en-US" w:bidi="ar-SA"/>
+        </w:rPr>
+        <w:t>Status Codes</w:t>
+      </w:r>
+    </w:p>
+    <w:p>
+      <w:pPr>
+        <w:pStyle w:val="Normal"/>
+        <w:widowControl/>
+        <w:bidi w:val="0"/>
+        <w:spacing w:before="0" w:after="0"/>
+        <w:jc w:val="start"/>
+        <w:rPr>
+          <w:rFonts w:ascii="Arial" w:hAnsi="Arial" w:cs="Arial"/>
+          <w:szCs w:val="24"/>
+        </w:rPr>
+      </w:pPr>
+      <w:r>
+        <w:rPr>
+          <w:rFonts w:eastAsia="Arial" w:cs="Arial" w:ascii="Arial" w:hAnsi="Arial"/>
+          <w:kern w:val="0"/>
+          <w:szCs w:val="24"/>
+          <w:lang w:val="en-GB" w:eastAsia="en-US" w:bidi="ar-SA"/>
+        </w:rPr>
+        <w:t>The downloaded datasets include columns that use codes to indicate the state, type, class or category of the object. These letter codes are not readable without interpretation using the provided dataset documentation (cite** McDowell xxx).</w:t>
+      </w:r>
+    </w:p>
+    <w:p>
+      <w:pPr>
+        <w:pStyle w:val="Normal"/>
+        <w:widowControl/>
+        <w:bidi w:val="0"/>
+        <w:spacing w:before="0" w:after="0"/>
+        <w:jc w:val="start"/>
+        <w:rPr>
+          <w:rFonts w:ascii="Arial" w:hAnsi="Arial" w:cs="Arial"/>
+          <w:szCs w:val="24"/>
+        </w:rPr>
+      </w:pPr>
+      <w:r>
+        <w:rPr>
+          <w:rFonts w:eastAsia="Arial" w:ascii="Arial" w:hAnsi="Arial"/>
+          <w:kern w:val="0"/>
+          <w:lang w:val="en-GB" w:eastAsia="en-US" w:bidi="ar-SA"/>
+        </w:rPr>
+      </w:r>
+    </w:p>
+    <w:p>
+      <w:pPr>
+        <w:pStyle w:val="Normal"/>
+        <w:widowControl/>
+        <w:bidi w:val="0"/>
+        <w:spacing w:before="0" w:after="0"/>
+        <w:jc w:val="start"/>
+        <w:rPr>
+          <w:rFonts w:ascii="Arial" w:hAnsi="Arial" w:cs="Arial"/>
+          <w:szCs w:val="24"/>
+        </w:rPr>
+      </w:pPr>
+      <w:r>
+        <w:rPr>
+          <w:rFonts w:eastAsia="Arial" w:cs="Arial" w:ascii="Arial" w:hAnsi="Arial"/>
+          <w:kern w:val="0"/>
+          <w:szCs w:val="24"/>
+          <w:lang w:val="en-GB" w:eastAsia="en-US" w:bidi="ar-SA"/>
+        </w:rPr>
+        <w:t>To make my working dataset stand alone, I created JSON mappings between the letter codes and descriptive text labels. I applied these to the appropriate column, and removed the letter coded columns.</w:t>
+      </w:r>
+    </w:p>
+    <w:p>
+      <w:pPr>
+        <w:pStyle w:val="Normal"/>
+        <w:widowControl/>
+        <w:bidi w:val="0"/>
+        <w:spacing w:before="0" w:after="0"/>
+        <w:jc w:val="start"/>
+        <w:rPr>
+          <w:rFonts w:ascii="Arial" w:hAnsi="Arial" w:cs="Arial"/>
+          <w:szCs w:val="24"/>
+        </w:rPr>
+      </w:pPr>
+      <w:r>
+        <w:rPr>
+          <w:rFonts w:eastAsia="Arial" w:ascii="Arial" w:hAnsi="Arial"/>
+          <w:kern w:val="0"/>
+          <w:lang w:val="en-GB" w:eastAsia="en-US" w:bidi="ar-SA"/>
+        </w:rPr>
+      </w:r>
+    </w:p>
+    <w:p>
+      <w:pPr>
+        <w:pStyle w:val="Normal"/>
+        <w:widowControl/>
+        <w:bidi w:val="0"/>
+        <w:spacing w:before="0" w:after="0"/>
+        <w:jc w:val="start"/>
+        <w:rPr>
+          <w:rFonts w:ascii="Arial" w:hAnsi="Arial" w:cs="Arial"/>
+          <w:szCs w:val="24"/>
+        </w:rPr>
+      </w:pPr>
+      <w:r>
+        <w:rPr>
+          <w:rFonts w:eastAsia="Arial" w:cs="Arial" w:ascii="Droid Sans Mono;monospace;monospace" w:hAnsi="Droid Sans Mono;monospace;monospace"/>
+          <w:b w:val="false"/>
+          <w:color w:val="9CDCFE"/>
+          <w:kern w:val="0"/>
+          <w:sz w:val="21"/>
+          <w:szCs w:val="24"/>
+          <w:shd w:fill="1F1F1F" w:val="clear"/>
+          <w:lang w:val="en-GB" w:eastAsia="en-US" w:bidi="ar-SA"/>
+        </w:rPr>
+        <w:t>type_json</w:t>
+      </w:r>
+      <w:r>
+        <w:rPr>
+          <w:rFonts w:eastAsia="Arial" w:cs="Arial" w:ascii="Droid Sans Mono;monospace;monospace" w:hAnsi="Droid Sans Mono;monospace;monospace"/>
+          <w:b w:val="false"/>
+          <w:color w:val="CCCCCC"/>
+          <w:kern w:val="0"/>
+          <w:sz w:val="21"/>
+          <w:szCs w:val="24"/>
+          <w:shd w:fill="1F1F1F" w:val="clear"/>
+          <w:lang w:val="en-GB" w:eastAsia="en-US" w:bidi="ar-SA"/>
+        </w:rPr>
+        <w:t xml:space="preserve"> </w:t>
+      </w:r>
+      <w:r>
+        <w:rPr>
+          <w:rFonts w:eastAsia="Arial" w:cs="Arial" w:ascii="Droid Sans Mono;monospace;monospace" w:hAnsi="Droid Sans Mono;monospace;monospace"/>
+          <w:b w:val="false"/>
+          <w:color w:val="D4D4D4"/>
+          <w:kern w:val="0"/>
+          <w:sz w:val="21"/>
+          <w:szCs w:val="24"/>
+          <w:shd w:fill="1F1F1F" w:val="clear"/>
+          <w:lang w:val="en-GB" w:eastAsia="en-US" w:bidi="ar-SA"/>
+        </w:rPr>
+        <w:t>=</w:t>
+      </w:r>
+      <w:r>
+        <w:rPr>
+          <w:rFonts w:eastAsia="Arial" w:cs="Arial" w:ascii="Droid Sans Mono;monospace;monospace" w:hAnsi="Droid Sans Mono;monospace;monospace"/>
+          <w:b w:val="false"/>
+          <w:color w:val="CCCCCC"/>
+          <w:kern w:val="0"/>
+          <w:sz w:val="21"/>
+          <w:szCs w:val="24"/>
+          <w:shd w:fill="1F1F1F" w:val="clear"/>
+          <w:lang w:val="en-GB" w:eastAsia="en-US" w:bidi="ar-SA"/>
+        </w:rPr>
+        <w:t xml:space="preserve"> {</w:t>
+      </w:r>
+    </w:p>
+    <w:p>
+      <w:pPr>
+        <w:pStyle w:val="Normal"/>
+        <w:bidi w:val="0"/>
+        <w:spacing w:lineRule="atLeast" w:line="285"/>
+        <w:ind w:hanging="0" w:start="0" w:end="0"/>
+        <w:jc w:val="start"/>
+        <w:rPr>
+          <w:rFonts w:ascii="Droid Sans Mono;monospace;monospace" w:hAnsi="Droid Sans Mono;monospace;monospace"/>
+          <w:b w:val="false"/>
+          <w:color w:val="CCCCCC"/>
+          <w:sz w:val="21"/>
+          <w:shd w:fill="1F1F1F" w:val="clear"/>
+        </w:rPr>
+      </w:pPr>
+      <w:r>
+        <w:rPr>
+          <w:rFonts w:ascii="Droid Sans Mono;monospace;monospace" w:hAnsi="Droid Sans Mono;monospace;monospace"/>
+          <w:b w:val="false"/>
+          <w:color w:val="CE9178"/>
+          <w:sz w:val="21"/>
+          <w:shd w:fill="1F1F1F" w:val="clear"/>
+        </w:rPr>
+        <w:t>"P"</w:t>
+      </w:r>
+      <w:r>
+        <w:rPr>
+          <w:rFonts w:ascii="Droid Sans Mono;monospace;monospace" w:hAnsi="Droid Sans Mono;monospace;monospace"/>
+          <w:b w:val="false"/>
+          <w:color w:val="CCCCCC"/>
+          <w:sz w:val="21"/>
+          <w:shd w:fill="1F1F1F" w:val="clear"/>
+        </w:rPr>
+        <w:t xml:space="preserve">: </w:t>
+      </w:r>
+      <w:r>
+        <w:rPr>
+          <w:rFonts w:ascii="Droid Sans Mono;monospace;monospace" w:hAnsi="Droid Sans Mono;monospace;monospace"/>
+          <w:b w:val="false"/>
+          <w:color w:val="CE9178"/>
+          <w:sz w:val="21"/>
+          <w:shd w:fill="1F1F1F" w:val="clear"/>
+        </w:rPr>
+        <w:t>"Payload"</w:t>
+      </w:r>
+      <w:r>
+        <w:rPr>
+          <w:rFonts w:ascii="Droid Sans Mono;monospace;monospace" w:hAnsi="Droid Sans Mono;monospace;monospace"/>
+          <w:b w:val="false"/>
+          <w:color w:val="CCCCCC"/>
+          <w:sz w:val="21"/>
+          <w:shd w:fill="1F1F1F" w:val="clear"/>
+        </w:rPr>
+        <w:t>,</w:t>
+      </w:r>
+    </w:p>
+    <w:p>
+      <w:pPr>
+        <w:pStyle w:val="Normal"/>
+        <w:bidi w:val="0"/>
+        <w:spacing w:lineRule="atLeast" w:line="285"/>
+        <w:ind w:hanging="0" w:start="0" w:end="0"/>
+        <w:jc w:val="start"/>
+        <w:rPr>
+          <w:rFonts w:ascii="Droid Sans Mono;monospace;monospace" w:hAnsi="Droid Sans Mono;monospace;monospace"/>
+          <w:b w:val="false"/>
+          <w:color w:val="CCCCCC"/>
+          <w:sz w:val="21"/>
+          <w:shd w:fill="1F1F1F" w:val="clear"/>
+        </w:rPr>
+      </w:pPr>
+      <w:r>
+        <w:rPr>
+          <w:rFonts w:ascii="Droid Sans Mono;monospace;monospace" w:hAnsi="Droid Sans Mono;monospace;monospace"/>
+          <w:b w:val="false"/>
+          <w:color w:val="CE9178"/>
+          <w:sz w:val="21"/>
+          <w:shd w:fill="1F1F1F" w:val="clear"/>
+        </w:rPr>
+        <w:t>"C"</w:t>
+      </w:r>
+      <w:r>
+        <w:rPr>
+          <w:rFonts w:ascii="Droid Sans Mono;monospace;monospace" w:hAnsi="Droid Sans Mono;monospace;monospace"/>
+          <w:b w:val="false"/>
+          <w:color w:val="CCCCCC"/>
+          <w:sz w:val="21"/>
+          <w:shd w:fill="1F1F1F" w:val="clear"/>
+        </w:rPr>
+        <w:t xml:space="preserve">: </w:t>
+      </w:r>
+      <w:r>
+        <w:rPr>
+          <w:rFonts w:ascii="Droid Sans Mono;monospace;monospace" w:hAnsi="Droid Sans Mono;monospace;monospace"/>
+          <w:b w:val="false"/>
+          <w:color w:val="CE9178"/>
+          <w:sz w:val="21"/>
+          <w:shd w:fill="1F1F1F" w:val="clear"/>
+        </w:rPr>
+        <w:t>"Component"</w:t>
+      </w:r>
+      <w:r>
+        <w:rPr>
+          <w:rFonts w:ascii="Droid Sans Mono;monospace;monospace" w:hAnsi="Droid Sans Mono;monospace;monospace"/>
+          <w:b w:val="false"/>
+          <w:color w:val="CCCCCC"/>
+          <w:sz w:val="21"/>
+          <w:shd w:fill="1F1F1F" w:val="clear"/>
+        </w:rPr>
+        <w:t>,</w:t>
+      </w:r>
+    </w:p>
+    <w:p>
+      <w:pPr>
+        <w:pStyle w:val="Normal"/>
+        <w:bidi w:val="0"/>
+        <w:spacing w:lineRule="atLeast" w:line="285"/>
+        <w:ind w:hanging="0" w:start="0" w:end="0"/>
+        <w:jc w:val="start"/>
+        <w:rPr>
+          <w:rFonts w:ascii="Droid Sans Mono;monospace;monospace" w:hAnsi="Droid Sans Mono;monospace;monospace"/>
+          <w:b w:val="false"/>
+          <w:color w:val="CCCCCC"/>
+          <w:sz w:val="21"/>
+          <w:shd w:fill="1F1F1F" w:val="clear"/>
+        </w:rPr>
+      </w:pPr>
+      <w:r>
+        <w:rPr>
+          <w:rFonts w:ascii="Droid Sans Mono;monospace;monospace" w:hAnsi="Droid Sans Mono;monospace;monospace"/>
+          <w:b w:val="false"/>
+          <w:color w:val="CE9178"/>
+          <w:sz w:val="21"/>
+          <w:shd w:fill="1F1F1F" w:val="clear"/>
+        </w:rPr>
+        <w:t>"R"</w:t>
+      </w:r>
+      <w:r>
+        <w:rPr>
+          <w:rFonts w:ascii="Droid Sans Mono;monospace;monospace" w:hAnsi="Droid Sans Mono;monospace;monospace"/>
+          <w:b w:val="false"/>
+          <w:color w:val="CCCCCC"/>
+          <w:sz w:val="21"/>
+          <w:shd w:fill="1F1F1F" w:val="clear"/>
+        </w:rPr>
+        <w:t xml:space="preserve">: </w:t>
+      </w:r>
+      <w:r>
+        <w:rPr>
+          <w:rFonts w:ascii="Droid Sans Mono;monospace;monospace" w:hAnsi="Droid Sans Mono;monospace;monospace"/>
+          <w:b w:val="false"/>
+          <w:color w:val="CE9178"/>
+          <w:sz w:val="21"/>
+          <w:shd w:fill="1F1F1F" w:val="clear"/>
+        </w:rPr>
+        <w:t>"Rocket Body"</w:t>
+      </w:r>
+      <w:r>
+        <w:rPr>
+          <w:rFonts w:ascii="Droid Sans Mono;monospace;monospace" w:hAnsi="Droid Sans Mono;monospace;monospace"/>
+          <w:b w:val="false"/>
+          <w:color w:val="CCCCCC"/>
+          <w:sz w:val="21"/>
+          <w:shd w:fill="1F1F1F" w:val="clear"/>
+        </w:rPr>
+        <w:t>,</w:t>
+      </w:r>
+    </w:p>
+    <w:p>
+      <w:pPr>
+        <w:pStyle w:val="Normal"/>
+        <w:bidi w:val="0"/>
+        <w:spacing w:lineRule="atLeast" w:line="285"/>
+        <w:ind w:hanging="0" w:start="0" w:end="0"/>
+        <w:jc w:val="start"/>
+        <w:rPr>
+          <w:rFonts w:ascii="Droid Sans Mono;monospace;monospace" w:hAnsi="Droid Sans Mono;monospace;monospace"/>
+          <w:b w:val="false"/>
+          <w:color w:val="CCCCCC"/>
+          <w:sz w:val="21"/>
+          <w:shd w:fill="1F1F1F" w:val="clear"/>
+        </w:rPr>
+      </w:pPr>
+      <w:r>
+        <w:rPr>
+          <w:rFonts w:ascii="Droid Sans Mono;monospace;monospace" w:hAnsi="Droid Sans Mono;monospace;monospace"/>
+          <w:b w:val="false"/>
+          <w:color w:val="CE9178"/>
+          <w:sz w:val="21"/>
+          <w:shd w:fill="1F1F1F" w:val="clear"/>
+        </w:rPr>
+        <w:t>"D"</w:t>
+      </w:r>
+      <w:r>
+        <w:rPr>
+          <w:rFonts w:ascii="Droid Sans Mono;monospace;monospace" w:hAnsi="Droid Sans Mono;monospace;monospace"/>
+          <w:b w:val="false"/>
+          <w:color w:val="CCCCCC"/>
+          <w:sz w:val="21"/>
+          <w:shd w:fill="1F1F1F" w:val="clear"/>
+        </w:rPr>
+        <w:t xml:space="preserve">: </w:t>
+      </w:r>
+      <w:r>
+        <w:rPr>
+          <w:rFonts w:ascii="Droid Sans Mono;monospace;monospace" w:hAnsi="Droid Sans Mono;monospace;monospace"/>
+          <w:b w:val="false"/>
+          <w:color w:val="CE9178"/>
+          <w:sz w:val="21"/>
+          <w:shd w:fill="1F1F1F" w:val="clear"/>
+        </w:rPr>
+        <w:t>"Debris"</w:t>
+      </w:r>
+      <w:r>
+        <w:rPr>
+          <w:rFonts w:ascii="Droid Sans Mono;monospace;monospace" w:hAnsi="Droid Sans Mono;monospace;monospace"/>
+          <w:b w:val="false"/>
+          <w:color w:val="CCCCCC"/>
+          <w:sz w:val="21"/>
+          <w:shd w:fill="1F1F1F" w:val="clear"/>
+        </w:rPr>
+        <w:t>,</w:t>
+      </w:r>
+    </w:p>
+    <w:p>
+      <w:pPr>
+        <w:pStyle w:val="Normal"/>
+        <w:bidi w:val="0"/>
+        <w:spacing w:lineRule="atLeast" w:line="285"/>
+        <w:ind w:hanging="0" w:start="0" w:end="0"/>
+        <w:jc w:val="start"/>
+        <w:rPr>
+          <w:rFonts w:ascii="Droid Sans Mono;monospace;monospace" w:hAnsi="Droid Sans Mono;monospace;monospace"/>
+          <w:b w:val="false"/>
+          <w:color w:val="CCCCCC"/>
+          <w:sz w:val="21"/>
+          <w:shd w:fill="1F1F1F" w:val="clear"/>
+        </w:rPr>
+      </w:pPr>
+      <w:r>
+        <w:rPr>
+          <w:rFonts w:ascii="Droid Sans Mono;monospace;monospace" w:hAnsi="Droid Sans Mono;monospace;monospace"/>
+          <w:b w:val="false"/>
+          <w:color w:val="CE9178"/>
+          <w:sz w:val="21"/>
+          <w:shd w:fill="1F1F1F" w:val="clear"/>
+        </w:rPr>
+        <w:t>"S"</w:t>
+      </w:r>
+      <w:r>
+        <w:rPr>
+          <w:rFonts w:ascii="Droid Sans Mono;monospace;monospace" w:hAnsi="Droid Sans Mono;monospace;monospace"/>
+          <w:b w:val="false"/>
+          <w:color w:val="CCCCCC"/>
+          <w:sz w:val="21"/>
+          <w:shd w:fill="1F1F1F" w:val="clear"/>
+        </w:rPr>
+        <w:t xml:space="preserve">: </w:t>
+      </w:r>
+      <w:r>
+        <w:rPr>
+          <w:rFonts w:ascii="Droid Sans Mono;monospace;monospace" w:hAnsi="Droid Sans Mono;monospace;monospace"/>
+          <w:b w:val="false"/>
+          <w:color w:val="CE9178"/>
+          <w:sz w:val="21"/>
+          <w:shd w:fill="1F1F1F" w:val="clear"/>
+        </w:rPr>
+        <w:t>"Suborbital payload"</w:t>
+      </w:r>
+      <w:r>
+        <w:rPr>
+          <w:rFonts w:ascii="Droid Sans Mono;monospace;monospace" w:hAnsi="Droid Sans Mono;monospace;monospace"/>
+          <w:b w:val="false"/>
+          <w:color w:val="CCCCCC"/>
+          <w:sz w:val="21"/>
+          <w:shd w:fill="1F1F1F" w:val="clear"/>
+        </w:rPr>
+        <w:t>,</w:t>
+      </w:r>
+    </w:p>
+    <w:p>
+      <w:pPr>
+        <w:pStyle w:val="Normal"/>
+        <w:bidi w:val="0"/>
+        <w:spacing w:lineRule="atLeast" w:line="285"/>
+        <w:ind w:hanging="0" w:start="0" w:end="0"/>
+        <w:jc w:val="start"/>
+        <w:rPr>
+          <w:rFonts w:ascii="Droid Sans Mono;monospace;monospace" w:hAnsi="Droid Sans Mono;monospace;monospace"/>
+          <w:b w:val="false"/>
+          <w:color w:val="CCCCCC"/>
+          <w:sz w:val="21"/>
+          <w:shd w:fill="1F1F1F" w:val="clear"/>
+        </w:rPr>
+      </w:pPr>
+      <w:r>
+        <w:rPr>
+          <w:rFonts w:ascii="Droid Sans Mono;monospace;monospace" w:hAnsi="Droid Sans Mono;monospace;monospace"/>
+          <w:b w:val="false"/>
+          <w:color w:val="CE9178"/>
+          <w:sz w:val="21"/>
+          <w:shd w:fill="1F1F1F" w:val="clear"/>
+        </w:rPr>
+        <w:t>"X"</w:t>
+      </w:r>
+      <w:r>
+        <w:rPr>
+          <w:rFonts w:ascii="Droid Sans Mono;monospace;monospace" w:hAnsi="Droid Sans Mono;monospace;monospace"/>
+          <w:b w:val="false"/>
+          <w:color w:val="CCCCCC"/>
+          <w:sz w:val="21"/>
+          <w:shd w:fill="1F1F1F" w:val="clear"/>
+        </w:rPr>
+        <w:t xml:space="preserve">: </w:t>
+      </w:r>
+      <w:r>
+        <w:rPr>
+          <w:rFonts w:ascii="Droid Sans Mono;monospace;monospace" w:hAnsi="Droid Sans Mono;monospace;monospace"/>
+          <w:b w:val="false"/>
+          <w:color w:val="CE9178"/>
+          <w:sz w:val="21"/>
+          <w:shd w:fill="1F1F1F" w:val="clear"/>
+        </w:rPr>
+        <w:t>"Deleted Object"</w:t>
+      </w:r>
+      <w:r>
+        <w:rPr>
+          <w:rFonts w:ascii="Droid Sans Mono;monospace;monospace" w:hAnsi="Droid Sans Mono;monospace;monospace"/>
+          <w:b w:val="false"/>
+          <w:color w:val="CCCCCC"/>
+          <w:sz w:val="21"/>
+          <w:shd w:fill="1F1F1F" w:val="clear"/>
+        </w:rPr>
+        <w:t>,</w:t>
+      </w:r>
+    </w:p>
+    <w:p>
+      <w:pPr>
+        <w:pStyle w:val="Normal"/>
+        <w:bidi w:val="0"/>
+        <w:spacing w:lineRule="atLeast" w:line="285"/>
+        <w:ind w:hanging="0" w:start="0" w:end="0"/>
+        <w:jc w:val="start"/>
+        <w:rPr>
+          <w:rFonts w:ascii="Droid Sans Mono;monospace;monospace" w:hAnsi="Droid Sans Mono;monospace;monospace"/>
+          <w:b w:val="false"/>
+          <w:color w:val="CCCCCC"/>
+          <w:sz w:val="21"/>
+          <w:shd w:fill="1F1F1F" w:val="clear"/>
+        </w:rPr>
+      </w:pPr>
+      <w:r>
+        <w:rPr>
+          <w:rFonts w:ascii="Droid Sans Mono;monospace;monospace" w:hAnsi="Droid Sans Mono;monospace;monospace"/>
+          <w:b w:val="false"/>
+          <w:color w:val="CE9178"/>
+          <w:sz w:val="21"/>
+          <w:shd w:fill="1F1F1F" w:val="clear"/>
+        </w:rPr>
+        <w:t>"Z"</w:t>
+      </w:r>
+      <w:r>
+        <w:rPr>
+          <w:rFonts w:ascii="Droid Sans Mono;monospace;monospace" w:hAnsi="Droid Sans Mono;monospace;monospace"/>
+          <w:b w:val="false"/>
+          <w:color w:val="CCCCCC"/>
+          <w:sz w:val="21"/>
+          <w:shd w:fill="1F1F1F" w:val="clear"/>
+        </w:rPr>
+        <w:t xml:space="preserve">: </w:t>
+      </w:r>
+      <w:r>
+        <w:rPr>
+          <w:rFonts w:ascii="Droid Sans Mono;monospace;monospace" w:hAnsi="Droid Sans Mono;monospace;monospace"/>
+          <w:b w:val="false"/>
+          <w:color w:val="CE9178"/>
+          <w:sz w:val="21"/>
+          <w:shd w:fill="1F1F1F" w:val="clear"/>
+        </w:rPr>
+        <w:t>"Spurious Entry"</w:t>
+      </w:r>
+    </w:p>
+    <w:p>
+      <w:pPr>
+        <w:pStyle w:val="Normal"/>
+        <w:bidi w:val="0"/>
+        <w:spacing w:lineRule="atLeast" w:line="285"/>
+        <w:ind w:hanging="0" w:start="0" w:end="0"/>
+        <w:jc w:val="start"/>
+        <w:rPr>
+          <w:rFonts w:ascii="Droid Sans Mono;monospace;monospace" w:hAnsi="Droid Sans Mono;monospace;monospace"/>
+          <w:b w:val="false"/>
+          <w:color w:val="CCCCCC"/>
+          <w:sz w:val="21"/>
+          <w:shd w:fill="1F1F1F" w:val="clear"/>
+        </w:rPr>
+      </w:pPr>
+      <w:r>
+        <w:rPr>
+          <w:rFonts w:ascii="Droid Sans Mono;monospace;monospace" w:hAnsi="Droid Sans Mono;monospace;monospace"/>
+          <w:b w:val="false"/>
+          <w:color w:val="CCCCCC"/>
+          <w:sz w:val="21"/>
+          <w:shd w:fill="1F1F1F" w:val="clear"/>
+        </w:rPr>
+        <w:t>}</w:t>
+      </w:r>
+    </w:p>
+    <w:p>
+      <w:pPr>
+        <w:pStyle w:val="Normal"/>
+        <w:bidi w:val="0"/>
+        <w:spacing w:lineRule="atLeast" w:line="285"/>
+        <w:jc w:val="start"/>
+        <w:rPr>
+          <w:rFonts w:ascii="Droid Sans Mono;monospace;monospace" w:hAnsi="Droid Sans Mono;monospace;monospace"/>
+          <w:b w:val="false"/>
+          <w:color w:val="CCCCCC"/>
+          <w:sz w:val="21"/>
+          <w:shd w:fill="1F1F1F" w:val="clear"/>
+        </w:rPr>
+      </w:pPr>
+      <w:r>
+        <w:rPr>
+          <w:rFonts w:ascii="Droid Sans Mono;monospace;monospace" w:hAnsi="Droid Sans Mono;monospace;monospace"/>
+          <w:b w:val="false"/>
+          <w:color w:val="CCCCCC"/>
+          <w:sz w:val="21"/>
+          <w:shd w:fill="1F1F1F" w:val="clear"/>
+        </w:rPr>
+      </w:r>
+    </w:p>
+    <w:p>
+      <w:pPr>
+        <w:pStyle w:val="Normal"/>
+        <w:widowControl/>
+        <w:bidi w:val="0"/>
+        <w:spacing w:before="0" w:after="0"/>
+        <w:jc w:val="start"/>
+        <w:rPr>
+          <w:rFonts w:ascii="Arial" w:hAnsi="Arial" w:cs="Arial"/>
+          <w:szCs w:val="24"/>
+        </w:rPr>
+      </w:pPr>
+      <w:r>
+        <w:rPr>
+          <w:rFonts w:eastAsia="Arial" w:cs="Arial" w:ascii="Arial" w:hAnsi="Arial"/>
+          <w:kern w:val="0"/>
+          <w:szCs w:val="24"/>
+          <w:lang w:val="en-GB" w:eastAsia="en-US" w:bidi="ar-SA"/>
+        </w:rPr>
+        <w:t xml:space="preserve">The </w:t>
+      </w:r>
+      <w:r>
+        <w:rPr>
+          <w:rFonts w:eastAsia="Arial" w:cs="Arial" w:ascii="Arial" w:hAnsi="Arial"/>
+          <w:kern w:val="0"/>
+          <w:szCs w:val="24"/>
+          <w:lang w:val="en-GB" w:eastAsia="en-US" w:bidi="ar-SA"/>
+        </w:rPr>
+        <w:t xml:space="preserve">type field </w:t>
+      </w:r>
+      <w:r>
+        <w:rPr>
+          <w:rFonts w:eastAsia="Arial" w:cs="Arial" w:ascii="Arial" w:hAnsi="Arial"/>
+          <w:kern w:val="0"/>
+          <w:szCs w:val="24"/>
+          <w:lang w:val="en-GB" w:eastAsia="en-US" w:bidi="ar-SA"/>
+        </w:rPr>
+        <w:t>included “spurious” and “unknown” entries which were removed to cut down on the size of the data in memory. The category field included codes for both a primary and secondary category such as Scientific Studies and Astronomy; I split these into two columns for ease of processing.</w:t>
+      </w:r>
+    </w:p>
+    <w:p>
+      <w:pPr>
+        <w:pStyle w:val="Normal"/>
+        <w:widowControl/>
+        <w:bidi w:val="0"/>
+        <w:spacing w:before="0" w:after="0"/>
+        <w:jc w:val="start"/>
+        <w:rPr>
+          <w:rFonts w:ascii="Arial" w:hAnsi="Arial" w:cs="Arial"/>
+          <w:szCs w:val="24"/>
+        </w:rPr>
+      </w:pPr>
+      <w:r>
+        <w:rPr>
+          <w:rFonts w:eastAsia="Arial" w:ascii="Arial" w:hAnsi="Arial"/>
+          <w:kern w:val="0"/>
+          <w:lang w:val="en-GB" w:eastAsia="en-US" w:bidi="ar-SA"/>
+        </w:rPr>
+      </w:r>
+    </w:p>
+    <w:p>
+      <w:pPr>
+        <w:pStyle w:val="Normal"/>
+        <w:widowControl/>
+        <w:bidi w:val="0"/>
+        <w:spacing w:before="0" w:after="0"/>
+        <w:jc w:val="start"/>
+        <w:rPr>
+          <w:rFonts w:ascii="Arial" w:hAnsi="Arial" w:cs="Arial"/>
+          <w:szCs w:val="24"/>
+        </w:rPr>
+      </w:pPr>
+      <w:r>
+        <w:rPr>
+          <w:rFonts w:eastAsia="Arial" w:cs="Arial" w:ascii="Arial" w:hAnsi="Arial"/>
+          <w:b/>
+          <w:bCs/>
+          <w:kern w:val="0"/>
+          <w:szCs w:val="24"/>
+          <w:lang w:val="en-GB" w:eastAsia="en-US" w:bidi="ar-SA"/>
+        </w:rPr>
+        <w:t xml:space="preserve">Design principles and tools used to create the storyboard and infographics. </w:t>
+      </w:r>
+    </w:p>
+    <w:p>
+      <w:pPr>
+        <w:pStyle w:val="Normal"/>
+        <w:widowControl/>
+        <w:bidi w:val="0"/>
+        <w:spacing w:before="0" w:after="0"/>
+        <w:jc w:val="start"/>
+        <w:rPr>
+          <w:rFonts w:ascii="Arial" w:hAnsi="Arial" w:cs="Arial"/>
+          <w:szCs w:val="24"/>
+        </w:rPr>
+      </w:pPr>
+      <w:r>
+        <w:rPr>
+          <w:rFonts w:eastAsia="Arial" w:ascii="Arial" w:hAnsi="Arial"/>
+          <w:b/>
+          <w:bCs/>
+          <w:kern w:val="0"/>
+          <w:lang w:val="en-GB" w:eastAsia="en-US" w:bidi="ar-SA"/>
+        </w:rPr>
+      </w:r>
+    </w:p>
+    <w:p>
+      <w:pPr>
+        <w:pStyle w:val="Normal"/>
+        <w:widowControl/>
+        <w:bidi w:val="0"/>
+        <w:spacing w:before="0" w:after="0"/>
+        <w:jc w:val="start"/>
+        <w:rPr>
+          <w:rFonts w:ascii="Arial" w:hAnsi="Arial" w:cs="Arial"/>
+          <w:szCs w:val="24"/>
+        </w:rPr>
+      </w:pPr>
+      <w:r>
+        <w:rPr>
+          <w:rFonts w:eastAsia="Arial" w:ascii="Arial" w:hAnsi="Arial"/>
+          <w:kern w:val="0"/>
+          <w:lang w:val="en-GB" w:eastAsia="en-US" w:bidi="ar-SA"/>
+        </w:rPr>
+      </w:r>
+    </w:p>
+    <w:p>
+      <w:pPr>
+        <w:pStyle w:val="Normal"/>
+        <w:widowControl/>
+        <w:bidi w:val="0"/>
+        <w:spacing w:before="0" w:after="0"/>
+        <w:jc w:val="start"/>
+        <w:rPr>
+          <w:rFonts w:ascii="Arial" w:hAnsi="Arial" w:cs="Arial"/>
+          <w:szCs w:val="24"/>
+        </w:rPr>
+      </w:pPr>
+      <w:r>
+        <w:rPr>
+          <w:rFonts w:eastAsia="Arial" w:ascii="Arial" w:hAnsi="Arial"/>
+          <w:kern w:val="0"/>
+          <w:lang w:val="en-GB" w:eastAsia="en-US" w:bidi="ar-SA"/>
+        </w:rPr>
+      </w:r>
+    </w:p>
+    <w:p>
+      <w:pPr>
+        <w:pStyle w:val="Normal"/>
+        <w:widowControl/>
+        <w:bidi w:val="0"/>
+        <w:spacing w:before="0" w:after="0"/>
+        <w:jc w:val="start"/>
+        <w:rPr>
+          <w:rFonts w:ascii="Arial" w:hAnsi="Arial" w:cs="Arial"/>
+          <w:szCs w:val="24"/>
+        </w:rPr>
+      </w:pPr>
+      <w:r>
+        <w:rPr>
+          <w:rFonts w:eastAsia="Arial" w:ascii="Arial" w:hAnsi="Arial"/>
+          <w:kern w:val="0"/>
+          <w:lang w:val="en-GB" w:eastAsia="en-US" w:bidi="ar-SA"/>
+        </w:rPr>
+      </w:r>
+    </w:p>
+    <w:p>
+      <w:pPr>
+        <w:pStyle w:val="Normal"/>
+        <w:widowControl/>
+        <w:bidi w:val="0"/>
+        <w:spacing w:before="0" w:after="0"/>
+        <w:jc w:val="start"/>
+        <w:rPr>
+          <w:rFonts w:ascii="Arial" w:hAnsi="Arial" w:cs="Arial"/>
+          <w:szCs w:val="24"/>
+        </w:rPr>
+      </w:pPr>
+      <w:r>
+        <w:rPr>
+          <w:rFonts w:eastAsia="Arial" w:ascii="Arial" w:hAnsi="Arial"/>
+          <w:kern w:val="0"/>
+          <w:lang w:val="en-GB" w:eastAsia="en-US" w:bidi="ar-SA"/>
+        </w:rPr>
+      </w:r>
+    </w:p>
+    <w:p>
+      <w:pPr>
+        <w:pStyle w:val="Normal"/>
+        <w:widowControl/>
+        <w:bidi w:val="0"/>
+        <w:spacing w:before="0" w:after="0"/>
+        <w:jc w:val="start"/>
+        <w:rPr>
+          <w:rFonts w:ascii="Arial" w:hAnsi="Arial" w:cs="Arial"/>
+          <w:szCs w:val="24"/>
+        </w:rPr>
+      </w:pPr>
+      <w:r>
+        <w:rPr>
+          <w:rFonts w:eastAsia="Arial" w:ascii="Arial" w:hAnsi="Arial"/>
           <w:kern w:val="0"/>
           <w:lang w:val="en-GB" w:eastAsia="en-US" w:bidi="ar-SA"/>
         </w:rPr>
@@ -2812,6 +6648,417 @@
   <w:abstractNum w:abstractNumId="2">
     <w:lvl w:ilvl="0">
       <w:start w:val="1"/>
+      <w:numFmt w:val="bullet"/>
+      <w:lvlText w:val=""/>
+      <w:lvlJc w:val="start"/>
+      <w:pPr>
+        <w:tabs>
+          <w:tab w:val="num" w:pos="720"/>
+        </w:tabs>
+        <w:ind w:start="720" w:hanging="360"/>
+      </w:pPr>
+      <w:rPr>
+        <w:rFonts w:ascii="Symbol" w:hAnsi="Symbol" w:cs="Symbol" w:hint="default"/>
+      </w:rPr>
+    </w:lvl>
+    <w:lvl w:ilvl="1">
+      <w:start w:val="1"/>
+      <w:numFmt w:val="bullet"/>
+      <w:lvlText w:val="◦"/>
+      <w:lvlJc w:val="start"/>
+      <w:pPr>
+        <w:tabs>
+          <w:tab w:val="num" w:pos="1080"/>
+        </w:tabs>
+        <w:ind w:start="1080" w:hanging="360"/>
+      </w:pPr>
+      <w:rPr>
+        <w:rFonts w:ascii="OpenSymbol" w:hAnsi="OpenSymbol" w:cs="OpenSymbol" w:hint="default"/>
+      </w:rPr>
+    </w:lvl>
+    <w:lvl w:ilvl="2">
+      <w:start w:val="1"/>
+      <w:numFmt w:val="bullet"/>
+      <w:lvlText w:val="▪"/>
+      <w:lvlJc w:val="start"/>
+      <w:pPr>
+        <w:tabs>
+          <w:tab w:val="num" w:pos="1440"/>
+        </w:tabs>
+        <w:ind w:start="1440" w:hanging="360"/>
+      </w:pPr>
+      <w:rPr>
+        <w:rFonts w:ascii="OpenSymbol" w:hAnsi="OpenSymbol" w:cs="OpenSymbol" w:hint="default"/>
+      </w:rPr>
+    </w:lvl>
+    <w:lvl w:ilvl="3">
+      <w:start w:val="1"/>
+      <w:numFmt w:val="bullet"/>
+      <w:lvlText w:val=""/>
+      <w:lvlJc w:val="start"/>
+      <w:pPr>
+        <w:tabs>
+          <w:tab w:val="num" w:pos="1800"/>
+        </w:tabs>
+        <w:ind w:start="1800" w:hanging="360"/>
+      </w:pPr>
+      <w:rPr>
+        <w:rFonts w:ascii="Symbol" w:hAnsi="Symbol" w:cs="Symbol" w:hint="default"/>
+      </w:rPr>
+    </w:lvl>
+    <w:lvl w:ilvl="4">
+      <w:start w:val="1"/>
+      <w:numFmt w:val="bullet"/>
+      <w:lvlText w:val="◦"/>
+      <w:lvlJc w:val="start"/>
+      <w:pPr>
+        <w:tabs>
+          <w:tab w:val="num" w:pos="2160"/>
+        </w:tabs>
+        <w:ind w:start="2160" w:hanging="360"/>
+      </w:pPr>
+      <w:rPr>
+        <w:rFonts w:ascii="OpenSymbol" w:hAnsi="OpenSymbol" w:cs="OpenSymbol" w:hint="default"/>
+      </w:rPr>
+    </w:lvl>
+    <w:lvl w:ilvl="5">
+      <w:start w:val="1"/>
+      <w:numFmt w:val="bullet"/>
+      <w:lvlText w:val="▪"/>
+      <w:lvlJc w:val="start"/>
+      <w:pPr>
+        <w:tabs>
+          <w:tab w:val="num" w:pos="2520"/>
+        </w:tabs>
+        <w:ind w:start="2520" w:hanging="360"/>
+      </w:pPr>
+      <w:rPr>
+        <w:rFonts w:ascii="OpenSymbol" w:hAnsi="OpenSymbol" w:cs="OpenSymbol" w:hint="default"/>
+      </w:rPr>
+    </w:lvl>
+    <w:lvl w:ilvl="6">
+      <w:start w:val="1"/>
+      <w:numFmt w:val="bullet"/>
+      <w:lvlText w:val=""/>
+      <w:lvlJc w:val="start"/>
+      <w:pPr>
+        <w:tabs>
+          <w:tab w:val="num" w:pos="2880"/>
+        </w:tabs>
+        <w:ind w:start="2880" w:hanging="360"/>
+      </w:pPr>
+      <w:rPr>
+        <w:rFonts w:ascii="Symbol" w:hAnsi="Symbol" w:cs="Symbol" w:hint="default"/>
+      </w:rPr>
+    </w:lvl>
+    <w:lvl w:ilvl="7">
+      <w:start w:val="1"/>
+      <w:numFmt w:val="bullet"/>
+      <w:lvlText w:val="◦"/>
+      <w:lvlJc w:val="start"/>
+      <w:pPr>
+        <w:tabs>
+          <w:tab w:val="num" w:pos="3240"/>
+        </w:tabs>
+        <w:ind w:start="3240" w:hanging="360"/>
+      </w:pPr>
+      <w:rPr>
+        <w:rFonts w:ascii="OpenSymbol" w:hAnsi="OpenSymbol" w:cs="OpenSymbol" w:hint="default"/>
+      </w:rPr>
+    </w:lvl>
+    <w:lvl w:ilvl="8">
+      <w:start w:val="1"/>
+      <w:numFmt w:val="bullet"/>
+      <w:lvlText w:val="▪"/>
+      <w:lvlJc w:val="start"/>
+      <w:pPr>
+        <w:tabs>
+          <w:tab w:val="num" w:pos="3600"/>
+        </w:tabs>
+        <w:ind w:start="3600" w:hanging="360"/>
+      </w:pPr>
+      <w:rPr>
+        <w:rFonts w:ascii="OpenSymbol" w:hAnsi="OpenSymbol" w:cs="OpenSymbol" w:hint="default"/>
+      </w:rPr>
+    </w:lvl>
+  </w:abstractNum>
+  <w:abstractNum w:abstractNumId="3">
+    <w:lvl w:ilvl="0">
+      <w:start w:val="1"/>
+      <w:numFmt w:val="bullet"/>
+      <w:lvlText w:val=""/>
+      <w:lvlJc w:val="start"/>
+      <w:pPr>
+        <w:tabs>
+          <w:tab w:val="num" w:pos="720"/>
+        </w:tabs>
+        <w:ind w:start="720" w:hanging="360"/>
+      </w:pPr>
+      <w:rPr>
+        <w:rFonts w:ascii="Symbol" w:hAnsi="Symbol" w:cs="Symbol" w:hint="default"/>
+      </w:rPr>
+    </w:lvl>
+    <w:lvl w:ilvl="1">
+      <w:start w:val="1"/>
+      <w:numFmt w:val="bullet"/>
+      <w:lvlText w:val="◦"/>
+      <w:lvlJc w:val="start"/>
+      <w:pPr>
+        <w:tabs>
+          <w:tab w:val="num" w:pos="1080"/>
+        </w:tabs>
+        <w:ind w:start="1080" w:hanging="360"/>
+      </w:pPr>
+      <w:rPr>
+        <w:rFonts w:ascii="OpenSymbol" w:hAnsi="OpenSymbol" w:cs="OpenSymbol" w:hint="default"/>
+      </w:rPr>
+    </w:lvl>
+    <w:lvl w:ilvl="2">
+      <w:start w:val="1"/>
+      <w:numFmt w:val="bullet"/>
+      <w:lvlText w:val="▪"/>
+      <w:lvlJc w:val="start"/>
+      <w:pPr>
+        <w:tabs>
+          <w:tab w:val="num" w:pos="1440"/>
+        </w:tabs>
+        <w:ind w:start="1440" w:hanging="360"/>
+      </w:pPr>
+      <w:rPr>
+        <w:rFonts w:ascii="OpenSymbol" w:hAnsi="OpenSymbol" w:cs="OpenSymbol" w:hint="default"/>
+      </w:rPr>
+    </w:lvl>
+    <w:lvl w:ilvl="3">
+      <w:start w:val="1"/>
+      <w:numFmt w:val="bullet"/>
+      <w:lvlText w:val=""/>
+      <w:lvlJc w:val="start"/>
+      <w:pPr>
+        <w:tabs>
+          <w:tab w:val="num" w:pos="1800"/>
+        </w:tabs>
+        <w:ind w:start="1800" w:hanging="360"/>
+      </w:pPr>
+      <w:rPr>
+        <w:rFonts w:ascii="Symbol" w:hAnsi="Symbol" w:cs="Symbol" w:hint="default"/>
+      </w:rPr>
+    </w:lvl>
+    <w:lvl w:ilvl="4">
+      <w:start w:val="1"/>
+      <w:numFmt w:val="bullet"/>
+      <w:lvlText w:val="◦"/>
+      <w:lvlJc w:val="start"/>
+      <w:pPr>
+        <w:tabs>
+          <w:tab w:val="num" w:pos="2160"/>
+        </w:tabs>
+        <w:ind w:start="2160" w:hanging="360"/>
+      </w:pPr>
+      <w:rPr>
+        <w:rFonts w:ascii="OpenSymbol" w:hAnsi="OpenSymbol" w:cs="OpenSymbol" w:hint="default"/>
+      </w:rPr>
+    </w:lvl>
+    <w:lvl w:ilvl="5">
+      <w:start w:val="1"/>
+      <w:numFmt w:val="bullet"/>
+      <w:lvlText w:val="▪"/>
+      <w:lvlJc w:val="start"/>
+      <w:pPr>
+        <w:tabs>
+          <w:tab w:val="num" w:pos="2520"/>
+        </w:tabs>
+        <w:ind w:start="2520" w:hanging="360"/>
+      </w:pPr>
+      <w:rPr>
+        <w:rFonts w:ascii="OpenSymbol" w:hAnsi="OpenSymbol" w:cs="OpenSymbol" w:hint="default"/>
+      </w:rPr>
+    </w:lvl>
+    <w:lvl w:ilvl="6">
+      <w:start w:val="1"/>
+      <w:numFmt w:val="bullet"/>
+      <w:lvlText w:val=""/>
+      <w:lvlJc w:val="start"/>
+      <w:pPr>
+        <w:tabs>
+          <w:tab w:val="num" w:pos="2880"/>
+        </w:tabs>
+        <w:ind w:start="2880" w:hanging="360"/>
+      </w:pPr>
+      <w:rPr>
+        <w:rFonts w:ascii="Symbol" w:hAnsi="Symbol" w:cs="Symbol" w:hint="default"/>
+      </w:rPr>
+    </w:lvl>
+    <w:lvl w:ilvl="7">
+      <w:start w:val="1"/>
+      <w:numFmt w:val="bullet"/>
+      <w:lvlText w:val="◦"/>
+      <w:lvlJc w:val="start"/>
+      <w:pPr>
+        <w:tabs>
+          <w:tab w:val="num" w:pos="3240"/>
+        </w:tabs>
+        <w:ind w:start="3240" w:hanging="360"/>
+      </w:pPr>
+      <w:rPr>
+        <w:rFonts w:ascii="OpenSymbol" w:hAnsi="OpenSymbol" w:cs="OpenSymbol" w:hint="default"/>
+      </w:rPr>
+    </w:lvl>
+    <w:lvl w:ilvl="8">
+      <w:start w:val="1"/>
+      <w:numFmt w:val="bullet"/>
+      <w:lvlText w:val="▪"/>
+      <w:lvlJc w:val="start"/>
+      <w:pPr>
+        <w:tabs>
+          <w:tab w:val="num" w:pos="3600"/>
+        </w:tabs>
+        <w:ind w:start="3600" w:hanging="360"/>
+      </w:pPr>
+      <w:rPr>
+        <w:rFonts w:ascii="OpenSymbol" w:hAnsi="OpenSymbol" w:cs="OpenSymbol" w:hint="default"/>
+      </w:rPr>
+    </w:lvl>
+  </w:abstractNum>
+  <w:abstractNum w:abstractNumId="4">
+    <w:lvl w:ilvl="0">
+      <w:start w:val="1"/>
+      <w:numFmt w:val="bullet"/>
+      <w:lvlText w:val=""/>
+      <w:lvlJc w:val="start"/>
+      <w:pPr>
+        <w:tabs>
+          <w:tab w:val="num" w:pos="720"/>
+        </w:tabs>
+        <w:ind w:start="720" w:hanging="360"/>
+      </w:pPr>
+      <w:rPr>
+        <w:rFonts w:ascii="Symbol" w:hAnsi="Symbol" w:cs="Symbol" w:hint="default"/>
+      </w:rPr>
+    </w:lvl>
+    <w:lvl w:ilvl="1">
+      <w:start w:val="1"/>
+      <w:numFmt w:val="bullet"/>
+      <w:lvlText w:val="◦"/>
+      <w:lvlJc w:val="start"/>
+      <w:pPr>
+        <w:tabs>
+          <w:tab w:val="num" w:pos="1080"/>
+        </w:tabs>
+        <w:ind w:start="1080" w:hanging="360"/>
+      </w:pPr>
+      <w:rPr>
+        <w:rFonts w:ascii="OpenSymbol" w:hAnsi="OpenSymbol" w:cs="OpenSymbol" w:hint="default"/>
+      </w:rPr>
+    </w:lvl>
+    <w:lvl w:ilvl="2">
+      <w:start w:val="1"/>
+      <w:numFmt w:val="bullet"/>
+      <w:lvlText w:val="▪"/>
+      <w:lvlJc w:val="start"/>
+      <w:pPr>
+        <w:tabs>
+          <w:tab w:val="num" w:pos="1440"/>
+        </w:tabs>
+        <w:ind w:start="1440" w:hanging="360"/>
+      </w:pPr>
+      <w:rPr>
+        <w:rFonts w:ascii="OpenSymbol" w:hAnsi="OpenSymbol" w:cs="OpenSymbol" w:hint="default"/>
+      </w:rPr>
+    </w:lvl>
+    <w:lvl w:ilvl="3">
+      <w:start w:val="1"/>
+      <w:numFmt w:val="bullet"/>
+      <w:lvlText w:val=""/>
+      <w:lvlJc w:val="start"/>
+      <w:pPr>
+        <w:tabs>
+          <w:tab w:val="num" w:pos="1800"/>
+        </w:tabs>
+        <w:ind w:start="1800" w:hanging="360"/>
+      </w:pPr>
+      <w:rPr>
+        <w:rFonts w:ascii="Symbol" w:hAnsi="Symbol" w:cs="Symbol" w:hint="default"/>
+      </w:rPr>
+    </w:lvl>
+    <w:lvl w:ilvl="4">
+      <w:start w:val="1"/>
+      <w:numFmt w:val="bullet"/>
+      <w:lvlText w:val="◦"/>
+      <w:lvlJc w:val="start"/>
+      <w:pPr>
+        <w:tabs>
+          <w:tab w:val="num" w:pos="2160"/>
+        </w:tabs>
+        <w:ind w:start="2160" w:hanging="360"/>
+      </w:pPr>
+      <w:rPr>
+        <w:rFonts w:ascii="OpenSymbol" w:hAnsi="OpenSymbol" w:cs="OpenSymbol" w:hint="default"/>
+      </w:rPr>
+    </w:lvl>
+    <w:lvl w:ilvl="5">
+      <w:start w:val="1"/>
+      <w:numFmt w:val="bullet"/>
+      <w:lvlText w:val="▪"/>
+      <w:lvlJc w:val="start"/>
+      <w:pPr>
+        <w:tabs>
+          <w:tab w:val="num" w:pos="2520"/>
+        </w:tabs>
+        <w:ind w:start="2520" w:hanging="360"/>
+      </w:pPr>
+      <w:rPr>
+        <w:rFonts w:ascii="OpenSymbol" w:hAnsi="OpenSymbol" w:cs="OpenSymbol" w:hint="default"/>
+      </w:rPr>
+    </w:lvl>
+    <w:lvl w:ilvl="6">
+      <w:start w:val="1"/>
+      <w:numFmt w:val="bullet"/>
+      <w:lvlText w:val=""/>
+      <w:lvlJc w:val="start"/>
+      <w:pPr>
+        <w:tabs>
+          <w:tab w:val="num" w:pos="2880"/>
+        </w:tabs>
+        <w:ind w:start="2880" w:hanging="360"/>
+      </w:pPr>
+      <w:rPr>
+        <w:rFonts w:ascii="Symbol" w:hAnsi="Symbol" w:cs="Symbol" w:hint="default"/>
+      </w:rPr>
+    </w:lvl>
+    <w:lvl w:ilvl="7">
+      <w:start w:val="1"/>
+      <w:numFmt w:val="bullet"/>
+      <w:lvlText w:val="◦"/>
+      <w:lvlJc w:val="start"/>
+      <w:pPr>
+        <w:tabs>
+          <w:tab w:val="num" w:pos="3240"/>
+        </w:tabs>
+        <w:ind w:start="3240" w:hanging="360"/>
+      </w:pPr>
+      <w:rPr>
+        <w:rFonts w:ascii="OpenSymbol" w:hAnsi="OpenSymbol" w:cs="OpenSymbol" w:hint="default"/>
+      </w:rPr>
+    </w:lvl>
+    <w:lvl w:ilvl="8">
+      <w:start w:val="1"/>
+      <w:numFmt w:val="bullet"/>
+      <w:lvlText w:val="▪"/>
+      <w:lvlJc w:val="start"/>
+      <w:pPr>
+        <w:tabs>
+          <w:tab w:val="num" w:pos="3600"/>
+        </w:tabs>
+        <w:ind w:start="3600" w:hanging="360"/>
+      </w:pPr>
+      <w:rPr>
+        <w:rFonts w:ascii="OpenSymbol" w:hAnsi="OpenSymbol" w:cs="OpenSymbol" w:hint="default"/>
+      </w:rPr>
+    </w:lvl>
+  </w:abstractNum>
+  <w:abstractNum w:abstractNumId="5">
+    <w:lvl w:ilvl="0">
+      <w:start w:val="1"/>
       <w:numFmt w:val="none"/>
       <w:suff w:val="nothing"/>
       <w:lvlText w:val=""/>
@@ -2933,6 +7180,15 @@
   </w:num>
   <w:num w:numId="2">
     <w:abstractNumId w:val="2"/>
+  </w:num>
+  <w:num w:numId="3">
+    <w:abstractNumId w:val="3"/>
+  </w:num>
+  <w:num w:numId="4">
+    <w:abstractNumId w:val="4"/>
+  </w:num>
+  <w:num w:numId="5">
+    <w:abstractNumId w:val="5"/>
   </w:num>
 </w:numbering>
 </file>
@@ -3058,6 +7314,29 @@
     </w:pPr>
     <w:rPr>
       <w:rFonts w:cs="Noto Sans Devanagari"/>
+    </w:rPr>
+  </w:style>
+  <w:style w:type="paragraph" w:styleId="TableContents">
+    <w:name w:val="Table Contents"/>
+    <w:basedOn w:val="Normal"/>
+    <w:qFormat/>
+    <w:pPr>
+      <w:widowControl w:val="false"/>
+      <w:suppressLineNumbers/>
+    </w:pPr>
+    <w:rPr/>
+  </w:style>
+  <w:style w:type="paragraph" w:styleId="TableHeading">
+    <w:name w:val="Table Heading"/>
+    <w:basedOn w:val="TableContents"/>
+    <w:qFormat/>
+    <w:pPr>
+      <w:suppressLineNumbers/>
+      <w:jc w:val="center"/>
+    </w:pPr>
+    <w:rPr>
+      <w:b/>
+      <w:bCs/>
     </w:rPr>
   </w:style>
 </w:styles>

</xml_diff>

<commit_message>
Updated versio of Writ 1
</commit_message>
<xml_diff>
--- a/assessment/writ1/dat5001-tomrowan-st20285213-writ1.docx
+++ b/assessment/writ1/dat5001-tomrowan-st20285213-writ1.docx
@@ -1771,7 +1771,13 @@
     </w:p>
     <w:p>
       <w:r>
-        <w:t>Earth’s orbit has become increasingly congested with satellites, rocket stages, and debris fragments from past missions. While many these objects decay naturally over time or are purposefully caused to re-enter the atmosphere, a huge number remain in orbit many years after launch. Even small fragments as tiny as a paint fleck can damage spacecraft when travelling at orbital speeds (7–8km/s).</w:t>
+        <w:t xml:space="preserve">Earth’s orbit has become increasingly congested with satellites, rocket stages, and debris fragments from past missions. While many </w:t>
+      </w:r>
+      <w:r>
+        <w:t xml:space="preserve">of </w:t>
+      </w:r>
+      <w:r>
+        <w:t>these objects decay naturally over time or are purposefully caused to re-enter the atmosphere, a huge number remain in orbit many years after launch. Even small fragments as tiny as a paint fleck can damage spacecraft when travelling at orbital speeds (7–8km/s).</w:t>
       </w:r>
     </w:p>
     <w:p>
@@ -1786,7 +1792,7 @@
     </w:p>
     <w:p>
       <w:r>
-        <w:t xml:space="preserve">Under this model, collisions between objects become a cascade, creating a debris cloud and causing more objects to collide until and all satellite payloads have been destroyed. A Low Earth Orbit devoid of usable safe orbits would be catastrophic for modern civilisation; the resultant debris could last many generations. </w:t>
+        <w:t xml:space="preserve">Under this model, collisions between objects become a cascade, creating a debris cloud and causing more objects to collide until all satellite payloads have been destroyed. A Low Earth Orbit devoid of usable safe orbits would be catastrophic for modern civilisation; the resultant debris could last many generations. </w:t>
       </w:r>
     </w:p>
     <w:p>

</xml_diff>

<commit_message>
Small updates to writ1
</commit_message>
<xml_diff>
--- a/assessment/writ1/dat5001-tomrowan-st20285213-writ1.docx
+++ b/assessment/writ1/dat5001-tomrowan-st20285213-writ1.docx
@@ -215,7 +215,7 @@
             </w:pPr>
             <w:bookmarkStart w:id="0" w:name="_Toc155876009"/>
             <w:bookmarkStart w:id="1" w:name="_Toc199754777"/>
-            <w:bookmarkStart w:id="2" w:name="_Toc215672571"/>
+            <w:bookmarkStart w:id="2" w:name="_Toc215733927"/>
             <w:r>
               <w:t>Course Details</w:t>
             </w:r>
@@ -298,7 +298,7 @@
               <w:pStyle w:val="Heading1"/>
             </w:pPr>
             <w:bookmarkStart w:id="3" w:name="_Toc199754778"/>
-            <w:bookmarkStart w:id="4" w:name="_Toc215672572"/>
+            <w:bookmarkStart w:id="4" w:name="_Toc215733928"/>
             <w:r>
               <w:t>Student Details</w:t>
             </w:r>
@@ -332,7 +332,7 @@
             </w:pPr>
             <w:bookmarkStart w:id="5" w:name="_Toc155876011"/>
             <w:bookmarkStart w:id="6" w:name="_Toc199754779"/>
-            <w:bookmarkStart w:id="7" w:name="_Toc215672573"/>
+            <w:bookmarkStart w:id="7" w:name="_Toc215733929"/>
             <w:r>
               <w:t>Project Tutor</w:t>
             </w:r>
@@ -421,7 +421,7 @@
             </w:rPr>
             <w:fldChar w:fldCharType="separate"/>
           </w:r>
-          <w:hyperlink w:anchor="_Toc215672571" w:history="1">
+          <w:hyperlink w:anchor="_Toc215733927" w:history="1">
             <w:r>
               <w:rPr>
                 <w:rStyle w:val="Hyperlink"/>
@@ -445,7 +445,7 @@
               <w:rPr>
                 <w:noProof/>
               </w:rPr>
-              <w:instrText xml:space="preserve"> PAGEREF _Toc215672571 \h </w:instrText>
+              <w:instrText xml:space="preserve"> PAGEREF _Toc215733927 \h </w:instrText>
             </w:r>
             <w:r>
               <w:rPr>
@@ -484,7 +484,7 @@
               <w14:ligatures w14:val="standardContextual"/>
             </w:rPr>
           </w:pPr>
-          <w:hyperlink w:anchor="_Toc215672572" w:history="1">
+          <w:hyperlink w:anchor="_Toc215733928" w:history="1">
             <w:r>
               <w:rPr>
                 <w:rStyle w:val="Hyperlink"/>
@@ -508,7 +508,7 @@
               <w:rPr>
                 <w:noProof/>
               </w:rPr>
-              <w:instrText xml:space="preserve"> PAGEREF _Toc215672572 \h </w:instrText>
+              <w:instrText xml:space="preserve"> PAGEREF _Toc215733928 \h </w:instrText>
             </w:r>
             <w:r>
               <w:rPr>
@@ -547,7 +547,7 @@
               <w14:ligatures w14:val="standardContextual"/>
             </w:rPr>
           </w:pPr>
-          <w:hyperlink w:anchor="_Toc215672573" w:history="1">
+          <w:hyperlink w:anchor="_Toc215733929" w:history="1">
             <w:r>
               <w:rPr>
                 <w:rStyle w:val="Hyperlink"/>
@@ -571,7 +571,7 @@
               <w:rPr>
                 <w:noProof/>
               </w:rPr>
-              <w:instrText xml:space="preserve"> PAGEREF _Toc215672573 \h </w:instrText>
+              <w:instrText xml:space="preserve"> PAGEREF _Toc215733929 \h </w:instrText>
             </w:r>
             <w:r>
               <w:rPr>
@@ -610,7 +610,7 @@
               <w14:ligatures w14:val="standardContextual"/>
             </w:rPr>
           </w:pPr>
-          <w:hyperlink w:anchor="_Toc215672574" w:history="1">
+          <w:hyperlink w:anchor="_Toc215733930" w:history="1">
             <w:r>
               <w:rPr>
                 <w:rStyle w:val="Hyperlink"/>
@@ -634,7 +634,7 @@
               <w:rPr>
                 <w:noProof/>
               </w:rPr>
-              <w:instrText xml:space="preserve"> PAGEREF _Toc215672574 \h </w:instrText>
+              <w:instrText xml:space="preserve"> PAGEREF _Toc215733930 \h </w:instrText>
             </w:r>
             <w:r>
               <w:rPr>
@@ -673,7 +673,7 @@
               <w14:ligatures w14:val="standardContextual"/>
             </w:rPr>
           </w:pPr>
-          <w:hyperlink w:anchor="_Toc215672575" w:history="1">
+          <w:hyperlink w:anchor="_Toc215733931" w:history="1">
             <w:r>
               <w:rPr>
                 <w:rStyle w:val="Hyperlink"/>
@@ -697,7 +697,7 @@
               <w:rPr>
                 <w:noProof/>
               </w:rPr>
-              <w:instrText xml:space="preserve"> PAGEREF _Toc215672575 \h </w:instrText>
+              <w:instrText xml:space="preserve"> PAGEREF _Toc215733931 \h </w:instrText>
             </w:r>
             <w:r>
               <w:rPr>
@@ -736,7 +736,7 @@
               <w14:ligatures w14:val="standardContextual"/>
             </w:rPr>
           </w:pPr>
-          <w:hyperlink w:anchor="_Toc215672576" w:history="1">
+          <w:hyperlink w:anchor="_Toc215733932" w:history="1">
             <w:r>
               <w:rPr>
                 <w:rStyle w:val="Hyperlink"/>
@@ -760,7 +760,7 @@
               <w:rPr>
                 <w:noProof/>
               </w:rPr>
-              <w:instrText xml:space="preserve"> PAGEREF _Toc215672576 \h </w:instrText>
+              <w:instrText xml:space="preserve"> PAGEREF _Toc215733932 \h </w:instrText>
             </w:r>
             <w:r>
               <w:rPr>
@@ -799,7 +799,7 @@
               <w14:ligatures w14:val="standardContextual"/>
             </w:rPr>
           </w:pPr>
-          <w:hyperlink w:anchor="_Toc215672577" w:history="1">
+          <w:hyperlink w:anchor="_Toc215733933" w:history="1">
             <w:r>
               <w:rPr>
                 <w:rStyle w:val="Hyperlink"/>
@@ -823,7 +823,7 @@
               <w:rPr>
                 <w:noProof/>
               </w:rPr>
-              <w:instrText xml:space="preserve"> PAGEREF _Toc215672577 \h </w:instrText>
+              <w:instrText xml:space="preserve"> PAGEREF _Toc215733933 \h </w:instrText>
             </w:r>
             <w:r>
               <w:rPr>
@@ -862,7 +862,7 @@
               <w14:ligatures w14:val="standardContextual"/>
             </w:rPr>
           </w:pPr>
-          <w:hyperlink w:anchor="_Toc215672578" w:history="1">
+          <w:hyperlink w:anchor="_Toc215733934" w:history="1">
             <w:r>
               <w:rPr>
                 <w:rStyle w:val="Hyperlink"/>
@@ -886,7 +886,7 @@
               <w:rPr>
                 <w:noProof/>
               </w:rPr>
-              <w:instrText xml:space="preserve"> PAGEREF _Toc215672578 \h </w:instrText>
+              <w:instrText xml:space="preserve"> PAGEREF _Toc215733934 \h </w:instrText>
             </w:r>
             <w:r>
               <w:rPr>
@@ -925,7 +925,7 @@
               <w14:ligatures w14:val="standardContextual"/>
             </w:rPr>
           </w:pPr>
-          <w:hyperlink w:anchor="_Toc215672579" w:history="1">
+          <w:hyperlink w:anchor="_Toc215733935" w:history="1">
             <w:r>
               <w:rPr>
                 <w:rStyle w:val="Hyperlink"/>
@@ -949,7 +949,7 @@
               <w:rPr>
                 <w:noProof/>
               </w:rPr>
-              <w:instrText xml:space="preserve"> PAGEREF _Toc215672579 \h </w:instrText>
+              <w:instrText xml:space="preserve"> PAGEREF _Toc215733935 \h </w:instrText>
             </w:r>
             <w:r>
               <w:rPr>
@@ -988,7 +988,7 @@
               <w14:ligatures w14:val="standardContextual"/>
             </w:rPr>
           </w:pPr>
-          <w:hyperlink w:anchor="_Toc215672580" w:history="1">
+          <w:hyperlink w:anchor="_Toc215733936" w:history="1">
             <w:r>
               <w:rPr>
                 <w:rStyle w:val="Hyperlink"/>
@@ -1012,7 +1012,7 @@
               <w:rPr>
                 <w:noProof/>
               </w:rPr>
-              <w:instrText xml:space="preserve"> PAGEREF _Toc215672580 \h </w:instrText>
+              <w:instrText xml:space="preserve"> PAGEREF _Toc215733936 \h </w:instrText>
             </w:r>
             <w:r>
               <w:rPr>
@@ -1051,7 +1051,7 @@
               <w14:ligatures w14:val="standardContextual"/>
             </w:rPr>
           </w:pPr>
-          <w:hyperlink w:anchor="_Toc215672581" w:history="1">
+          <w:hyperlink w:anchor="_Toc215733937" w:history="1">
             <w:r>
               <w:rPr>
                 <w:rStyle w:val="Hyperlink"/>
@@ -1075,7 +1075,7 @@
               <w:rPr>
                 <w:noProof/>
               </w:rPr>
-              <w:instrText xml:space="preserve"> PAGEREF _Toc215672581 \h </w:instrText>
+              <w:instrText xml:space="preserve"> PAGEREF _Toc215733937 \h </w:instrText>
             </w:r>
             <w:r>
               <w:rPr>
@@ -1114,7 +1114,7 @@
               <w14:ligatures w14:val="standardContextual"/>
             </w:rPr>
           </w:pPr>
-          <w:hyperlink w:anchor="_Toc215672582" w:history="1">
+          <w:hyperlink w:anchor="_Toc215733938" w:history="1">
             <w:r>
               <w:rPr>
                 <w:rStyle w:val="Hyperlink"/>
@@ -1138,7 +1138,7 @@
               <w:rPr>
                 <w:noProof/>
               </w:rPr>
-              <w:instrText xml:space="preserve"> PAGEREF _Toc215672582 \h </w:instrText>
+              <w:instrText xml:space="preserve"> PAGEREF _Toc215733938 \h </w:instrText>
             </w:r>
             <w:r>
               <w:rPr>
@@ -1177,7 +1177,7 @@
               <w14:ligatures w14:val="standardContextual"/>
             </w:rPr>
           </w:pPr>
-          <w:hyperlink w:anchor="_Toc215672583" w:history="1">
+          <w:hyperlink w:anchor="_Toc215733939" w:history="1">
             <w:r>
               <w:rPr>
                 <w:rStyle w:val="Hyperlink"/>
@@ -1201,7 +1201,7 @@
               <w:rPr>
                 <w:noProof/>
               </w:rPr>
-              <w:instrText xml:space="preserve"> PAGEREF _Toc215672583 \h </w:instrText>
+              <w:instrText xml:space="preserve"> PAGEREF _Toc215733939 \h </w:instrText>
             </w:r>
             <w:r>
               <w:rPr>
@@ -1240,7 +1240,7 @@
               <w14:ligatures w14:val="standardContextual"/>
             </w:rPr>
           </w:pPr>
-          <w:hyperlink w:anchor="_Toc215672584" w:history="1">
+          <w:hyperlink w:anchor="_Toc215733940" w:history="1">
             <w:r>
               <w:rPr>
                 <w:rStyle w:val="Hyperlink"/>
@@ -1264,7 +1264,7 @@
               <w:rPr>
                 <w:noProof/>
               </w:rPr>
-              <w:instrText xml:space="preserve"> PAGEREF _Toc215672584 \h </w:instrText>
+              <w:instrText xml:space="preserve"> PAGEREF _Toc215733940 \h </w:instrText>
             </w:r>
             <w:r>
               <w:rPr>
@@ -1303,7 +1303,7 @@
               <w14:ligatures w14:val="standardContextual"/>
             </w:rPr>
           </w:pPr>
-          <w:hyperlink w:anchor="_Toc215672585" w:history="1">
+          <w:hyperlink w:anchor="_Toc215733941" w:history="1">
             <w:r>
               <w:rPr>
                 <w:rStyle w:val="Hyperlink"/>
@@ -1327,7 +1327,7 @@
               <w:rPr>
                 <w:noProof/>
               </w:rPr>
-              <w:instrText xml:space="preserve"> PAGEREF _Toc215672585 \h </w:instrText>
+              <w:instrText xml:space="preserve"> PAGEREF _Toc215733941 \h </w:instrText>
             </w:r>
             <w:r>
               <w:rPr>
@@ -1366,7 +1366,7 @@
               <w14:ligatures w14:val="standardContextual"/>
             </w:rPr>
           </w:pPr>
-          <w:hyperlink w:anchor="_Toc215672586" w:history="1">
+          <w:hyperlink w:anchor="_Toc215733942" w:history="1">
             <w:r>
               <w:rPr>
                 <w:rStyle w:val="Hyperlink"/>
@@ -1390,7 +1390,7 @@
               <w:rPr>
                 <w:noProof/>
               </w:rPr>
-              <w:instrText xml:space="preserve"> PAGEREF _Toc215672586 \h </w:instrText>
+              <w:instrText xml:space="preserve"> PAGEREF _Toc215733942 \h </w:instrText>
             </w:r>
             <w:r>
               <w:rPr>
@@ -1429,7 +1429,7 @@
               <w14:ligatures w14:val="standardContextual"/>
             </w:rPr>
           </w:pPr>
-          <w:hyperlink w:anchor="_Toc215672587" w:history="1">
+          <w:hyperlink w:anchor="_Toc215733943" w:history="1">
             <w:r>
               <w:rPr>
                 <w:rStyle w:val="Hyperlink"/>
@@ -1453,7 +1453,7 @@
               <w:rPr>
                 <w:noProof/>
               </w:rPr>
-              <w:instrText xml:space="preserve"> PAGEREF _Toc215672587 \h </w:instrText>
+              <w:instrText xml:space="preserve"> PAGEREF _Toc215733943 \h </w:instrText>
             </w:r>
             <w:r>
               <w:rPr>
@@ -1492,7 +1492,7 @@
               <w14:ligatures w14:val="standardContextual"/>
             </w:rPr>
           </w:pPr>
-          <w:hyperlink w:anchor="_Toc215672588" w:history="1">
+          <w:hyperlink w:anchor="_Toc215733944" w:history="1">
             <w:r>
               <w:rPr>
                 <w:rStyle w:val="Hyperlink"/>
@@ -1516,7 +1516,7 @@
               <w:rPr>
                 <w:noProof/>
               </w:rPr>
-              <w:instrText xml:space="preserve"> PAGEREF _Toc215672588 \h </w:instrText>
+              <w:instrText xml:space="preserve"> PAGEREF _Toc215733944 \h </w:instrText>
             </w:r>
             <w:r>
               <w:rPr>
@@ -1533,7 +1533,7 @@
               <w:rPr>
                 <w:noProof/>
               </w:rPr>
-              <w:t>13</w:t>
+              <w:t>14</w:t>
             </w:r>
             <w:r>
               <w:rPr>
@@ -1555,7 +1555,7 @@
               <w14:ligatures w14:val="standardContextual"/>
             </w:rPr>
           </w:pPr>
-          <w:hyperlink w:anchor="_Toc215672589" w:history="1">
+          <w:hyperlink w:anchor="_Toc215733945" w:history="1">
             <w:r>
               <w:rPr>
                 <w:rStyle w:val="Hyperlink"/>
@@ -1579,7 +1579,7 @@
               <w:rPr>
                 <w:noProof/>
               </w:rPr>
-              <w:instrText xml:space="preserve"> PAGEREF _Toc215672589 \h </w:instrText>
+              <w:instrText xml:space="preserve"> PAGEREF _Toc215733945 \h </w:instrText>
             </w:r>
             <w:r>
               <w:rPr>
@@ -1618,7 +1618,7 @@
               <w14:ligatures w14:val="standardContextual"/>
             </w:rPr>
           </w:pPr>
-          <w:hyperlink w:anchor="_Toc215672590" w:history="1">
+          <w:hyperlink w:anchor="_Toc215733946" w:history="1">
             <w:r>
               <w:rPr>
                 <w:rStyle w:val="Hyperlink"/>
@@ -1642,7 +1642,7 @@
               <w:rPr>
                 <w:noProof/>
               </w:rPr>
-              <w:instrText xml:space="preserve"> PAGEREF _Toc215672590 \h </w:instrText>
+              <w:instrText xml:space="preserve"> PAGEREF _Toc215733946 \h </w:instrText>
             </w:r>
             <w:r>
               <w:rPr>
@@ -1681,7 +1681,7 @@
               <w14:ligatures w14:val="standardContextual"/>
             </w:rPr>
           </w:pPr>
-          <w:hyperlink w:anchor="_Toc215672591" w:history="1">
+          <w:hyperlink w:anchor="_Toc215733947" w:history="1">
             <w:r>
               <w:rPr>
                 <w:rStyle w:val="Hyperlink"/>
@@ -1705,7 +1705,7 @@
               <w:rPr>
                 <w:noProof/>
               </w:rPr>
-              <w:instrText xml:space="preserve"> PAGEREF _Toc215672591 \h </w:instrText>
+              <w:instrText xml:space="preserve"> PAGEREF _Toc215733947 \h </w:instrText>
             </w:r>
             <w:r>
               <w:rPr>
@@ -1757,7 +1757,7 @@
       <w:pPr>
         <w:pStyle w:val="Heading1"/>
       </w:pPr>
-      <w:bookmarkStart w:id="8" w:name="_Toc215672574"/>
+      <w:bookmarkStart w:id="8" w:name="_Toc215733930"/>
       <w:r>
         <w:lastRenderedPageBreak/>
         <w:t>Part 1 - Introduction</w:t>
@@ -1875,7 +1875,7 @@
       <w:pPr>
         <w:pStyle w:val="Heading1"/>
       </w:pPr>
-      <w:bookmarkStart w:id="9" w:name="_Toc215672575"/>
+      <w:bookmarkStart w:id="9" w:name="_Toc215733931"/>
       <w:r>
         <w:lastRenderedPageBreak/>
         <w:t>Part 2 – Materials and Methods</w:t>
@@ -1886,7 +1886,7 @@
       <w:pPr>
         <w:pStyle w:val="Heading2"/>
       </w:pPr>
-      <w:bookmarkStart w:id="10" w:name="_Toc215672576"/>
+      <w:bookmarkStart w:id="10" w:name="_Toc215733932"/>
       <w:r>
         <w:t>Data Collection</w:t>
       </w:r>
@@ -2177,7 +2177,7 @@
       <w:pPr>
         <w:pStyle w:val="Heading2"/>
       </w:pPr>
-      <w:bookmarkStart w:id="11" w:name="_Toc215672577"/>
+      <w:bookmarkStart w:id="11" w:name="_Toc215733933"/>
       <w:r>
         <w:lastRenderedPageBreak/>
         <w:t>Data Cleaning and Processing</w:t>
@@ -2893,7 +2893,7 @@
       <w:pPr>
         <w:pStyle w:val="Heading3"/>
       </w:pPr>
-      <w:bookmarkStart w:id="12" w:name="_Toc215672578"/>
+      <w:bookmarkStart w:id="12" w:name="_Toc215733934"/>
       <w:r>
         <w:t>Data Cleaning</w:t>
       </w:r>
@@ -2976,7 +2976,7 @@
       <w:pPr>
         <w:pStyle w:val="Heading3"/>
       </w:pPr>
-      <w:bookmarkStart w:id="13" w:name="_Toc215672579"/>
+      <w:bookmarkStart w:id="13" w:name="_Toc215733935"/>
       <w:r>
         <w:lastRenderedPageBreak/>
         <w:t>Feature Engineering</w:t>
@@ -3025,13 +3025,11 @@
       <w:r>
         <w:t xml:space="preserve">was a reliable </w:t>
       </w:r>
-      <w:proofErr w:type="spellStart"/>
-      <w:r>
-        <w:t>boolean</w:t>
-      </w:r>
-      <w:proofErr w:type="spellEnd"/>
-      <w:r>
-        <w:t xml:space="preserve"> flag </w:t>
+      <w:r>
+        <w:t>B</w:t>
+      </w:r>
+      <w:r>
+        <w:t xml:space="preserve">oolean flag </w:t>
       </w:r>
       <w:r>
         <w:t>for</w:t>
@@ -3063,23 +3061,21 @@
           <w:i/>
           <w:iCs/>
         </w:rPr>
-        <w:t xml:space="preserve">“An artificial space object … can be in one state. Each time the object transitions to another state (undocks, is attached to something, </w:t>
-      </w:r>
-      <w:proofErr w:type="spellStart"/>
+        <w:t>“An artificial space object … can be in one state. Each time the object transitions to another state (undocks, is attached to something, re</w:t>
+      </w:r>
       <w:r>
         <w:rPr>
           <w:i/>
           <w:iCs/>
         </w:rPr>
-        <w:t>reenters</w:t>
-      </w:r>
-      <w:proofErr w:type="spellEnd"/>
+        <w:t>-</w:t>
+      </w:r>
       <w:r>
         <w:rPr>
           <w:i/>
           <w:iCs/>
         </w:rPr>
-        <w:t xml:space="preserve">, changes which body it is orbiting, etc.) marks the beginning or end of a phase. Most objects in GCAT have only a single phase - they separate from an object (launch vehicle) and then are either still in free flight or have re-entered. However, some objects go through many phases. </w:t>
+        <w:t xml:space="preserve">enters, changes which body it is orbiting, etc.) marks the beginning or end of a phase. Most objects in GCAT have only a single phase - they separate from an object (launch vehicle) and then are either still in free flight or have re-entered. However, some objects go through many phases. </w:t>
       </w:r>
       <w:r>
         <w:rPr>
@@ -3901,7 +3897,7 @@
       <w:pPr>
         <w:pStyle w:val="Heading2"/>
       </w:pPr>
-      <w:bookmarkStart w:id="14" w:name="_Toc215672580"/>
+      <w:bookmarkStart w:id="14" w:name="_Toc215733936"/>
       <w:r>
         <w:lastRenderedPageBreak/>
         <w:t>Design Principles and Tools</w:t>
@@ -3917,7 +3913,7 @@
       <w:pPr>
         <w:pStyle w:val="Heading3"/>
       </w:pPr>
-      <w:bookmarkStart w:id="15" w:name="_Toc215672581"/>
+      <w:bookmarkStart w:id="15" w:name="_Toc215733937"/>
       <w:r>
         <w:t>Tool Selection</w:t>
       </w:r>
@@ -4034,7 +4030,7 @@
       <w:pPr>
         <w:pStyle w:val="Heading3"/>
       </w:pPr>
-      <w:bookmarkStart w:id="16" w:name="_Toc215672582"/>
+      <w:bookmarkStart w:id="16" w:name="_Toc215733938"/>
       <w:r>
         <w:t>Palette Selection</w:t>
       </w:r>
@@ -4513,9 +4509,91 @@
     </w:p>
     <w:p>
       <w:pPr>
+        <w:keepNext/>
+      </w:pPr>
+      <w:r>
+        <w:rPr>
+          <w:noProof/>
+        </w:rPr>
+        <w:drawing>
+          <wp:inline distT="0" distB="0" distL="0" distR="0" wp14:anchorId="6FAF1D6D" wp14:editId="0DEE9A55">
+            <wp:extent cx="4273827" cy="1042516"/>
+            <wp:effectExtent l="0" t="0" r="0" b="0"/>
+            <wp:docPr id="816280406" name="Picture 9" descr="A green and brown rectangles&#10;&#10;AI-generated content may be incorrect."/>
+            <wp:cNvGraphicFramePr>
+              <a:graphicFrameLocks xmlns:a="http://schemas.openxmlformats.org/drawingml/2006/main" noChangeAspect="1"/>
+            </wp:cNvGraphicFramePr>
+            <a:graphic xmlns:a="http://schemas.openxmlformats.org/drawingml/2006/main">
+              <a:graphicData uri="http://schemas.openxmlformats.org/drawingml/2006/picture">
+                <pic:pic xmlns:pic="http://schemas.openxmlformats.org/drawingml/2006/picture">
+                  <pic:nvPicPr>
+                    <pic:cNvPr id="816280406" name="Picture 9" descr="A green and brown rectangles&#10;&#10;AI-generated content may be incorrect."/>
+                    <pic:cNvPicPr/>
+                  </pic:nvPicPr>
+                  <pic:blipFill>
+                    <a:blip r:embed="rId12" cstate="print">
+                      <a:extLst>
+                        <a:ext uri="{28A0092B-C50C-407E-A947-70E740481C1C}">
+                          <a14:useLocalDpi xmlns:a14="http://schemas.microsoft.com/office/drawing/2010/main" val="0"/>
+                        </a:ext>
+                      </a:extLst>
+                    </a:blip>
+                    <a:stretch>
+                      <a:fillRect/>
+                    </a:stretch>
+                  </pic:blipFill>
+                  <pic:spPr>
+                    <a:xfrm>
+                      <a:off x="0" y="0"/>
+                      <a:ext cx="4317589" cy="1053191"/>
+                    </a:xfrm>
+                    <a:prstGeom prst="rect">
+                      <a:avLst/>
+                    </a:prstGeom>
+                  </pic:spPr>
+                </pic:pic>
+              </a:graphicData>
+            </a:graphic>
+          </wp:inline>
+        </w:drawing>
+      </w:r>
+    </w:p>
+    <w:p>
+      <w:pPr>
+        <w:pStyle w:val="Caption"/>
+      </w:pPr>
+      <w:r>
+        <w:t xml:space="preserve">Figure </w:t>
+      </w:r>
+      <w:r>
+        <w:fldChar w:fldCharType="begin"/>
+      </w:r>
+      <w:r>
+        <w:instrText xml:space="preserve"> SEQ Figure \* ARABIC </w:instrText>
+      </w:r>
+      <w:r>
+        <w:fldChar w:fldCharType="separate"/>
+      </w:r>
+      <w:r>
+        <w:rPr>
+          <w:noProof/>
+        </w:rPr>
+        <w:t>3</w:t>
+      </w:r>
+      <w:r>
+        <w:fldChar w:fldCharType="end"/>
+      </w:r>
+      <w:r>
+        <w:t xml:space="preserve"> - Gradients for report and presentation.</w:t>
+      </w:r>
+    </w:p>
+    <w:p/>
+    <w:p/>
+    <w:p>
+      <w:pPr>
         <w:pStyle w:val="Heading3"/>
       </w:pPr>
-      <w:bookmarkStart w:id="17" w:name="_Toc215672583"/>
+      <w:bookmarkStart w:id="17" w:name="_Toc215733939"/>
       <w:r>
         <w:t>Chart Selection</w:t>
       </w:r>
@@ -4619,7 +4697,7 @@
       <w:pPr>
         <w:pStyle w:val="Heading3"/>
       </w:pPr>
-      <w:bookmarkStart w:id="18" w:name="_Toc215672584"/>
+      <w:bookmarkStart w:id="18" w:name="_Toc215733940"/>
       <w:r>
         <w:t>Storyboard</w:t>
       </w:r>
@@ -4695,7 +4773,7 @@
       <w:pPr>
         <w:pStyle w:val="Heading1"/>
       </w:pPr>
-      <w:bookmarkStart w:id="19" w:name="_Toc215672585"/>
+      <w:bookmarkStart w:id="19" w:name="_Toc215733941"/>
       <w:r>
         <w:lastRenderedPageBreak/>
         <w:t>Part 3 - Results – From Launch to Litter</w:t>
@@ -5013,7 +5091,7 @@
       <w:pPr>
         <w:pStyle w:val="Heading2"/>
       </w:pPr>
-      <w:bookmarkStart w:id="20" w:name="_Toc215672586"/>
+      <w:bookmarkStart w:id="20" w:name="_Toc215733942"/>
       <w:r>
         <w:t>What is the current state of orbital congestion, and how has it evolved since space exploration began in the late 1950s?</w:t>
       </w:r>
@@ -5091,7 +5169,7 @@
                               <w:rPr>
                                 <w:noProof/>
                               </w:rPr>
-                              <w:t>3</w:t>
+                              <w:t>4</w:t>
                             </w:r>
                             <w:r>
                               <w:fldChar w:fldCharType="end"/>
@@ -5147,7 +5225,7 @@
                         <w:rPr>
                           <w:noProof/>
                         </w:rPr>
-                        <w:t>3</w:t>
+                        <w:t>4</w:t>
                       </w:r>
                       <w:r>
                         <w:fldChar w:fldCharType="end"/>
@@ -5197,7 +5275,7 @@
                     </pic:cNvPicPr>
                   </pic:nvPicPr>
                   <pic:blipFill>
-                    <a:blip r:embed="rId12"/>
+                    <a:blip r:embed="rId13"/>
                     <a:stretch>
                       <a:fillRect/>
                     </a:stretch>
@@ -5224,7 +5302,10 @@
         </w:drawing>
       </w:r>
       <w:r>
-        <w:t xml:space="preserve">In the 1950s and 60s, satellite technology was mainly focused on defence capability and on space exploration. While there was some private commercial interest, most satellite programs were government backed. </w:t>
+        <w:t>In the 1950s and 60s, satellite technology was mainly focused on defence capability and on space exploration. While there was some private commercial interest, most satellite programs were government backed</w:t>
+      </w:r>
+      <w:r>
+        <w:t xml:space="preserve"> (figure 4).</w:t>
       </w:r>
     </w:p>
     <w:p>
@@ -5256,7 +5337,13 @@
       </w:r>
       <w:r>
         <w:noBreakHyphen/>
-        <w:t>term sustainability. The late 1990s saw a notable collision between an Ariane rocket piece and the French Cerise satellite (Alby 1997). At this time, rocket bodies often broke up increasing the debris count significantly, as shown Figure 2, leading to guidelines around improving sustainability and debris reduction (COPUOS 1999).</w:t>
+        <w:t xml:space="preserve">term sustainability. The late 1990s saw a notable collision between an Ariane rocket piece and the French Cerise satellite (Alby 1997). At this time, rocket bodies often broke up increasing the debris count significantly, as shown Figure </w:t>
+      </w:r>
+      <w:r>
+        <w:t>5</w:t>
+      </w:r>
+      <w:r>
+        <w:t>, leading to guidelines around improving sustainability and debris reduction (COPUOS 1999).</w:t>
       </w:r>
     </w:p>
     <w:p>
@@ -5284,7 +5371,7 @@
                     <pic:cNvPicPr/>
                   </pic:nvPicPr>
                   <pic:blipFill>
-                    <a:blip r:embed="rId13">
+                    <a:blip r:embed="rId14">
                       <a:extLst>
                         <a:ext uri="{28A0092B-C50C-407E-A947-70E740481C1C}">
                           <a14:useLocalDpi xmlns:a14="http://schemas.microsoft.com/office/drawing/2010/main" val="0"/>
@@ -5334,28 +5421,34 @@
         <w:rPr>
           <w:noProof/>
         </w:rPr>
+        <w:t>5</w:t>
+      </w:r>
+      <w:r>
+        <w:fldChar w:fldCharType="end"/>
+      </w:r>
+      <w:r>
+        <w:t xml:space="preserve"> - </w:t>
+      </w:r>
+      <w:r>
+        <w:t xml:space="preserve">Debris has always been an issue, but especially so in the </w:t>
+      </w:r>
+      <w:r>
+        <w:t xml:space="preserve">late </w:t>
+      </w:r>
+      <w:r>
+        <w:t>1990s.</w:t>
+      </w:r>
+    </w:p>
+    <w:p/>
+    <w:p>
+      <w:r>
+        <w:t xml:space="preserve">The late 2010s and 2020s have marked a turning point, with firms like SpaceX, OneWeb, and Amazon becoming the majority stakeholders in satellite deployments. Figure </w:t>
+      </w:r>
+      <w:r>
         <w:t>4</w:t>
       </w:r>
       <w:r>
-        <w:fldChar w:fldCharType="end"/>
-      </w:r>
-      <w:r>
-        <w:t xml:space="preserve"> - </w:t>
-      </w:r>
-      <w:r>
-        <w:t xml:space="preserve">Debris has always been an issue, but especially so in the </w:t>
-      </w:r>
-      <w:r>
-        <w:t xml:space="preserve">late </w:t>
-      </w:r>
-      <w:r>
-        <w:t>1990s.</w:t>
-      </w:r>
-    </w:p>
-    <w:p/>
-    <w:p>
-      <w:r>
-        <w:t>The late 2010s and 2020s have marked a turning point, with firms like SpaceX, OneWeb, and Amazon becoming the majority stakeholders in satellite deployments. Figure 1 also shows a recent increase in the deployment of defence capability, which may be a reaction to global hostilities.</w:t>
+        <w:t xml:space="preserve"> also shows a recent increase in the deployment of defence capability, which may be a reaction to global hostilities.</w:t>
       </w:r>
     </w:p>
     <w:p>
@@ -5422,60 +5515,23 @@
     </w:p>
     <w:p/>
     <w:p>
-      <w:r>
-        <w:rPr>
-          <w:rStyle w:val="Strong"/>
+      <w:pPr>
+        <w:keepNext/>
+      </w:pPr>
+      <w:r>
+        <w:rPr>
           <w:rFonts w:eastAsia="Arial" w:cs="Arial"/>
-          <w:b w:val="0"/>
-          <w:bCs w:val="0"/>
+          <w:noProof/>
           <w:kern w:val="0"/>
           <w:szCs w:val="22"/>
           <w:lang w:eastAsia="en-US" w:bidi="ar-SA"/>
         </w:rPr>
         <w:lastRenderedPageBreak/>
-        <w:t xml:space="preserve">The number of objects </w:t>
-      </w:r>
-      <w:r>
-        <w:rPr>
-          <w:rStyle w:val="Strong"/>
-          <w:rFonts w:eastAsia="Arial" w:cs="Arial"/>
-          <w:b w:val="0"/>
-          <w:bCs w:val="0"/>
-          <w:kern w:val="0"/>
-          <w:szCs w:val="22"/>
-          <w:lang w:eastAsia="en-US" w:bidi="ar-SA"/>
-        </w:rPr>
-        <w:t xml:space="preserve">in orbit </w:t>
-      </w:r>
-      <w:r>
-        <w:rPr>
-          <w:rStyle w:val="Strong"/>
-          <w:rFonts w:eastAsia="Arial" w:cs="Arial"/>
-          <w:b w:val="0"/>
-          <w:bCs w:val="0"/>
-          <w:kern w:val="0"/>
-          <w:szCs w:val="22"/>
-          <w:lang w:eastAsia="en-US" w:bidi="ar-SA"/>
-        </w:rPr>
-        <w:t>has grown over time, as the number added has increased faster than objects have re-entered the atmosphere, as shown in Figure 4.</w:t>
-      </w:r>
-    </w:p>
-    <w:p>
-      <w:pPr>
-        <w:keepNext/>
-      </w:pPr>
-      <w:r>
-        <w:rPr>
-          <w:rFonts w:ascii="Nimbus Sans" w:eastAsia="Arial" w:hAnsi="Nimbus Sans" w:cs="Arial"/>
-          <w:noProof/>
-          <w:kern w:val="0"/>
-          <w:lang w:eastAsia="en-US" w:bidi="ar-SA"/>
-        </w:rPr>
         <w:drawing>
-          <wp:inline distT="0" distB="0" distL="0" distR="0" wp14:anchorId="508469AC" wp14:editId="61417EF8">
-            <wp:extent cx="6120130" cy="3035300"/>
+          <wp:inline distT="0" distB="0" distL="0" distR="0" wp14:anchorId="6BB1EF20" wp14:editId="693BDAA8">
+            <wp:extent cx="6120130" cy="3435985"/>
             <wp:effectExtent l="0" t="0" r="1270" b="0"/>
-            <wp:docPr id="1737676860" name="Picture 6" descr="A graph showing the number of objects in orbit&#10;&#10;AI-generated content may be incorrect."/>
+            <wp:docPr id="1025249768" name="Picture 10" descr="A graph of a pie chart&#10;&#10;AI-generated content may be incorrect."/>
             <wp:cNvGraphicFramePr>
               <a:graphicFrameLocks xmlns:a="http://schemas.openxmlformats.org/drawingml/2006/main" noChangeAspect="1"/>
             </wp:cNvGraphicFramePr>
@@ -5483,235 +5539,7 @@
               <a:graphicData uri="http://schemas.openxmlformats.org/drawingml/2006/picture">
                 <pic:pic xmlns:pic="http://schemas.openxmlformats.org/drawingml/2006/picture">
                   <pic:nvPicPr>
-                    <pic:cNvPr id="1737676860" name="Picture 6" descr="A graph showing the number of objects in orbit&#10;&#10;AI-generated content may be incorrect."/>
-                    <pic:cNvPicPr/>
-                  </pic:nvPicPr>
-                  <pic:blipFill>
-                    <a:blip r:embed="rId14">
-                      <a:extLst>
-                        <a:ext uri="{28A0092B-C50C-407E-A947-70E740481C1C}">
-                          <a14:useLocalDpi xmlns:a14="http://schemas.microsoft.com/office/drawing/2010/main" val="0"/>
-                        </a:ext>
-                      </a:extLst>
-                    </a:blip>
-                    <a:stretch>
-                      <a:fillRect/>
-                    </a:stretch>
-                  </pic:blipFill>
-                  <pic:spPr>
-                    <a:xfrm>
-                      <a:off x="0" y="0"/>
-                      <a:ext cx="6120130" cy="3035300"/>
-                    </a:xfrm>
-                    <a:prstGeom prst="rect">
-                      <a:avLst/>
-                    </a:prstGeom>
-                  </pic:spPr>
-                </pic:pic>
-              </a:graphicData>
-            </a:graphic>
-          </wp:inline>
-        </w:drawing>
-      </w:r>
-    </w:p>
-    <w:p>
-      <w:pPr>
-        <w:pStyle w:val="Caption"/>
-        <w:rPr>
-          <w:rStyle w:val="Strong"/>
-          <w:rFonts w:ascii="Nimbus Sans" w:eastAsia="Arial" w:hAnsi="Nimbus Sans" w:cs="Arial"/>
-          <w:b w:val="0"/>
-          <w:bCs w:val="0"/>
-          <w:kern w:val="0"/>
-          <w:lang w:eastAsia="en-US" w:bidi="ar-SA"/>
-        </w:rPr>
-      </w:pPr>
-      <w:r>
-        <w:t xml:space="preserve">Figure </w:t>
-      </w:r>
-      <w:r>
-        <w:fldChar w:fldCharType="begin"/>
-      </w:r>
-      <w:r>
-        <w:instrText xml:space="preserve"> SEQ Figure \* ARABIC </w:instrText>
-      </w:r>
-      <w:r>
-        <w:fldChar w:fldCharType="separate"/>
-      </w:r>
-      <w:r>
-        <w:rPr>
-          <w:noProof/>
-        </w:rPr>
-        <w:t>5</w:t>
-      </w:r>
-      <w:r>
-        <w:fldChar w:fldCharType="end"/>
-      </w:r>
-      <w:r>
-        <w:t xml:space="preserve"> -</w:t>
-      </w:r>
-      <w:r>
-        <w:t xml:space="preserve"> Breakdown of payloads in orbit, </w:t>
-      </w:r>
-      <w:r>
-        <w:t xml:space="preserve">as of </w:t>
-      </w:r>
-      <w:r>
-        <w:t>1st Dec</w:t>
-      </w:r>
-      <w:r>
-        <w:t>ember</w:t>
-      </w:r>
-      <w:r>
-        <w:t xml:space="preserve"> 2025</w:t>
-      </w:r>
-    </w:p>
-    <w:p>
-      <w:pPr>
-        <w:rPr>
-          <w:rStyle w:val="Strong"/>
-          <w:rFonts w:ascii="Nimbus Sans" w:eastAsia="Arial" w:hAnsi="Nimbus Sans" w:cs="Arial"/>
-          <w:b w:val="0"/>
-          <w:bCs w:val="0"/>
-          <w:kern w:val="0"/>
-          <w:lang w:eastAsia="en-US" w:bidi="ar-SA"/>
-        </w:rPr>
-      </w:pPr>
-    </w:p>
-    <w:p>
-      <w:r>
-        <w:rPr>
-          <w:rStyle w:val="Strong"/>
-          <w:rFonts w:eastAsia="Arial" w:cs="Arial"/>
-          <w:b w:val="0"/>
-          <w:bCs w:val="0"/>
-          <w:kern w:val="0"/>
-          <w:szCs w:val="22"/>
-          <w:lang w:eastAsia="en-US" w:bidi="ar-SA"/>
-        </w:rPr>
-        <w:t>The total mass of the satellite payloads in orbit is 13,174 metric tons</w:t>
-      </w:r>
-      <w:r>
-        <w:rPr>
-          <w:rStyle w:val="Strong"/>
-          <w:rFonts w:eastAsia="Arial" w:cs="Arial"/>
-          <w:b w:val="0"/>
-          <w:bCs w:val="0"/>
-          <w:kern w:val="0"/>
-          <w:szCs w:val="22"/>
-          <w:lang w:eastAsia="en-US" w:bidi="ar-SA"/>
-        </w:rPr>
-        <w:t xml:space="preserve">, which is </w:t>
-      </w:r>
-      <w:r>
-        <w:rPr>
-          <w:rStyle w:val="Strong"/>
-          <w:rFonts w:eastAsia="Arial" w:cs="Arial"/>
-          <w:b w:val="0"/>
-          <w:bCs w:val="0"/>
-          <w:kern w:val="0"/>
-          <w:szCs w:val="22"/>
-          <w:lang w:eastAsia="en-US" w:bidi="ar-SA"/>
-        </w:rPr>
-        <w:t>the same as</w:t>
-      </w:r>
-      <w:r>
-        <w:rPr>
-          <w:rStyle w:val="Strong"/>
-          <w:rFonts w:eastAsia="Arial" w:cs="Arial"/>
-          <w:b w:val="0"/>
-          <w:bCs w:val="0"/>
-          <w:kern w:val="0"/>
-          <w:szCs w:val="22"/>
-          <w:lang w:eastAsia="en-US" w:bidi="ar-SA"/>
-        </w:rPr>
-        <w:t xml:space="preserve"> </w:t>
-      </w:r>
-      <w:r>
-        <w:rPr>
-          <w:rStyle w:val="Strong"/>
-          <w:rFonts w:eastAsia="Arial" w:cs="Arial"/>
-          <w:b w:val="0"/>
-          <w:bCs w:val="0"/>
-          <w:kern w:val="0"/>
-          <w:szCs w:val="22"/>
-          <w:lang w:eastAsia="en-US" w:bidi="ar-SA"/>
-        </w:rPr>
-        <w:t xml:space="preserve">1,062 London buses (London Assembly 2014). Figure </w:t>
-      </w:r>
-      <w:r>
-        <w:rPr>
-          <w:rStyle w:val="Strong"/>
-          <w:rFonts w:eastAsia="Arial" w:cs="Arial"/>
-          <w:b w:val="0"/>
-          <w:bCs w:val="0"/>
-          <w:kern w:val="0"/>
-          <w:szCs w:val="22"/>
-          <w:lang w:eastAsia="en-US" w:bidi="ar-SA"/>
-        </w:rPr>
-        <w:t>6</w:t>
-      </w:r>
-      <w:r>
-        <w:rPr>
-          <w:rStyle w:val="Strong"/>
-          <w:rFonts w:eastAsia="Arial" w:cs="Arial"/>
-          <w:b w:val="0"/>
-          <w:bCs w:val="0"/>
-          <w:kern w:val="0"/>
-          <w:szCs w:val="22"/>
-          <w:lang w:eastAsia="en-US" w:bidi="ar-SA"/>
-        </w:rPr>
-        <w:t xml:space="preserve"> shows the relative mass of the top twenty satellite programs. </w:t>
-      </w:r>
-      <w:r>
-        <w:rPr>
-          <w:rStyle w:val="Strong"/>
-          <w:rFonts w:eastAsia="Arial" w:cs="Arial"/>
-          <w:b w:val="0"/>
-          <w:bCs w:val="0"/>
-          <w:kern w:val="0"/>
-          <w:szCs w:val="22"/>
-          <w:lang w:eastAsia="en-US" w:bidi="ar-SA"/>
-        </w:rPr>
-        <w:t>The</w:t>
-      </w:r>
-      <w:r>
-        <w:rPr>
-          <w:rStyle w:val="Strong"/>
-          <w:rFonts w:eastAsia="Arial" w:cs="Arial"/>
-          <w:b w:val="0"/>
-          <w:bCs w:val="0"/>
-          <w:kern w:val="0"/>
-          <w:szCs w:val="22"/>
-          <w:lang w:eastAsia="en-US" w:bidi="ar-SA"/>
-        </w:rPr>
-        <w:t xml:space="preserve"> bulk of the global satellite fleet are commercial communications devices.</w:t>
-      </w:r>
-    </w:p>
-    <w:p>
-      <w:pPr>
-        <w:keepNext/>
-      </w:pPr>
-      <w:r>
-        <w:rPr>
-          <w:rFonts w:ascii="Nimbus Sans" w:eastAsia="Arial" w:hAnsi="Nimbus Sans" w:cs="Arial"/>
-          <w:noProof/>
-          <w:kern w:val="0"/>
-          <w:lang w:eastAsia="en-US" w:bidi="ar-SA"/>
-        </w:rPr>
-        <w:drawing>
-          <wp:inline distT="0" distB="0" distL="0" distR="0" wp14:anchorId="0EBFF83C" wp14:editId="2E18F8C5">
-            <wp:extent cx="6120130" cy="3435985"/>
-            <wp:effectExtent l="0" t="0" r="0" b="5715"/>
-            <wp:docPr id="1263068292" name="Picture 7"/>
-            <wp:cNvGraphicFramePr>
-              <a:graphicFrameLocks xmlns:a="http://schemas.openxmlformats.org/drawingml/2006/main" noChangeAspect="1"/>
-            </wp:cNvGraphicFramePr>
-            <a:graphic xmlns:a="http://schemas.openxmlformats.org/drawingml/2006/main">
-              <a:graphicData uri="http://schemas.openxmlformats.org/drawingml/2006/picture">
-                <pic:pic xmlns:pic="http://schemas.openxmlformats.org/drawingml/2006/picture">
-                  <pic:nvPicPr>
-                    <pic:cNvPr id="1263068292" name="Picture 1263068292"/>
+                    <pic:cNvPr id="1025249768" name="Picture 10" descr="A graph of a pie chart&#10;&#10;AI-generated content may be incorrect."/>
                     <pic:cNvPicPr/>
                   </pic:nvPicPr>
                   <pic:blipFill>
@@ -5745,6 +5573,165 @@
     <w:p>
       <w:pPr>
         <w:pStyle w:val="Caption"/>
+      </w:pPr>
+      <w:r>
+        <w:t xml:space="preserve">Figure </w:t>
+      </w:r>
+      <w:r>
+        <w:fldChar w:fldCharType="begin"/>
+      </w:r>
+      <w:r>
+        <w:instrText xml:space="preserve"> SEQ Figure \* ARABIC </w:instrText>
+      </w:r>
+      <w:r>
+        <w:fldChar w:fldCharType="separate"/>
+      </w:r>
+      <w:r>
+        <w:rPr>
+          <w:noProof/>
+        </w:rPr>
+        <w:t>6</w:t>
+      </w:r>
+      <w:r>
+        <w:fldChar w:fldCharType="end"/>
+      </w:r>
+      <w:r>
+        <w:t xml:space="preserve"> - Breakdown of objects in orbit, and payload categories.</w:t>
+      </w:r>
+    </w:p>
+    <w:p>
+      <w:pPr>
+        <w:pStyle w:val="Caption"/>
+        <w:rPr>
+          <w:rStyle w:val="Strong"/>
+          <w:rFonts w:eastAsia="Arial" w:cs="Arial"/>
+          <w:b w:val="0"/>
+          <w:bCs w:val="0"/>
+          <w:kern w:val="0"/>
+          <w:szCs w:val="22"/>
+          <w:lang w:eastAsia="en-US" w:bidi="ar-SA"/>
+        </w:rPr>
+      </w:pPr>
+    </w:p>
+    <w:p>
+      <w:r>
+        <w:rPr>
+          <w:rStyle w:val="Strong"/>
+          <w:rFonts w:eastAsia="Arial" w:cs="Arial"/>
+          <w:b w:val="0"/>
+          <w:bCs w:val="0"/>
+          <w:kern w:val="0"/>
+          <w:szCs w:val="22"/>
+          <w:lang w:eastAsia="en-US" w:bidi="ar-SA"/>
+        </w:rPr>
+        <w:t xml:space="preserve">The number of objects </w:t>
+      </w:r>
+      <w:r>
+        <w:rPr>
+          <w:rStyle w:val="Strong"/>
+          <w:rFonts w:eastAsia="Arial" w:cs="Arial"/>
+          <w:b w:val="0"/>
+          <w:bCs w:val="0"/>
+          <w:kern w:val="0"/>
+          <w:szCs w:val="22"/>
+          <w:lang w:eastAsia="en-US" w:bidi="ar-SA"/>
+        </w:rPr>
+        <w:t xml:space="preserve">in orbit </w:t>
+      </w:r>
+      <w:r>
+        <w:rPr>
+          <w:rStyle w:val="Strong"/>
+          <w:rFonts w:eastAsia="Arial" w:cs="Arial"/>
+          <w:b w:val="0"/>
+          <w:bCs w:val="0"/>
+          <w:kern w:val="0"/>
+          <w:szCs w:val="22"/>
+          <w:lang w:eastAsia="en-US" w:bidi="ar-SA"/>
+        </w:rPr>
+        <w:t xml:space="preserve">has grown over time, as the number added has increased faster than objects have re-entered the atmosphere, as shown in Figure </w:t>
+      </w:r>
+      <w:r>
+        <w:rPr>
+          <w:rStyle w:val="Strong"/>
+          <w:rFonts w:eastAsia="Arial" w:cs="Arial"/>
+          <w:b w:val="0"/>
+          <w:bCs w:val="0"/>
+          <w:kern w:val="0"/>
+          <w:szCs w:val="22"/>
+          <w:lang w:eastAsia="en-US" w:bidi="ar-SA"/>
+        </w:rPr>
+        <w:t>7</w:t>
+      </w:r>
+      <w:r>
+        <w:rPr>
+          <w:rStyle w:val="Strong"/>
+          <w:rFonts w:eastAsia="Arial" w:cs="Arial"/>
+          <w:b w:val="0"/>
+          <w:bCs w:val="0"/>
+          <w:kern w:val="0"/>
+          <w:szCs w:val="22"/>
+          <w:lang w:eastAsia="en-US" w:bidi="ar-SA"/>
+        </w:rPr>
+        <w:t>.</w:t>
+      </w:r>
+    </w:p>
+    <w:p>
+      <w:pPr>
+        <w:keepNext/>
+      </w:pPr>
+      <w:r>
+        <w:rPr>
+          <w:rFonts w:ascii="Nimbus Sans" w:eastAsia="Arial" w:hAnsi="Nimbus Sans" w:cs="Arial"/>
+          <w:noProof/>
+          <w:kern w:val="0"/>
+          <w:lang w:eastAsia="en-US" w:bidi="ar-SA"/>
+        </w:rPr>
+        <w:drawing>
+          <wp:inline distT="0" distB="0" distL="0" distR="0" wp14:anchorId="508469AC" wp14:editId="10B60D45">
+            <wp:extent cx="5784574" cy="2868880"/>
+            <wp:effectExtent l="0" t="0" r="0" b="1905"/>
+            <wp:docPr id="1737676860" name="Picture 6" descr="A graph showing the number of objects in orbit&#10;&#10;AI-generated content may be incorrect."/>
+            <wp:cNvGraphicFramePr>
+              <a:graphicFrameLocks xmlns:a="http://schemas.openxmlformats.org/drawingml/2006/main" noChangeAspect="1"/>
+            </wp:cNvGraphicFramePr>
+            <a:graphic xmlns:a="http://schemas.openxmlformats.org/drawingml/2006/main">
+              <a:graphicData uri="http://schemas.openxmlformats.org/drawingml/2006/picture">
+                <pic:pic xmlns:pic="http://schemas.openxmlformats.org/drawingml/2006/picture">
+                  <pic:nvPicPr>
+                    <pic:cNvPr id="1737676860" name="Picture 6" descr="A graph showing the number of objects in orbit&#10;&#10;AI-generated content may be incorrect."/>
+                    <pic:cNvPicPr/>
+                  </pic:nvPicPr>
+                  <pic:blipFill>
+                    <a:blip r:embed="rId16">
+                      <a:extLst>
+                        <a:ext uri="{28A0092B-C50C-407E-A947-70E740481C1C}">
+                          <a14:useLocalDpi xmlns:a14="http://schemas.microsoft.com/office/drawing/2010/main" val="0"/>
+                        </a:ext>
+                      </a:extLst>
+                    </a:blip>
+                    <a:stretch>
+                      <a:fillRect/>
+                    </a:stretch>
+                  </pic:blipFill>
+                  <pic:spPr>
+                    <a:xfrm>
+                      <a:off x="0" y="0"/>
+                      <a:ext cx="5804903" cy="2878962"/>
+                    </a:xfrm>
+                    <a:prstGeom prst="rect">
+                      <a:avLst/>
+                    </a:prstGeom>
+                  </pic:spPr>
+                </pic:pic>
+              </a:graphicData>
+            </a:graphic>
+          </wp:inline>
+        </w:drawing>
+      </w:r>
+    </w:p>
+    <w:p>
+      <w:pPr>
+        <w:pStyle w:val="Caption"/>
         <w:rPr>
           <w:rStyle w:val="Strong"/>
           <w:rFonts w:ascii="Nimbus Sans" w:eastAsia="Arial" w:hAnsi="Nimbus Sans" w:cs="Arial"/>
@@ -5770,13 +5757,28 @@
         <w:rPr>
           <w:noProof/>
         </w:rPr>
-        <w:t>6</w:t>
+        <w:t>7</w:t>
       </w:r>
       <w:r>
         <w:fldChar w:fldCharType="end"/>
       </w:r>
       <w:r>
-        <w:t xml:space="preserve"> - Masses of payloads in orbit, as of 1st December 2025</w:t>
+        <w:t xml:space="preserve"> -</w:t>
+      </w:r>
+      <w:r>
+        <w:t xml:space="preserve"> Breakdown of payloads in orbit, </w:t>
+      </w:r>
+      <w:r>
+        <w:t xml:space="preserve">as of </w:t>
+      </w:r>
+      <w:r>
+        <w:t>1st Dec</w:t>
+      </w:r>
+      <w:r>
+        <w:t>ember</w:t>
+      </w:r>
+      <w:r>
+        <w:t xml:space="preserve"> 2025</w:t>
       </w:r>
     </w:p>
     <w:p>
@@ -5792,12 +5794,291 @@
       </w:pPr>
     </w:p>
     <w:p>
+      <w:r>
+        <w:rPr>
+          <w:rStyle w:val="Strong"/>
+          <w:rFonts w:eastAsia="Arial" w:cs="Arial"/>
+          <w:b w:val="0"/>
+          <w:bCs w:val="0"/>
+          <w:kern w:val="0"/>
+          <w:szCs w:val="22"/>
+          <w:lang w:eastAsia="en-US" w:bidi="ar-SA"/>
+        </w:rPr>
+        <w:t>The total mass of the satellite payloads in orbit is 13,174 metric tons</w:t>
+      </w:r>
+      <w:r>
+        <w:rPr>
+          <w:rStyle w:val="Strong"/>
+          <w:rFonts w:eastAsia="Arial" w:cs="Arial"/>
+          <w:b w:val="0"/>
+          <w:bCs w:val="0"/>
+          <w:kern w:val="0"/>
+          <w:szCs w:val="22"/>
+          <w:lang w:eastAsia="en-US" w:bidi="ar-SA"/>
+        </w:rPr>
+        <w:t xml:space="preserve">, which is </w:t>
+      </w:r>
+      <w:r>
+        <w:rPr>
+          <w:rStyle w:val="Strong"/>
+          <w:rFonts w:eastAsia="Arial" w:cs="Arial"/>
+          <w:b w:val="0"/>
+          <w:bCs w:val="0"/>
+          <w:kern w:val="0"/>
+          <w:szCs w:val="22"/>
+          <w:lang w:eastAsia="en-US" w:bidi="ar-SA"/>
+        </w:rPr>
+        <w:t>the same as</w:t>
+      </w:r>
+      <w:r>
+        <w:rPr>
+          <w:rStyle w:val="Strong"/>
+          <w:rFonts w:eastAsia="Arial" w:cs="Arial"/>
+          <w:b w:val="0"/>
+          <w:bCs w:val="0"/>
+          <w:kern w:val="0"/>
+          <w:szCs w:val="22"/>
+          <w:lang w:eastAsia="en-US" w:bidi="ar-SA"/>
+        </w:rPr>
+        <w:t xml:space="preserve"> </w:t>
+      </w:r>
+      <w:r>
+        <w:rPr>
+          <w:rStyle w:val="Strong"/>
+          <w:rFonts w:eastAsia="Arial" w:cs="Arial"/>
+          <w:b w:val="0"/>
+          <w:bCs w:val="0"/>
+          <w:kern w:val="0"/>
+          <w:szCs w:val="22"/>
+          <w:lang w:eastAsia="en-US" w:bidi="ar-SA"/>
+        </w:rPr>
+        <w:t xml:space="preserve">1,062 London buses (London Assembly 2014). Figure </w:t>
+      </w:r>
+      <w:r>
+        <w:rPr>
+          <w:rStyle w:val="Strong"/>
+          <w:rFonts w:eastAsia="Arial" w:cs="Arial"/>
+          <w:b w:val="0"/>
+          <w:bCs w:val="0"/>
+          <w:kern w:val="0"/>
+          <w:szCs w:val="22"/>
+          <w:lang w:eastAsia="en-US" w:bidi="ar-SA"/>
+        </w:rPr>
+        <w:t>8</w:t>
+      </w:r>
+      <w:r>
+        <w:rPr>
+          <w:rStyle w:val="Strong"/>
+          <w:rFonts w:eastAsia="Arial" w:cs="Arial"/>
+          <w:b w:val="0"/>
+          <w:bCs w:val="0"/>
+          <w:kern w:val="0"/>
+          <w:szCs w:val="22"/>
+          <w:lang w:eastAsia="en-US" w:bidi="ar-SA"/>
+        </w:rPr>
+        <w:t xml:space="preserve"> shows the</w:t>
+      </w:r>
+      <w:r>
+        <w:rPr>
+          <w:rStyle w:val="Strong"/>
+          <w:rFonts w:eastAsia="Arial" w:cs="Arial"/>
+          <w:b w:val="0"/>
+          <w:bCs w:val="0"/>
+          <w:kern w:val="0"/>
+          <w:szCs w:val="22"/>
+          <w:lang w:eastAsia="en-US" w:bidi="ar-SA"/>
+        </w:rPr>
+        <w:t xml:space="preserve"> </w:t>
+      </w:r>
+      <w:r>
+        <w:rPr>
+          <w:rStyle w:val="Strong"/>
+          <w:rFonts w:eastAsia="Arial" w:cs="Arial"/>
+          <w:b w:val="0"/>
+          <w:bCs w:val="0"/>
+          <w:kern w:val="0"/>
+          <w:szCs w:val="22"/>
+          <w:lang w:eastAsia="en-US" w:bidi="ar-SA"/>
+        </w:rPr>
+        <w:t xml:space="preserve">relative mass </w:t>
+      </w:r>
+      <w:r>
+        <w:rPr>
+          <w:rStyle w:val="Strong"/>
+          <w:rFonts w:eastAsia="Arial" w:cs="Arial"/>
+          <w:b w:val="0"/>
+          <w:bCs w:val="0"/>
+          <w:kern w:val="0"/>
+          <w:szCs w:val="22"/>
+          <w:lang w:eastAsia="en-US" w:bidi="ar-SA"/>
+        </w:rPr>
+        <w:t xml:space="preserve">by category and </w:t>
+      </w:r>
+      <w:r>
+        <w:rPr>
+          <w:rStyle w:val="Strong"/>
+          <w:rFonts w:eastAsia="Arial" w:cs="Arial"/>
+          <w:b w:val="0"/>
+          <w:bCs w:val="0"/>
+          <w:kern w:val="0"/>
+          <w:szCs w:val="22"/>
+          <w:lang w:eastAsia="en-US" w:bidi="ar-SA"/>
+        </w:rPr>
+        <w:t xml:space="preserve">of the top twenty satellite programs. </w:t>
+      </w:r>
+      <w:r>
+        <w:rPr>
+          <w:rStyle w:val="Strong"/>
+          <w:rFonts w:eastAsia="Arial" w:cs="Arial"/>
+          <w:b w:val="0"/>
+          <w:bCs w:val="0"/>
+          <w:kern w:val="0"/>
+          <w:szCs w:val="22"/>
+          <w:lang w:eastAsia="en-US" w:bidi="ar-SA"/>
+        </w:rPr>
+        <w:t>The</w:t>
+      </w:r>
+      <w:r>
+        <w:rPr>
+          <w:rStyle w:val="Strong"/>
+          <w:rFonts w:eastAsia="Arial" w:cs="Arial"/>
+          <w:b w:val="0"/>
+          <w:bCs w:val="0"/>
+          <w:kern w:val="0"/>
+          <w:szCs w:val="22"/>
+          <w:lang w:eastAsia="en-US" w:bidi="ar-SA"/>
+        </w:rPr>
+        <w:t xml:space="preserve"> bulk of the global satellite fleet are commercial communications devices.</w:t>
+      </w:r>
+    </w:p>
+    <w:p>
+      <w:pPr>
+        <w:keepNext/>
+      </w:pPr>
+      <w:r>
+        <w:rPr>
+          <w:rFonts w:ascii="Nimbus Sans" w:eastAsia="Arial" w:hAnsi="Nimbus Sans" w:cs="Arial"/>
+          <w:noProof/>
+          <w:kern w:val="0"/>
+          <w:lang w:eastAsia="en-US" w:bidi="ar-SA"/>
+        </w:rPr>
+        <w:lastRenderedPageBreak/>
+        <w:drawing>
+          <wp:inline distT="0" distB="0" distL="0" distR="0" wp14:anchorId="0EBFF83C" wp14:editId="2E18F8C5">
+            <wp:extent cx="6120130" cy="3435985"/>
+            <wp:effectExtent l="0" t="0" r="0" b="5715"/>
+            <wp:docPr id="1263068292" name="Picture 7"/>
+            <wp:cNvGraphicFramePr>
+              <a:graphicFrameLocks xmlns:a="http://schemas.openxmlformats.org/drawingml/2006/main" noChangeAspect="1"/>
+            </wp:cNvGraphicFramePr>
+            <a:graphic xmlns:a="http://schemas.openxmlformats.org/drawingml/2006/main">
+              <a:graphicData uri="http://schemas.openxmlformats.org/drawingml/2006/picture">
+                <pic:pic xmlns:pic="http://schemas.openxmlformats.org/drawingml/2006/picture">
+                  <pic:nvPicPr>
+                    <pic:cNvPr id="1263068292" name="Picture 1263068292"/>
+                    <pic:cNvPicPr/>
+                  </pic:nvPicPr>
+                  <pic:blipFill>
+                    <a:blip r:embed="rId17">
+                      <a:extLst>
+                        <a:ext uri="{28A0092B-C50C-407E-A947-70E740481C1C}">
+                          <a14:useLocalDpi xmlns:a14="http://schemas.microsoft.com/office/drawing/2010/main" val="0"/>
+                        </a:ext>
+                      </a:extLst>
+                    </a:blip>
+                    <a:stretch>
+                      <a:fillRect/>
+                    </a:stretch>
+                  </pic:blipFill>
+                  <pic:spPr>
+                    <a:xfrm>
+                      <a:off x="0" y="0"/>
+                      <a:ext cx="6120130" cy="3435985"/>
+                    </a:xfrm>
+                    <a:prstGeom prst="rect">
+                      <a:avLst/>
+                    </a:prstGeom>
+                  </pic:spPr>
+                </pic:pic>
+              </a:graphicData>
+            </a:graphic>
+          </wp:inline>
+        </w:drawing>
+      </w:r>
+    </w:p>
+    <w:p>
+      <w:pPr>
+        <w:pStyle w:val="Caption"/>
+        <w:rPr>
+          <w:rStyle w:val="Strong"/>
+          <w:rFonts w:ascii="Nimbus Sans" w:eastAsia="Arial" w:hAnsi="Nimbus Sans" w:cs="Arial"/>
+          <w:b w:val="0"/>
+          <w:bCs w:val="0"/>
+          <w:kern w:val="0"/>
+          <w:lang w:eastAsia="en-US" w:bidi="ar-SA"/>
+        </w:rPr>
+      </w:pPr>
+      <w:r>
+        <w:t xml:space="preserve">Figure </w:t>
+      </w:r>
+      <w:r>
+        <w:fldChar w:fldCharType="begin"/>
+      </w:r>
+      <w:r>
+        <w:instrText xml:space="preserve"> SEQ Figure \* ARABIC </w:instrText>
+      </w:r>
+      <w:r>
+        <w:fldChar w:fldCharType="separate"/>
+      </w:r>
+      <w:r>
+        <w:rPr>
+          <w:noProof/>
+        </w:rPr>
+        <w:t>8</w:t>
+      </w:r>
+      <w:r>
+        <w:fldChar w:fldCharType="end"/>
+      </w:r>
+      <w:r>
+        <w:t xml:space="preserve"> </w:t>
+      </w:r>
+      <w:r>
+        <w:t>–</w:t>
+      </w:r>
+      <w:r>
+        <w:t xml:space="preserve"> </w:t>
+      </w:r>
+      <w:r>
+        <w:t>Total mass</w:t>
+      </w:r>
+      <w:r>
+        <w:t xml:space="preserve"> of payloads in orbit,</w:t>
+      </w:r>
+      <w:r>
+        <w:t xml:space="preserve"> and by program,</w:t>
+      </w:r>
+      <w:r>
+        <w:t xml:space="preserve"> as of 1st December 2025</w:t>
+      </w:r>
+    </w:p>
+    <w:p>
+      <w:pPr>
+        <w:rPr>
+          <w:rStyle w:val="Strong"/>
+          <w:rFonts w:ascii="Nimbus Sans" w:eastAsia="Arial" w:hAnsi="Nimbus Sans" w:cs="Arial"/>
+          <w:b w:val="0"/>
+          <w:bCs w:val="0"/>
+          <w:kern w:val="0"/>
+          <w:lang w:eastAsia="en-US" w:bidi="ar-SA"/>
+        </w:rPr>
+      </w:pPr>
+    </w:p>
+    <w:p>
       <w:pPr>
         <w:pStyle w:val="Heading2"/>
       </w:pPr>
-      <w:bookmarkStart w:id="21" w:name="_Toc215672587"/>
-      <w:r>
-        <w:lastRenderedPageBreak/>
+      <w:bookmarkStart w:id="21" w:name="_Toc215733943"/>
+      <w:r>
         <w:t>What trends in satellite launches are driving the risk of Kessler Syndrome?</w:t>
       </w:r>
       <w:bookmarkEnd w:id="21"/>
@@ -5877,7 +6158,7 @@
                               <w:rPr>
                                 <w:noProof/>
                               </w:rPr>
-                              <w:t>7</w:t>
+                              <w:t>9</w:t>
                             </w:r>
                             <w:r>
                               <w:fldChar w:fldCharType="end"/>
@@ -5930,7 +6211,7 @@
                         <w:rPr>
                           <w:noProof/>
                         </w:rPr>
-                        <w:t>7</w:t>
+                        <w:t>9</w:t>
                       </w:r>
                       <w:r>
                         <w:fldChar w:fldCharType="end"/>
@@ -5983,7 +6264,7 @@
                     <pic:cNvPicPr/>
                   </pic:nvPicPr>
                   <pic:blipFill>
-                    <a:blip r:embed="rId16" cstate="print">
+                    <a:blip r:embed="rId18" cstate="print">
                       <a:extLst>
                         <a:ext uri="{28A0092B-C50C-407E-A947-70E740481C1C}">
                           <a14:useLocalDpi xmlns:a14="http://schemas.microsoft.com/office/drawing/2010/main" val="0"/>
@@ -6056,7 +6337,7 @@
                     <pic:cNvPicPr/>
                   </pic:nvPicPr>
                   <pic:blipFill>
-                    <a:blip r:embed="rId16" cstate="print">
+                    <a:blip r:embed="rId18" cstate="print">
                       <a:extLst>
                         <a:ext uri="{28A0092B-C50C-407E-A947-70E740481C1C}">
                           <a14:useLocalDpi xmlns:a14="http://schemas.microsoft.com/office/drawing/2010/main" val="0"/>
@@ -6097,7 +6378,7 @@
         <w:t xml:space="preserve">Figure </w:t>
       </w:r>
       <w:r>
-        <w:t>7</w:t>
+        <w:t>9</w:t>
       </w:r>
       <w:r>
         <w:t xml:space="preserve"> shows how congested the </w:t>
@@ -6127,17 +6408,9 @@
           <w:numId w:val="0"/>
         </w:numPr>
       </w:pPr>
-    </w:p>
-    <w:p>
-      <w:pPr>
-        <w:pStyle w:val="Heading2"/>
-        <w:numPr>
-          <w:ilvl w:val="0"/>
-          <w:numId w:val="0"/>
-        </w:numPr>
-      </w:pPr>
-      <w:bookmarkStart w:id="22" w:name="_Toc215672588"/>
-      <w:r>
+      <w:bookmarkStart w:id="22" w:name="_Toc215733944"/>
+      <w:r>
+        <w:lastRenderedPageBreak/>
         <w:t xml:space="preserve">How do different nations and private firms contribute to orbital </w:t>
       </w:r>
       <w:r>
@@ -6169,7 +6442,6 @@
         <w:rPr>
           <w:noProof/>
         </w:rPr>
-        <w:lastRenderedPageBreak/>
         <mc:AlternateContent>
           <mc:Choice Requires="wps">
             <w:drawing>
@@ -6233,7 +6505,7 @@
                               <w:rPr>
                                 <w:noProof/>
                               </w:rPr>
-                              <w:t>8</w:t>
+                              <w:t>10</w:t>
                             </w:r>
                             <w:r>
                               <w:fldChar w:fldCharType="end"/>
@@ -6287,7 +6559,7 @@
                         <w:rPr>
                           <w:noProof/>
                         </w:rPr>
-                        <w:t>8</w:t>
+                        <w:t>10</w:t>
                       </w:r>
                       <w:r>
                         <w:fldChar w:fldCharType="end"/>
@@ -6309,10 +6581,10 @@
           <w:noProof/>
         </w:rPr>
         <w:drawing>
-          <wp:inline distT="0" distB="0" distL="0" distR="0" wp14:anchorId="6EF5FE6C" wp14:editId="2DA70000">
+          <wp:inline distT="0" distB="0" distL="0" distR="0" wp14:anchorId="1ABAC6BF" wp14:editId="196745BF">
             <wp:extent cx="6120130" cy="3886200"/>
             <wp:effectExtent l="0" t="0" r="1270" b="0"/>
-            <wp:docPr id="776805124" name="Picture 8" descr="A map of the world&#10;&#10;AI-generated content may be incorrect."/>
+            <wp:docPr id="1522934751" name="Picture 11" descr="A map of the world&#10;&#10;AI-generated content may be incorrect."/>
             <wp:cNvGraphicFramePr>
               <a:graphicFrameLocks xmlns:a="http://schemas.openxmlformats.org/drawingml/2006/main" noChangeAspect="1"/>
             </wp:cNvGraphicFramePr>
@@ -6320,11 +6592,11 @@
               <a:graphicData uri="http://schemas.openxmlformats.org/drawingml/2006/picture">
                 <pic:pic xmlns:pic="http://schemas.openxmlformats.org/drawingml/2006/picture">
                   <pic:nvPicPr>
-                    <pic:cNvPr id="776805124" name="Picture 8" descr="A map of the world&#10;&#10;AI-generated content may be incorrect."/>
+                    <pic:cNvPr id="1522934751" name="Picture 11" descr="A map of the world&#10;&#10;AI-generated content may be incorrect."/>
                     <pic:cNvPicPr/>
                   </pic:nvPicPr>
                   <pic:blipFill>
-                    <a:blip r:embed="rId17">
+                    <a:blip r:embed="rId19">
                       <a:extLst>
                         <a:ext uri="{28A0092B-C50C-407E-A947-70E740481C1C}">
                           <a14:useLocalDpi xmlns:a14="http://schemas.microsoft.com/office/drawing/2010/main" val="0"/>
@@ -6465,7 +6737,17 @@
           <w:bCs w:val="0"/>
           <w:szCs w:val="22"/>
         </w:rPr>
-        <w:t>Earlier in the Starlink program in around 2019, each Falcon 9 launch carried up to sixty satellites per flight. This number has decreased over time due to the satellites becoming larger and more capable. As of October 2025, SpaceX typically launches 28 Starlink satellites per mission. (Robinson-Smith 2025). As a side issue, each Falcon 9 launch emits approximately 336 metric tons of CO₂, contributing to climate change. (Franklin-Cheung 2020)</w:t>
+        <w:t xml:space="preserve">Earlier in the Starlink program in around 2019, each Falcon 9 launch carried up to sixty satellites per flight. This number has decreased over time due to the satellites becoming larger and more capable. As of October 2025, SpaceX typically launches 28 Starlink satellites per mission. (Robinson-Smith </w:t>
+      </w:r>
+      <w:r>
+        <w:rPr>
+          <w:rStyle w:val="Strong"/>
+          <w:b w:val="0"/>
+          <w:bCs w:val="0"/>
+          <w:szCs w:val="22"/>
+        </w:rPr>
+        <w:lastRenderedPageBreak/>
+        <w:t>2025). As a side issue, each Falcon 9 launch emits approximately 336 metric tons of CO₂, contributing to climate change. (Franklin-Cheung 2020)</w:t>
       </w:r>
     </w:p>
     <w:p>
@@ -6493,7 +6775,6 @@
         <w:rPr>
           <w:noProof/>
         </w:rPr>
-        <w:lastRenderedPageBreak/>
         <mc:AlternateContent>
           <mc:Choice Requires="wps">
             <w:drawing>
@@ -6557,7 +6838,7 @@
                               <w:rPr>
                                 <w:noProof/>
                               </w:rPr>
-                              <w:t>9</w:t>
+                              <w:t>11</w:t>
                             </w:r>
                             <w:r>
                               <w:fldChar w:fldCharType="end"/>
@@ -6611,7 +6892,7 @@
                         <w:rPr>
                           <w:noProof/>
                         </w:rPr>
-                        <w:t>9</w:t>
+                        <w:t>11</w:t>
                       </w:r>
                       <w:r>
                         <w:fldChar w:fldCharType="end"/>
@@ -6658,7 +6939,7 @@
                     </pic:cNvPicPr>
                   </pic:nvPicPr>
                   <pic:blipFill>
-                    <a:blip r:embed="rId18"/>
+                    <a:blip r:embed="rId20"/>
                     <a:stretch>
                       <a:fillRect/>
                     </a:stretch>
@@ -6683,7 +6964,7 @@
       <w:pPr>
         <w:pStyle w:val="Heading2"/>
       </w:pPr>
-      <w:bookmarkStart w:id="23" w:name="_Toc215672589"/>
+      <w:bookmarkStart w:id="23" w:name="_Toc215733945"/>
       <w:r>
         <w:rPr>
           <w:rStyle w:val="Strong"/>
@@ -6840,33 +7121,11 @@
     </w:p>
     <w:p>
       <w:pPr>
-        <w:pStyle w:val="BodyText"/>
-        <w:rPr>
-          <w:lang w:eastAsia="en-US" w:bidi="ar-SA"/>
-        </w:rPr>
-      </w:pPr>
-    </w:p>
-    <w:p>
-      <w:pPr>
-        <w:rPr>
-          <w:lang w:eastAsia="en-US" w:bidi="ar-SA"/>
-        </w:rPr>
-      </w:pPr>
-    </w:p>
-    <w:p/>
-    <w:p>
-      <w:pPr>
-        <w:rPr>
-          <w:lang w:eastAsia="en-US" w:bidi="ar-SA"/>
-        </w:rPr>
-      </w:pPr>
-    </w:p>
-    <w:p>
-      <w:pPr>
         <w:pStyle w:val="Heading1"/>
       </w:pPr>
-      <w:bookmarkStart w:id="24" w:name="_Toc215672590"/>
-      <w:r>
+      <w:bookmarkStart w:id="24" w:name="_Toc215733946"/>
+      <w:r>
+        <w:lastRenderedPageBreak/>
         <w:t>Part 4 - Discussion</w:t>
       </w:r>
       <w:bookmarkEnd w:id="24"/>
@@ -7280,7 +7539,7 @@
                 <w:sz w:val="20"/>
                 <w:szCs w:val="22"/>
               </w:rPr>
-              <w:t>7</w:t>
+              <w:t>8</w:t>
             </w:r>
             <w:r>
               <w:rPr>
@@ -7515,7 +7774,16 @@
                 <w:sz w:val="20"/>
                 <w:szCs w:val="22"/>
               </w:rPr>
-              <w:t>7 charts</w:t>
+              <w:t xml:space="preserve">8 </w:t>
+            </w:r>
+            <w:r>
+              <w:rPr>
+                <w:b/>
+                <w:bCs/>
+                <w:sz w:val="20"/>
+                <w:szCs w:val="22"/>
+              </w:rPr>
+              <w:t>charts</w:t>
             </w:r>
           </w:p>
         </w:tc>
@@ -7541,7 +7809,7 @@
           <w:szCs w:val="24"/>
         </w:rPr>
       </w:pPr>
-      <w:bookmarkStart w:id="25" w:name="_Toc215672591"/>
+      <w:bookmarkStart w:id="25" w:name="_Toc215733947"/>
       <w:r>
         <w:lastRenderedPageBreak/>
         <w:t>References:</w:t>
@@ -9256,8 +9524,8 @@
       </w:pPr>
     </w:p>
     <w:sectPr>
-      <w:headerReference w:type="default" r:id="rId19"/>
-      <w:footerReference w:type="default" r:id="rId20"/>
+      <w:headerReference w:type="default" r:id="rId21"/>
+      <w:footerReference w:type="default" r:id="rId22"/>
       <w:pgSz w:w="11906" w:h="16838"/>
       <w:pgMar w:top="1705" w:right="1134" w:bottom="1693" w:left="1134" w:header="1134" w:footer="1134" w:gutter="0"/>
       <w:cols w:space="720"/>

</xml_diff>